<commit_message>
docs: update executive report with latest SARIMA model analysis
</commit_message>
<xml_diff>
--- a/RelatorioGerencial.docx
+++ b/RelatorioGerencial.docx
@@ -194,6 +194,12 @@
     <w:sdt>
       <w:sdtPr>
         <w:rPr>
+          <w:rFonts w:ascii="Arial" w:eastAsiaTheme="minorEastAsia" w:hAnsi="Arial" w:cstheme="minorBidi"/>
+          <w:b w:val="0"/>
+          <w:bCs w:val="0"/>
+          <w:color w:val="auto"/>
+          <w:sz w:val="24"/>
+          <w:szCs w:val="22"/>
           <w:lang w:val="pt-BR"/>
         </w:rPr>
         <w:id w:val="-235485007"/>
@@ -204,10 +210,6 @@
       </w:sdtPr>
       <w:sdtEndPr>
         <w:rPr>
-          <w:rFonts w:ascii="Arial" w:eastAsiaTheme="minorEastAsia" w:hAnsi="Arial" w:cstheme="minorBidi"/>
-          <w:color w:val="auto"/>
-          <w:sz w:val="24"/>
-          <w:szCs w:val="22"/>
           <w:lang w:val="en-US"/>
         </w:rPr>
       </w:sdtEndPr>
@@ -1351,7 +1353,242 @@
         <w:rPr>
           <w:lang w:val="pt-BR"/>
         </w:rPr>
-        <w:t>) com exatamente 2.190 observações diárias. O volume de tráfego (variável predita) representa o tráfego horário acumulado e normalizado expresso em número de veículos por dia.</w:t>
+        <w:t xml:space="preserve">) com exatamente 2.190 observações diárias. </w:t>
+      </w:r>
+      <w:r>
+        <w:t xml:space="preserve">A </w:t>
+      </w:r>
+      <w:proofErr w:type="spellStart"/>
+      <w:r>
+        <w:t>variável</w:t>
+      </w:r>
+      <w:proofErr w:type="spellEnd"/>
+      <w:r>
+        <w:t xml:space="preserve"> </w:t>
+      </w:r>
+      <w:proofErr w:type="spellStart"/>
+      <w:r>
+        <w:t>analisada</w:t>
+      </w:r>
+      <w:proofErr w:type="spellEnd"/>
+      <w:r>
+        <w:t xml:space="preserve"> </w:t>
+      </w:r>
+      <w:proofErr w:type="spellStart"/>
+      <w:r>
+        <w:t>corresponde</w:t>
+      </w:r>
+      <w:proofErr w:type="spellEnd"/>
+      <w:r>
+        <w:t xml:space="preserve"> à </w:t>
+      </w:r>
+      <w:proofErr w:type="spellStart"/>
+      <w:r>
+        <w:t>média</w:t>
+      </w:r>
+      <w:proofErr w:type="spellEnd"/>
+      <w:r>
+        <w:t xml:space="preserve"> </w:t>
+      </w:r>
+      <w:proofErr w:type="spellStart"/>
+      <w:r>
+        <w:t>diária</w:t>
+      </w:r>
+      <w:proofErr w:type="spellEnd"/>
+      <w:r>
+        <w:t xml:space="preserve"> do volume de </w:t>
+      </w:r>
+      <w:proofErr w:type="spellStart"/>
+      <w:r>
+        <w:t>tráfego</w:t>
+      </w:r>
+      <w:proofErr w:type="spellEnd"/>
+      <w:r>
+        <w:t xml:space="preserve"> </w:t>
+      </w:r>
+      <w:proofErr w:type="spellStart"/>
+      <w:r>
+        <w:t>registrado</w:t>
+      </w:r>
+      <w:proofErr w:type="spellEnd"/>
+      <w:r>
+        <w:t xml:space="preserve"> </w:t>
+      </w:r>
+      <w:proofErr w:type="spellStart"/>
+      <w:r>
+        <w:t>na</w:t>
+      </w:r>
+      <w:proofErr w:type="spellEnd"/>
+      <w:r>
+        <w:t xml:space="preserve"> </w:t>
+      </w:r>
+      <w:proofErr w:type="spellStart"/>
+      <w:r>
+        <w:t>rodovia</w:t>
+      </w:r>
+      <w:proofErr w:type="spellEnd"/>
+      <w:r>
+        <w:t xml:space="preserve"> I-94, </w:t>
+      </w:r>
+      <w:proofErr w:type="spellStart"/>
+      <w:r>
+        <w:t>obtida</w:t>
+      </w:r>
+      <w:proofErr w:type="spellEnd"/>
+      <w:r>
+        <w:t xml:space="preserve"> a </w:t>
+      </w:r>
+      <w:proofErr w:type="spellStart"/>
+      <w:r>
+        <w:t>partir</w:t>
+      </w:r>
+      <w:proofErr w:type="spellEnd"/>
+      <w:r>
+        <w:t xml:space="preserve"> da </w:t>
+      </w:r>
+      <w:proofErr w:type="spellStart"/>
+      <w:r>
+        <w:t>agregação</w:t>
+      </w:r>
+      <w:proofErr w:type="spellEnd"/>
+      <w:r>
+        <w:t xml:space="preserve"> dos </w:t>
+      </w:r>
+      <w:proofErr w:type="spellStart"/>
+      <w:r>
+        <w:t>registros</w:t>
+      </w:r>
+      <w:proofErr w:type="spellEnd"/>
+      <w:r>
+        <w:t xml:space="preserve"> </w:t>
+      </w:r>
+      <w:proofErr w:type="spellStart"/>
+      <w:r>
+        <w:t>horários</w:t>
+      </w:r>
+      <w:proofErr w:type="spellEnd"/>
+      <w:r>
+        <w:t xml:space="preserve"> </w:t>
+      </w:r>
+      <w:proofErr w:type="spellStart"/>
+      <w:r>
+        <w:t>originais</w:t>
+      </w:r>
+      <w:proofErr w:type="spellEnd"/>
+      <w:r>
+        <w:t xml:space="preserve">. Dessa forma, a </w:t>
+      </w:r>
+      <w:proofErr w:type="spellStart"/>
+      <w:r>
+        <w:t>série</w:t>
+      </w:r>
+      <w:proofErr w:type="spellEnd"/>
+      <w:r>
+        <w:t xml:space="preserve"> final </w:t>
+      </w:r>
+      <w:proofErr w:type="spellStart"/>
+      <w:r>
+        <w:t>representa</w:t>
+      </w:r>
+      <w:proofErr w:type="spellEnd"/>
+      <w:r>
+        <w:t xml:space="preserve"> o </w:t>
+      </w:r>
+      <w:proofErr w:type="spellStart"/>
+      <w:r>
+        <w:t>comportamento</w:t>
+      </w:r>
+      <w:proofErr w:type="spellEnd"/>
+      <w:r>
+        <w:t xml:space="preserve"> </w:t>
+      </w:r>
+      <w:proofErr w:type="spellStart"/>
+      <w:r>
+        <w:t>médio</w:t>
+      </w:r>
+      <w:proofErr w:type="spellEnd"/>
+      <w:r>
+        <w:t xml:space="preserve"> </w:t>
+      </w:r>
+      <w:proofErr w:type="spellStart"/>
+      <w:r>
+        <w:t>diário</w:t>
+      </w:r>
+      <w:proofErr w:type="spellEnd"/>
+      <w:r>
+        <w:t xml:space="preserve"> do </w:t>
+      </w:r>
+      <w:proofErr w:type="spellStart"/>
+      <w:r>
+        <w:t>fluxo</w:t>
+      </w:r>
+      <w:proofErr w:type="spellEnd"/>
+      <w:r>
+        <w:t xml:space="preserve"> de </w:t>
+      </w:r>
+      <w:proofErr w:type="spellStart"/>
+      <w:r>
+        <w:t>veículos</w:t>
+      </w:r>
+      <w:proofErr w:type="spellEnd"/>
+      <w:r>
+        <w:t xml:space="preserve">, </w:t>
+      </w:r>
+      <w:proofErr w:type="spellStart"/>
+      <w:r>
+        <w:t>permitindo</w:t>
+      </w:r>
+      <w:proofErr w:type="spellEnd"/>
+      <w:r>
+        <w:t xml:space="preserve"> </w:t>
+      </w:r>
+      <w:proofErr w:type="spellStart"/>
+      <w:r>
+        <w:t>uma</w:t>
+      </w:r>
+      <w:proofErr w:type="spellEnd"/>
+      <w:r>
+        <w:t xml:space="preserve"> </w:t>
+      </w:r>
+      <w:proofErr w:type="spellStart"/>
+      <w:r>
+        <w:t>análise</w:t>
+      </w:r>
+      <w:proofErr w:type="spellEnd"/>
+      <w:r>
+        <w:t xml:space="preserve"> temporal </w:t>
+      </w:r>
+      <w:proofErr w:type="spellStart"/>
+      <w:r>
+        <w:t>mais</w:t>
+      </w:r>
+      <w:proofErr w:type="spellEnd"/>
+      <w:r>
+        <w:t xml:space="preserve"> </w:t>
+      </w:r>
+      <w:proofErr w:type="spellStart"/>
+      <w:r>
+        <w:t>estável</w:t>
+      </w:r>
+      <w:proofErr w:type="spellEnd"/>
+      <w:r>
+        <w:t xml:space="preserve"> e </w:t>
+      </w:r>
+      <w:proofErr w:type="spellStart"/>
+      <w:r>
+        <w:t>adequada</w:t>
+      </w:r>
+      <w:proofErr w:type="spellEnd"/>
+      <w:r>
+        <w:t xml:space="preserve"> à </w:t>
+      </w:r>
+      <w:proofErr w:type="spellStart"/>
+      <w:r>
+        <w:t>modelagem</w:t>
+      </w:r>
+      <w:proofErr w:type="spellEnd"/>
+      <w:r>
+        <w:t xml:space="preserve"> SARIMA.</w:t>
       </w:r>
     </w:p>
     <w:tbl>
@@ -1571,12 +1808,18 @@
         <w:rPr>
           <w:lang w:val="pt-BR"/>
         </w:rPr>
-        <w:t>No entanto, a característica preponderante da série é a sua oscilação de altíssima frequência, fortemente influenciada pela sazonalidade semanal. Observa-se um padrão cíclico regular e repetitivo onde o tráfego diário aumenta de forma consistente de segunda a sexta-feira, impulsionado pelas atividades comerciais e pelo trânsito pendular obrigatório de trabalhadores. Nos finais de semana, ocorre uma queda acentuada e abrupta no tráfego, refletindo a redução das atividades de rotina laboral e comercial.</w:t>
+        <w:t xml:space="preserve">No entanto, a característica preponderante da série é a sua oscilação de altíssima frequência, fortemente influenciada pela sazonalidade semanal. Observa-se um padrão cíclico regular e repetitivo onde o tráfego diário aumenta de forma consistente de segunda a sexta-feira, impulsionado pelas atividades comerciais e pelo trânsito pendular obrigatório de trabalhadores. Nos finais de </w:t>
+      </w:r>
+      <w:r>
+        <w:rPr>
+          <w:lang w:val="pt-BR"/>
+        </w:rPr>
+        <w:lastRenderedPageBreak/>
+        <w:t>semana, ocorre uma queda acentuada e abrupta no tráfego, refletindo a redução das atividades de rotina laboral e comercial.</w:t>
       </w:r>
     </w:p>
     <w:p>
       <w:pPr>
-        <w:jc w:val="both"/>
         <w:rPr>
           <w:lang w:val="pt-BR"/>
         </w:rPr>
@@ -1585,7 +1828,6 @@
         <w:rPr>
           <w:lang w:val="pt-BR"/>
         </w:rPr>
-        <w:lastRenderedPageBreak/>
         <w:t>Adicionalmente, a série exibe vales profundos isolados que rompem a estabilidade do ciclo sazonal. Estes vales representam choques e quebras estruturais na série, associados principalmente a feriados nacionais (como o Dia de Ação de Graças, Natal e Ano Novo, nos quais as empresas fecham e as pessoas realizam viagens de longa distância) ou a nevascas severas e tempestades extremas comuns em Minnesota, que forçam o fechamento parcial da rodovia ou desencorajam o trânsito de automóveis. Essa alta volatilidade e dependência cronológica direta indicam que a modelagem deve focar essencialmente na estrutura autorregressiva da série, uma vez que o tráfego observado no passado recente é o principal preditor do tráfego do dia seguinte.</w:t>
       </w:r>
     </w:p>
@@ -1630,7 +1872,504 @@
         <w:rPr>
           <w:lang w:val="pt-BR"/>
         </w:rPr>
-        <w:t>) com período definido de m=7 dias. A decomposição isola com sucesso quatro componentes: a série original observada, a curva de tendência de longo prazo, o componente sazonal semanal e a série residual de ruído. A curva de tendência revela variações suaves de ciclo médio e longo, confirmando a estabilidade da média sem crescimento de longo prazo, enquanto o componente sazonal exibe uma onda cíclica estável com vales profundos correspondentes aos sábados e domingos.</w:t>
+        <w:t xml:space="preserve">) com período definido de m=7 dias. </w:t>
+      </w:r>
+      <w:r>
+        <w:t xml:space="preserve">Essa </w:t>
+      </w:r>
+      <w:proofErr w:type="spellStart"/>
+      <w:r>
+        <w:t>decomposição</w:t>
+      </w:r>
+      <w:proofErr w:type="spellEnd"/>
+      <w:r>
+        <w:t xml:space="preserve"> </w:t>
+      </w:r>
+      <w:proofErr w:type="spellStart"/>
+      <w:r>
+        <w:t>foi</w:t>
+      </w:r>
+      <w:proofErr w:type="spellEnd"/>
+      <w:r>
+        <w:t xml:space="preserve"> </w:t>
+      </w:r>
+      <w:proofErr w:type="spellStart"/>
+      <w:r>
+        <w:t>importante</w:t>
+      </w:r>
+      <w:proofErr w:type="spellEnd"/>
+      <w:r>
+        <w:t xml:space="preserve"> </w:t>
+      </w:r>
+      <w:proofErr w:type="spellStart"/>
+      <w:r>
+        <w:t>porque</w:t>
+      </w:r>
+      <w:proofErr w:type="spellEnd"/>
+      <w:r>
+        <w:t xml:space="preserve"> </w:t>
+      </w:r>
+      <w:proofErr w:type="spellStart"/>
+      <w:r>
+        <w:t>permitiu</w:t>
+      </w:r>
+      <w:proofErr w:type="spellEnd"/>
+      <w:r>
+        <w:t xml:space="preserve"> </w:t>
+      </w:r>
+      <w:proofErr w:type="spellStart"/>
+      <w:r>
+        <w:t>separar</w:t>
+      </w:r>
+      <w:proofErr w:type="spellEnd"/>
+      <w:r>
+        <w:t xml:space="preserve"> o </w:t>
+      </w:r>
+      <w:proofErr w:type="spellStart"/>
+      <w:r>
+        <w:t>comportamento</w:t>
+      </w:r>
+      <w:proofErr w:type="spellEnd"/>
+      <w:r>
+        <w:t xml:space="preserve"> </w:t>
+      </w:r>
+      <w:proofErr w:type="spellStart"/>
+      <w:r>
+        <w:t>observado</w:t>
+      </w:r>
+      <w:proofErr w:type="spellEnd"/>
+      <w:r>
+        <w:t xml:space="preserve"> </w:t>
+      </w:r>
+      <w:proofErr w:type="spellStart"/>
+      <w:r>
+        <w:t>em</w:t>
+      </w:r>
+      <w:proofErr w:type="spellEnd"/>
+      <w:r>
+        <w:t xml:space="preserve"> partes </w:t>
+      </w:r>
+      <w:proofErr w:type="spellStart"/>
+      <w:r>
+        <w:t>interpretáveis</w:t>
+      </w:r>
+      <w:proofErr w:type="spellEnd"/>
+      <w:r>
+        <w:t xml:space="preserve">. A </w:t>
+      </w:r>
+      <w:proofErr w:type="spellStart"/>
+      <w:r>
+        <w:t>tendência</w:t>
+      </w:r>
+      <w:proofErr w:type="spellEnd"/>
+      <w:r>
+        <w:t xml:space="preserve"> </w:t>
+      </w:r>
+      <w:proofErr w:type="spellStart"/>
+      <w:r>
+        <w:t>mostrou</w:t>
+      </w:r>
+      <w:proofErr w:type="spellEnd"/>
+      <w:r>
+        <w:t xml:space="preserve"> </w:t>
+      </w:r>
+      <w:proofErr w:type="spellStart"/>
+      <w:r>
+        <w:t>que</w:t>
+      </w:r>
+      <w:proofErr w:type="spellEnd"/>
+      <w:r>
+        <w:t xml:space="preserve"> </w:t>
+      </w:r>
+      <w:proofErr w:type="spellStart"/>
+      <w:r>
+        <w:t>o</w:t>
+      </w:r>
+      <w:proofErr w:type="spellEnd"/>
+      <w:r>
+        <w:t xml:space="preserve"> </w:t>
+      </w:r>
+      <w:proofErr w:type="spellStart"/>
+      <w:r>
+        <w:t>tráfego</w:t>
+      </w:r>
+      <w:proofErr w:type="spellEnd"/>
+      <w:r>
+        <w:t xml:space="preserve"> </w:t>
+      </w:r>
+      <w:proofErr w:type="spellStart"/>
+      <w:r>
+        <w:t>não</w:t>
+      </w:r>
+      <w:proofErr w:type="spellEnd"/>
+      <w:r>
+        <w:t xml:space="preserve"> </w:t>
+      </w:r>
+      <w:proofErr w:type="spellStart"/>
+      <w:r>
+        <w:t>apresentou</w:t>
+      </w:r>
+      <w:proofErr w:type="spellEnd"/>
+      <w:r>
+        <w:t xml:space="preserve"> </w:t>
+      </w:r>
+      <w:proofErr w:type="spellStart"/>
+      <w:r>
+        <w:t>crescimento</w:t>
+      </w:r>
+      <w:proofErr w:type="spellEnd"/>
+      <w:r>
+        <w:t xml:space="preserve"> </w:t>
+      </w:r>
+      <w:proofErr w:type="spellStart"/>
+      <w:r>
+        <w:t>contínuo</w:t>
+      </w:r>
+      <w:proofErr w:type="spellEnd"/>
+      <w:r>
+        <w:t xml:space="preserve"> de </w:t>
+      </w:r>
+      <w:proofErr w:type="spellStart"/>
+      <w:r>
+        <w:t>longo</w:t>
+      </w:r>
+      <w:proofErr w:type="spellEnd"/>
+      <w:r>
+        <w:t xml:space="preserve"> </w:t>
+      </w:r>
+      <w:proofErr w:type="spellStart"/>
+      <w:r>
+        <w:t>prazo</w:t>
+      </w:r>
+      <w:proofErr w:type="spellEnd"/>
+      <w:r>
+        <w:t xml:space="preserve">, </w:t>
+      </w:r>
+      <w:proofErr w:type="spellStart"/>
+      <w:r>
+        <w:t>mantendo</w:t>
+      </w:r>
+      <w:proofErr w:type="spellEnd"/>
+      <w:r>
+        <w:t xml:space="preserve">-se </w:t>
+      </w:r>
+      <w:proofErr w:type="spellStart"/>
+      <w:r>
+        <w:t>relativamente</w:t>
+      </w:r>
+      <w:proofErr w:type="spellEnd"/>
+      <w:r>
+        <w:t xml:space="preserve"> </w:t>
+      </w:r>
+      <w:proofErr w:type="spellStart"/>
+      <w:r>
+        <w:t>estável</w:t>
+      </w:r>
+      <w:proofErr w:type="spellEnd"/>
+      <w:r>
+        <w:t xml:space="preserve"> </w:t>
+      </w:r>
+      <w:proofErr w:type="spellStart"/>
+      <w:r>
+        <w:t>ao</w:t>
+      </w:r>
+      <w:proofErr w:type="spellEnd"/>
+      <w:r>
+        <w:t xml:space="preserve"> </w:t>
+      </w:r>
+      <w:proofErr w:type="spellStart"/>
+      <w:r>
+        <w:t>longo</w:t>
+      </w:r>
+      <w:proofErr w:type="spellEnd"/>
+      <w:r>
+        <w:t xml:space="preserve"> do </w:t>
+      </w:r>
+      <w:proofErr w:type="spellStart"/>
+      <w:r>
+        <w:t>período</w:t>
+      </w:r>
+      <w:proofErr w:type="spellEnd"/>
+      <w:r>
+        <w:t xml:space="preserve">. </w:t>
+      </w:r>
+      <w:proofErr w:type="spellStart"/>
+      <w:r>
+        <w:t>Já</w:t>
+      </w:r>
+      <w:proofErr w:type="spellEnd"/>
+      <w:r>
+        <w:t xml:space="preserve"> o </w:t>
+      </w:r>
+      <w:proofErr w:type="spellStart"/>
+      <w:r>
+        <w:t>componente</w:t>
+      </w:r>
+      <w:proofErr w:type="spellEnd"/>
+      <w:r>
+        <w:t xml:space="preserve"> </w:t>
+      </w:r>
+      <w:proofErr w:type="spellStart"/>
+      <w:r>
+        <w:t>sazonal</w:t>
+      </w:r>
+      <w:proofErr w:type="spellEnd"/>
+      <w:r>
+        <w:t xml:space="preserve"> </w:t>
+      </w:r>
+      <w:proofErr w:type="spellStart"/>
+      <w:r>
+        <w:t>evidenciou</w:t>
+      </w:r>
+      <w:proofErr w:type="spellEnd"/>
+      <w:r>
+        <w:t xml:space="preserve"> a </w:t>
+      </w:r>
+      <w:proofErr w:type="spellStart"/>
+      <w:r>
+        <w:t>repetição</w:t>
+      </w:r>
+      <w:proofErr w:type="spellEnd"/>
+      <w:r>
+        <w:t xml:space="preserve"> de </w:t>
+      </w:r>
+      <w:proofErr w:type="spellStart"/>
+      <w:r>
+        <w:t>padrões</w:t>
+      </w:r>
+      <w:proofErr w:type="spellEnd"/>
+      <w:r>
+        <w:t xml:space="preserve"> </w:t>
+      </w:r>
+      <w:proofErr w:type="spellStart"/>
+      <w:r>
+        <w:t>ligados</w:t>
+      </w:r>
+      <w:proofErr w:type="spellEnd"/>
+      <w:r>
+        <w:t xml:space="preserve"> </w:t>
+      </w:r>
+      <w:proofErr w:type="spellStart"/>
+      <w:r>
+        <w:t>aos</w:t>
+      </w:r>
+      <w:proofErr w:type="spellEnd"/>
+      <w:r>
+        <w:t xml:space="preserve"> </w:t>
+      </w:r>
+      <w:proofErr w:type="spellStart"/>
+      <w:r>
+        <w:t>dias</w:t>
+      </w:r>
+      <w:proofErr w:type="spellEnd"/>
+      <w:r>
+        <w:t xml:space="preserve"> da </w:t>
+      </w:r>
+      <w:proofErr w:type="spellStart"/>
+      <w:r>
+        <w:t>semana</w:t>
+      </w:r>
+      <w:proofErr w:type="spellEnd"/>
+      <w:r>
+        <w:t xml:space="preserve">, </w:t>
+      </w:r>
+      <w:proofErr w:type="spellStart"/>
+      <w:r>
+        <w:t>especialmente</w:t>
+      </w:r>
+      <w:proofErr w:type="spellEnd"/>
+      <w:r>
+        <w:t xml:space="preserve"> a </w:t>
+      </w:r>
+      <w:proofErr w:type="spellStart"/>
+      <w:r>
+        <w:t>queda</w:t>
+      </w:r>
+      <w:proofErr w:type="spellEnd"/>
+      <w:r>
+        <w:t xml:space="preserve"> do </w:t>
+      </w:r>
+      <w:proofErr w:type="spellStart"/>
+      <w:r>
+        <w:t>fluxo</w:t>
+      </w:r>
+      <w:proofErr w:type="spellEnd"/>
+      <w:r>
+        <w:t xml:space="preserve"> </w:t>
+      </w:r>
+      <w:proofErr w:type="spellStart"/>
+      <w:r>
+        <w:t>aos</w:t>
+      </w:r>
+      <w:proofErr w:type="spellEnd"/>
+      <w:r>
+        <w:t xml:space="preserve"> </w:t>
+      </w:r>
+      <w:proofErr w:type="spellStart"/>
+      <w:r>
+        <w:t>sábados</w:t>
+      </w:r>
+      <w:proofErr w:type="spellEnd"/>
+      <w:r>
+        <w:t xml:space="preserve"> e </w:t>
+      </w:r>
+      <w:proofErr w:type="spellStart"/>
+      <w:r>
+        <w:t>domingos</w:t>
+      </w:r>
+      <w:proofErr w:type="spellEnd"/>
+      <w:r>
+        <w:t xml:space="preserve">. Por </w:t>
+      </w:r>
+      <w:proofErr w:type="spellStart"/>
+      <w:r>
+        <w:t>fim</w:t>
+      </w:r>
+      <w:proofErr w:type="spellEnd"/>
+      <w:r>
+        <w:t xml:space="preserve">, </w:t>
+      </w:r>
+      <w:proofErr w:type="spellStart"/>
+      <w:r>
+        <w:t>os</w:t>
+      </w:r>
+      <w:proofErr w:type="spellEnd"/>
+      <w:r>
+        <w:t xml:space="preserve"> </w:t>
+      </w:r>
+      <w:proofErr w:type="spellStart"/>
+      <w:r>
+        <w:t>resíduos</w:t>
+      </w:r>
+      <w:proofErr w:type="spellEnd"/>
+      <w:r>
+        <w:t xml:space="preserve"> </w:t>
+      </w:r>
+      <w:proofErr w:type="spellStart"/>
+      <w:r>
+        <w:t>concentraram</w:t>
+      </w:r>
+      <w:proofErr w:type="spellEnd"/>
+      <w:r>
+        <w:t xml:space="preserve"> as </w:t>
+      </w:r>
+      <w:proofErr w:type="spellStart"/>
+      <w:r>
+        <w:t>oscilações</w:t>
+      </w:r>
+      <w:proofErr w:type="spellEnd"/>
+      <w:r>
+        <w:t xml:space="preserve"> </w:t>
+      </w:r>
+      <w:proofErr w:type="spellStart"/>
+      <w:r>
+        <w:t>não</w:t>
+      </w:r>
+      <w:proofErr w:type="spellEnd"/>
+      <w:r>
+        <w:t xml:space="preserve"> </w:t>
+      </w:r>
+      <w:proofErr w:type="spellStart"/>
+      <w:r>
+        <w:t>explicadas</w:t>
+      </w:r>
+      <w:proofErr w:type="spellEnd"/>
+      <w:r>
+        <w:t xml:space="preserve"> pela </w:t>
+      </w:r>
+      <w:proofErr w:type="spellStart"/>
+      <w:r>
+        <w:t>tendência</w:t>
+      </w:r>
+      <w:proofErr w:type="spellEnd"/>
+      <w:r>
+        <w:t xml:space="preserve"> e pela </w:t>
+      </w:r>
+      <w:proofErr w:type="spellStart"/>
+      <w:r>
+        <w:t>sazonalidade</w:t>
+      </w:r>
+      <w:proofErr w:type="spellEnd"/>
+      <w:r>
+        <w:t xml:space="preserve">, </w:t>
+      </w:r>
+      <w:proofErr w:type="spellStart"/>
+      <w:r>
+        <w:t>como</w:t>
+      </w:r>
+      <w:proofErr w:type="spellEnd"/>
+      <w:r>
+        <w:t xml:space="preserve"> </w:t>
+      </w:r>
+      <w:proofErr w:type="spellStart"/>
+      <w:r>
+        <w:t>possíveis</w:t>
+      </w:r>
+      <w:proofErr w:type="spellEnd"/>
+      <w:r>
+        <w:t xml:space="preserve"> </w:t>
+      </w:r>
+      <w:proofErr w:type="spellStart"/>
+      <w:r>
+        <w:t>efeitos</w:t>
+      </w:r>
+      <w:proofErr w:type="spellEnd"/>
+      <w:r>
+        <w:t xml:space="preserve"> de </w:t>
+      </w:r>
+      <w:proofErr w:type="spellStart"/>
+      <w:r>
+        <w:t>feriados</w:t>
+      </w:r>
+      <w:proofErr w:type="spellEnd"/>
+      <w:r>
+        <w:t xml:space="preserve">, </w:t>
+      </w:r>
+      <w:proofErr w:type="spellStart"/>
+      <w:r>
+        <w:t>clima</w:t>
+      </w:r>
+      <w:proofErr w:type="spellEnd"/>
+      <w:r>
+        <w:t xml:space="preserve"> </w:t>
+      </w:r>
+      <w:proofErr w:type="spellStart"/>
+      <w:r>
+        <w:t>severo</w:t>
+      </w:r>
+      <w:proofErr w:type="spellEnd"/>
+      <w:r>
+        <w:t xml:space="preserve"> </w:t>
+      </w:r>
+      <w:proofErr w:type="spellStart"/>
+      <w:r>
+        <w:t>ou</w:t>
+      </w:r>
+      <w:proofErr w:type="spellEnd"/>
+      <w:r>
+        <w:t xml:space="preserve"> </w:t>
+      </w:r>
+      <w:proofErr w:type="spellStart"/>
+      <w:r>
+        <w:t>eventos</w:t>
+      </w:r>
+      <w:proofErr w:type="spellEnd"/>
+      <w:r>
+        <w:t xml:space="preserve"> </w:t>
+      </w:r>
+      <w:proofErr w:type="spellStart"/>
+      <w:r>
+        <w:t>atípicos</w:t>
+      </w:r>
+      <w:proofErr w:type="spellEnd"/>
+      <w:r>
+        <w:t>.</w:t>
+      </w:r>
+      <w:r>
+        <w:rPr>
+          <w:lang w:val="pt-BR"/>
+        </w:rPr>
+        <w:t xml:space="preserve"> A curva de tendência revela variações suaves de ciclo médio e longo, confirmando a estabilidade da média sem crescimento de longo prazo, enquanto o componente sazonal exibe uma onda cíclica estável com vales profundos correspondentes aos sábados e domingos.</w:t>
       </w:r>
     </w:p>
     <w:p>
@@ -1638,6 +2377,7 @@
         <w:rPr>
           <w:noProof/>
         </w:rPr>
+        <w:lastRenderedPageBreak/>
         <w:drawing>
           <wp:inline distT="0" distB="0" distL="0" distR="0" wp14:anchorId="1FCC4274" wp14:editId="7A1E31A1">
             <wp:extent cx="5486400" cy="2497258"/>
@@ -1686,14 +2426,7 @@
         <w:rPr>
           <w:lang w:val="pt-BR"/>
         </w:rPr>
-        <w:t xml:space="preserve">A força da sazonalidade semanal (F_S) foi calculada com base na variância do componente residual e do componente sazonal resultantes da decomposição STL. O cálculo numérico no ambiente Python retornou um valor de F_S ≈ 0,88, o que indica uma presença de sazonalidade semanal extremamente forte e estrutural. Na ciência de séries temporais, uma força sazonal superior a 0,60 indica que o padrão periódico desempenha um papel determinante na geração </w:t>
-      </w:r>
-      <w:r>
-        <w:rPr>
-          <w:lang w:val="pt-BR"/>
-        </w:rPr>
-        <w:lastRenderedPageBreak/>
-        <w:t>dos dados, justificando tecnicamente a escolha de um modelo sazonal robusto como o SARIMA para capturar a dependência cíclica de período.</w:t>
+        <w:t>A força da sazonalidade semanal (F_S) foi calculada com base na variância do componente residual e do componente sazonal resultantes da decomposição STL. O cálculo numérico no ambiente Python retornou um valor de F_S ≈ 0,88, o que indica uma presença de sazonalidade semanal extremamente forte e estrutural. Na ciência de séries temporais, uma força sazonal superior a 0,60 indica que o padrão periódico desempenha um papel determinante na geração dos dados, justificando tecnicamente a escolha de um modelo sazonal robusto como o SARIMA para capturar a dependência cíclica de período.</w:t>
       </w:r>
     </w:p>
     <w:p>
@@ -1801,12 +2534,441 @@
     <w:p>
       <w:pPr>
         <w:jc w:val="both"/>
+      </w:pPr>
+      <w:r>
+        <w:t xml:space="preserve">Dado que ambos os testes indicam de forma unânime a não estacionariedade da série original diária, conclui-se que o tráfego não oscila de forma estacionária, justificando a necessidade de diferenciação </w:t>
+      </w:r>
+      <w:proofErr w:type="spellStart"/>
+      <w:r>
+        <w:t>matemática</w:t>
+      </w:r>
+      <w:proofErr w:type="spellEnd"/>
+      <w:r>
+        <w:t xml:space="preserve"> para a </w:t>
+      </w:r>
+      <w:proofErr w:type="spellStart"/>
+      <w:r>
+        <w:t>modelagem</w:t>
+      </w:r>
+      <w:proofErr w:type="spellEnd"/>
+      <w:r>
+        <w:t>.</w:t>
+      </w:r>
+    </w:p>
+    <w:p>
+      <w:pPr>
+        <w:jc w:val="both"/>
         <w:rPr>
           <w:lang w:val="pt-BR"/>
         </w:rPr>
       </w:pPr>
       <w:r>
-        <w:t>Dado que ambos os testes indicam de forma unânime a não estacionariedade da série original diária, conclui-se que o tráfego não oscila de forma estacionária, justificando a necessidade de diferenciação matemática para a modelagem.</w:t>
+        <w:lastRenderedPageBreak/>
+        <w:t xml:space="preserve">Com base </w:t>
+      </w:r>
+      <w:proofErr w:type="spellStart"/>
+      <w:r>
+        <w:t>nessa</w:t>
+      </w:r>
+      <w:proofErr w:type="spellEnd"/>
+      <w:r>
+        <w:t xml:space="preserve"> </w:t>
+      </w:r>
+      <w:proofErr w:type="spellStart"/>
+      <w:r>
+        <w:t>análise</w:t>
+      </w:r>
+      <w:proofErr w:type="spellEnd"/>
+      <w:r>
+        <w:t xml:space="preserve">, </w:t>
+      </w:r>
+      <w:proofErr w:type="spellStart"/>
+      <w:r>
+        <w:t>foi</w:t>
+      </w:r>
+      <w:proofErr w:type="spellEnd"/>
+      <w:r>
+        <w:t xml:space="preserve"> </w:t>
+      </w:r>
+      <w:proofErr w:type="spellStart"/>
+      <w:r>
+        <w:t>aplicada</w:t>
+      </w:r>
+      <w:proofErr w:type="spellEnd"/>
+      <w:r>
+        <w:t xml:space="preserve"> </w:t>
+      </w:r>
+      <w:proofErr w:type="spellStart"/>
+      <w:r>
+        <w:t>uma</w:t>
+      </w:r>
+      <w:proofErr w:type="spellEnd"/>
+      <w:r>
+        <w:t xml:space="preserve"> </w:t>
+      </w:r>
+      <w:proofErr w:type="spellStart"/>
+      <w:r>
+        <w:t>diferenciação</w:t>
+      </w:r>
+      <w:proofErr w:type="spellEnd"/>
+      <w:r>
+        <w:t xml:space="preserve"> regular </w:t>
+      </w:r>
+      <w:proofErr w:type="spellStart"/>
+      <w:r>
+        <w:t>na</w:t>
+      </w:r>
+      <w:proofErr w:type="spellEnd"/>
+      <w:r>
+        <w:t xml:space="preserve"> </w:t>
+      </w:r>
+      <w:proofErr w:type="spellStart"/>
+      <w:r>
+        <w:t>série</w:t>
+      </w:r>
+      <w:proofErr w:type="spellEnd"/>
+      <w:r>
+        <w:t xml:space="preserve">, </w:t>
+      </w:r>
+      <w:proofErr w:type="spellStart"/>
+      <w:r>
+        <w:t>representada</w:t>
+      </w:r>
+      <w:proofErr w:type="spellEnd"/>
+      <w:r>
+        <w:t xml:space="preserve"> </w:t>
+      </w:r>
+      <w:proofErr w:type="spellStart"/>
+      <w:r>
+        <w:t>pelo</w:t>
+      </w:r>
+      <w:proofErr w:type="spellEnd"/>
+      <w:r>
+        <w:t xml:space="preserve"> </w:t>
+      </w:r>
+      <w:proofErr w:type="spellStart"/>
+      <w:r>
+        <w:t>parâmetro</w:t>
+      </w:r>
+      <w:proofErr w:type="spellEnd"/>
+      <w:r>
+        <w:t xml:space="preserve"> </w:t>
+      </w:r>
+      <w:r>
+        <w:rPr>
+          <w:b/>
+          <w:bCs/>
+        </w:rPr>
+        <w:t>d = 1</w:t>
+      </w:r>
+      <w:r>
+        <w:t xml:space="preserve"> no </w:t>
+      </w:r>
+      <w:proofErr w:type="spellStart"/>
+      <w:r>
+        <w:t>modelo</w:t>
+      </w:r>
+      <w:proofErr w:type="spellEnd"/>
+      <w:r>
+        <w:t xml:space="preserve"> SARIMA final. Essa </w:t>
+      </w:r>
+      <w:proofErr w:type="spellStart"/>
+      <w:r>
+        <w:t>diferenciação</w:t>
+      </w:r>
+      <w:proofErr w:type="spellEnd"/>
+      <w:r>
+        <w:t xml:space="preserve"> </w:t>
+      </w:r>
+      <w:proofErr w:type="spellStart"/>
+      <w:r>
+        <w:t>teve</w:t>
+      </w:r>
+      <w:proofErr w:type="spellEnd"/>
+      <w:r>
+        <w:t xml:space="preserve"> </w:t>
+      </w:r>
+      <w:proofErr w:type="spellStart"/>
+      <w:r>
+        <w:t>como</w:t>
+      </w:r>
+      <w:proofErr w:type="spellEnd"/>
+      <w:r>
+        <w:t xml:space="preserve"> </w:t>
+      </w:r>
+      <w:proofErr w:type="spellStart"/>
+      <w:r>
+        <w:t>objetivo</w:t>
+      </w:r>
+      <w:proofErr w:type="spellEnd"/>
+      <w:r>
+        <w:t xml:space="preserve"> </w:t>
+      </w:r>
+      <w:proofErr w:type="spellStart"/>
+      <w:r>
+        <w:t>reduzir</w:t>
+      </w:r>
+      <w:proofErr w:type="spellEnd"/>
+      <w:r>
+        <w:t xml:space="preserve"> a </w:t>
+      </w:r>
+      <w:proofErr w:type="spellStart"/>
+      <w:r>
+        <w:t>não</w:t>
+      </w:r>
+      <w:proofErr w:type="spellEnd"/>
+      <w:r>
+        <w:t xml:space="preserve"> </w:t>
+      </w:r>
+      <w:proofErr w:type="spellStart"/>
+      <w:r>
+        <w:t>estacionariedade</w:t>
+      </w:r>
+      <w:proofErr w:type="spellEnd"/>
+      <w:r>
+        <w:t xml:space="preserve"> </w:t>
+      </w:r>
+      <w:proofErr w:type="spellStart"/>
+      <w:r>
+        <w:t>identificada</w:t>
+      </w:r>
+      <w:proofErr w:type="spellEnd"/>
+      <w:r>
+        <w:t xml:space="preserve"> </w:t>
+      </w:r>
+      <w:proofErr w:type="spellStart"/>
+      <w:r>
+        <w:t>pelos</w:t>
+      </w:r>
+      <w:proofErr w:type="spellEnd"/>
+      <w:r>
+        <w:t xml:space="preserve"> testes ADF e KPSS. </w:t>
+      </w:r>
+      <w:proofErr w:type="spellStart"/>
+      <w:r>
+        <w:t>Entretanto</w:t>
+      </w:r>
+      <w:proofErr w:type="spellEnd"/>
+      <w:r>
+        <w:t xml:space="preserve">, </w:t>
+      </w:r>
+      <w:proofErr w:type="spellStart"/>
+      <w:r>
+        <w:t>não</w:t>
+      </w:r>
+      <w:proofErr w:type="spellEnd"/>
+      <w:r>
+        <w:t xml:space="preserve"> </w:t>
+      </w:r>
+      <w:proofErr w:type="spellStart"/>
+      <w:r>
+        <w:t>foi</w:t>
+      </w:r>
+      <w:proofErr w:type="spellEnd"/>
+      <w:r>
+        <w:t xml:space="preserve"> </w:t>
+      </w:r>
+      <w:proofErr w:type="spellStart"/>
+      <w:r>
+        <w:t>necessária</w:t>
+      </w:r>
+      <w:proofErr w:type="spellEnd"/>
+      <w:r>
+        <w:t xml:space="preserve"> </w:t>
+      </w:r>
+      <w:proofErr w:type="gramStart"/>
+      <w:r>
+        <w:t>a</w:t>
+      </w:r>
+      <w:proofErr w:type="gramEnd"/>
+      <w:r>
+        <w:t xml:space="preserve"> </w:t>
+      </w:r>
+      <w:proofErr w:type="spellStart"/>
+      <w:r>
+        <w:t>aplicação</w:t>
+      </w:r>
+      <w:proofErr w:type="spellEnd"/>
+      <w:r>
+        <w:t xml:space="preserve"> de </w:t>
+      </w:r>
+      <w:proofErr w:type="spellStart"/>
+      <w:r>
+        <w:t>diferenciação</w:t>
+      </w:r>
+      <w:proofErr w:type="spellEnd"/>
+      <w:r>
+        <w:t xml:space="preserve"> </w:t>
+      </w:r>
+      <w:proofErr w:type="spellStart"/>
+      <w:r>
+        <w:t>sazonal</w:t>
+      </w:r>
+      <w:proofErr w:type="spellEnd"/>
+      <w:r>
+        <w:t xml:space="preserve">, pois o </w:t>
+      </w:r>
+      <w:proofErr w:type="spellStart"/>
+      <w:r>
+        <w:t>parâmetro</w:t>
+      </w:r>
+      <w:proofErr w:type="spellEnd"/>
+      <w:r>
+        <w:t xml:space="preserve"> </w:t>
+      </w:r>
+      <w:proofErr w:type="spellStart"/>
+      <w:r>
+        <w:t>sazonal</w:t>
+      </w:r>
+      <w:proofErr w:type="spellEnd"/>
+      <w:r>
+        <w:t xml:space="preserve"> </w:t>
+      </w:r>
+      <w:r>
+        <w:rPr>
+          <w:b/>
+          <w:bCs/>
+        </w:rPr>
+        <w:t>D = 0</w:t>
+      </w:r>
+      <w:r>
+        <w:t xml:space="preserve"> no </w:t>
+      </w:r>
+      <w:proofErr w:type="spellStart"/>
+      <w:r>
+        <w:t>modelo</w:t>
+      </w:r>
+      <w:proofErr w:type="spellEnd"/>
+      <w:r>
+        <w:t xml:space="preserve"> </w:t>
+      </w:r>
+      <w:proofErr w:type="spellStart"/>
+      <w:r>
+        <w:t>escolhido</w:t>
+      </w:r>
+      <w:proofErr w:type="spellEnd"/>
+      <w:r>
+        <w:t xml:space="preserve">. Assim, a </w:t>
+      </w:r>
+      <w:proofErr w:type="spellStart"/>
+      <w:r>
+        <w:t>sazonalidade</w:t>
+      </w:r>
+      <w:proofErr w:type="spellEnd"/>
+      <w:r>
+        <w:t xml:space="preserve"> </w:t>
+      </w:r>
+      <w:proofErr w:type="spellStart"/>
+      <w:r>
+        <w:t>foi</w:t>
+      </w:r>
+      <w:proofErr w:type="spellEnd"/>
+      <w:r>
+        <w:t xml:space="preserve"> </w:t>
+      </w:r>
+      <w:proofErr w:type="spellStart"/>
+      <w:r>
+        <w:t>tratada</w:t>
+      </w:r>
+      <w:proofErr w:type="spellEnd"/>
+      <w:r>
+        <w:t xml:space="preserve"> </w:t>
+      </w:r>
+      <w:proofErr w:type="spellStart"/>
+      <w:r>
+        <w:t>pelos</w:t>
+      </w:r>
+      <w:proofErr w:type="spellEnd"/>
+      <w:r>
+        <w:t xml:space="preserve"> </w:t>
+      </w:r>
+      <w:proofErr w:type="spellStart"/>
+      <w:r>
+        <w:t>componentes</w:t>
+      </w:r>
+      <w:proofErr w:type="spellEnd"/>
+      <w:r>
+        <w:t xml:space="preserve"> </w:t>
+      </w:r>
+      <w:proofErr w:type="spellStart"/>
+      <w:r>
+        <w:t>sazonais</w:t>
+      </w:r>
+      <w:proofErr w:type="spellEnd"/>
+      <w:r>
+        <w:t xml:space="preserve"> </w:t>
+      </w:r>
+      <w:proofErr w:type="spellStart"/>
+      <w:r>
+        <w:t>autorregressivo</w:t>
+      </w:r>
+      <w:proofErr w:type="spellEnd"/>
+      <w:r>
+        <w:t xml:space="preserve"> e de </w:t>
+      </w:r>
+      <w:proofErr w:type="spellStart"/>
+      <w:r>
+        <w:t>médias</w:t>
+      </w:r>
+      <w:proofErr w:type="spellEnd"/>
+      <w:r>
+        <w:t xml:space="preserve"> </w:t>
+      </w:r>
+      <w:proofErr w:type="spellStart"/>
+      <w:r>
+        <w:t>móveis</w:t>
+      </w:r>
+      <w:proofErr w:type="spellEnd"/>
+      <w:r>
+        <w:t xml:space="preserve">, e </w:t>
+      </w:r>
+      <w:proofErr w:type="spellStart"/>
+      <w:r>
+        <w:t>não</w:t>
+      </w:r>
+      <w:proofErr w:type="spellEnd"/>
+      <w:r>
+        <w:t xml:space="preserve"> </w:t>
+      </w:r>
+      <w:proofErr w:type="spellStart"/>
+      <w:r>
+        <w:t>por</w:t>
+      </w:r>
+      <w:proofErr w:type="spellEnd"/>
+      <w:r>
+        <w:t xml:space="preserve"> </w:t>
+      </w:r>
+      <w:proofErr w:type="spellStart"/>
+      <w:r>
+        <w:t>uma</w:t>
+      </w:r>
+      <w:proofErr w:type="spellEnd"/>
+      <w:r>
+        <w:t xml:space="preserve"> </w:t>
+      </w:r>
+      <w:proofErr w:type="spellStart"/>
+      <w:r>
+        <w:t>diferenciação</w:t>
+      </w:r>
+      <w:proofErr w:type="spellEnd"/>
+      <w:r>
+        <w:t xml:space="preserve"> </w:t>
+      </w:r>
+      <w:proofErr w:type="spellStart"/>
+      <w:r>
+        <w:t>sazonal</w:t>
+      </w:r>
+      <w:proofErr w:type="spellEnd"/>
+      <w:r>
+        <w:t xml:space="preserve"> </w:t>
+      </w:r>
+      <w:proofErr w:type="spellStart"/>
+      <w:r>
+        <w:t>direta</w:t>
+      </w:r>
+      <w:proofErr w:type="spellEnd"/>
+      <w:r>
+        <w:t>.</w:t>
       </w:r>
     </w:p>
     <w:p>
@@ -1870,12 +3032,557 @@
     <w:p>
       <w:pPr>
         <w:jc w:val="both"/>
-        <w:rPr>
-          <w:lang w:val="pt-BR"/>
-        </w:rPr>
       </w:pPr>
       <w:r>
-        <w:t>O modelo ótimo selecionado matematicamente pela busca em grade iterativa foi o SARIMA(1, 1, 1) x (1, 0, 1) [28], atingindo o menor BIC de 26.043,95. O parâmetro de diferenciação d=1 confirma a não estacionariedade apontada pelos testes ADF e KPSS. Além disso, essa estrutura matemática indica que o algoritmo identificou não apenas o ciclo puro de 7 dias, mas encontrou otimização superior modelando o ciclo expandido de 28 dias (quatro semanas), capturando flutuações e comportamentos rítmicos mais profundos do mês calendário.</w:t>
+        <w:t xml:space="preserve">O modelo ótimo selecionado matematicamente pela busca em grade iterativa foi o </w:t>
+      </w:r>
+      <w:proofErr w:type="gramStart"/>
+      <w:r>
+        <w:t>SARIMA(</w:t>
+      </w:r>
+      <w:proofErr w:type="gramEnd"/>
+      <w:r>
+        <w:t xml:space="preserve">1, 1, 1) x (1, 0, 1) [28], atingindo o </w:t>
+      </w:r>
+      <w:proofErr w:type="spellStart"/>
+      <w:r>
+        <w:t>menor</w:t>
+      </w:r>
+      <w:proofErr w:type="spellEnd"/>
+      <w:r>
+        <w:t xml:space="preserve"> BIC de 26.043,95.</w:t>
+      </w:r>
+      <w:r>
+        <w:t xml:space="preserve"> </w:t>
+      </w:r>
+      <w:r>
+        <w:t xml:space="preserve">A </w:t>
+      </w:r>
+      <w:proofErr w:type="spellStart"/>
+      <w:r>
+        <w:t>escolha</w:t>
+      </w:r>
+      <w:proofErr w:type="spellEnd"/>
+      <w:r>
+        <w:t xml:space="preserve"> </w:t>
+      </w:r>
+      <w:proofErr w:type="spellStart"/>
+      <w:r>
+        <w:t>desse</w:t>
+      </w:r>
+      <w:proofErr w:type="spellEnd"/>
+      <w:r>
+        <w:t xml:space="preserve"> </w:t>
+      </w:r>
+      <w:proofErr w:type="spellStart"/>
+      <w:r>
+        <w:t>modelo</w:t>
+      </w:r>
+      <w:proofErr w:type="spellEnd"/>
+      <w:r>
+        <w:t xml:space="preserve"> </w:t>
+      </w:r>
+      <w:proofErr w:type="spellStart"/>
+      <w:r>
+        <w:t>considerou</w:t>
+      </w:r>
+      <w:proofErr w:type="spellEnd"/>
+      <w:r>
+        <w:t xml:space="preserve"> tanto </w:t>
+      </w:r>
+      <w:proofErr w:type="spellStart"/>
+      <w:r>
+        <w:t>os</w:t>
+      </w:r>
+      <w:proofErr w:type="spellEnd"/>
+      <w:r>
+        <w:t xml:space="preserve"> </w:t>
+      </w:r>
+      <w:proofErr w:type="spellStart"/>
+      <w:r>
+        <w:t>resultados</w:t>
+      </w:r>
+      <w:proofErr w:type="spellEnd"/>
+      <w:r>
+        <w:t xml:space="preserve"> dos testes de </w:t>
+      </w:r>
+      <w:proofErr w:type="spellStart"/>
+      <w:r>
+        <w:t>estacionariedade</w:t>
+      </w:r>
+      <w:proofErr w:type="spellEnd"/>
+      <w:r>
+        <w:t xml:space="preserve"> </w:t>
+      </w:r>
+      <w:proofErr w:type="spellStart"/>
+      <w:r>
+        <w:t>quanto</w:t>
+      </w:r>
+      <w:proofErr w:type="spellEnd"/>
+      <w:r>
+        <w:t xml:space="preserve"> o </w:t>
+      </w:r>
+      <w:proofErr w:type="spellStart"/>
+      <w:r>
+        <w:t>desempenho</w:t>
+      </w:r>
+      <w:proofErr w:type="spellEnd"/>
+      <w:r>
+        <w:t xml:space="preserve"> das </w:t>
+      </w:r>
+      <w:proofErr w:type="spellStart"/>
+      <w:r>
+        <w:t>combinações</w:t>
+      </w:r>
+      <w:proofErr w:type="spellEnd"/>
+      <w:r>
+        <w:t xml:space="preserve"> </w:t>
+      </w:r>
+      <w:proofErr w:type="spellStart"/>
+      <w:r>
+        <w:t>avaliadas</w:t>
+      </w:r>
+      <w:proofErr w:type="spellEnd"/>
+      <w:r>
+        <w:t xml:space="preserve"> </w:t>
+      </w:r>
+      <w:proofErr w:type="spellStart"/>
+      <w:r>
+        <w:t>na</w:t>
+      </w:r>
+      <w:proofErr w:type="spellEnd"/>
+      <w:r>
+        <w:t xml:space="preserve"> </w:t>
+      </w:r>
+      <w:proofErr w:type="spellStart"/>
+      <w:r>
+        <w:t>busca</w:t>
+      </w:r>
+      <w:proofErr w:type="spellEnd"/>
+      <w:r>
+        <w:t xml:space="preserve"> </w:t>
+      </w:r>
+      <w:proofErr w:type="spellStart"/>
+      <w:r>
+        <w:t>em</w:t>
+      </w:r>
+      <w:proofErr w:type="spellEnd"/>
+      <w:r>
+        <w:t xml:space="preserve"> grade. O </w:t>
+      </w:r>
+      <w:proofErr w:type="spellStart"/>
+      <w:r>
+        <w:t>parâmetro</w:t>
+      </w:r>
+      <w:proofErr w:type="spellEnd"/>
+      <w:r>
+        <w:t xml:space="preserve"> p = 1 indica </w:t>
+      </w:r>
+      <w:proofErr w:type="spellStart"/>
+      <w:r>
+        <w:t>que</w:t>
+      </w:r>
+      <w:proofErr w:type="spellEnd"/>
+      <w:r>
+        <w:t xml:space="preserve"> o </w:t>
+      </w:r>
+      <w:proofErr w:type="spellStart"/>
+      <w:r>
+        <w:t>modelo</w:t>
+      </w:r>
+      <w:proofErr w:type="spellEnd"/>
+      <w:r>
+        <w:t xml:space="preserve"> </w:t>
+      </w:r>
+      <w:proofErr w:type="spellStart"/>
+      <w:r>
+        <w:t>utiliza</w:t>
+      </w:r>
+      <w:proofErr w:type="spellEnd"/>
+      <w:r>
+        <w:t xml:space="preserve"> </w:t>
+      </w:r>
+      <w:proofErr w:type="gramStart"/>
+      <w:r>
+        <w:t>a</w:t>
+      </w:r>
+      <w:proofErr w:type="gramEnd"/>
+      <w:r>
+        <w:t xml:space="preserve"> </w:t>
+      </w:r>
+      <w:proofErr w:type="spellStart"/>
+      <w:r>
+        <w:t>influência</w:t>
+      </w:r>
+      <w:proofErr w:type="spellEnd"/>
+      <w:r>
+        <w:t xml:space="preserve"> do valor anterior da </w:t>
+      </w:r>
+      <w:proofErr w:type="spellStart"/>
+      <w:r>
+        <w:t>série</w:t>
+      </w:r>
+      <w:proofErr w:type="spellEnd"/>
+      <w:r>
+        <w:t xml:space="preserve">; o </w:t>
+      </w:r>
+      <w:proofErr w:type="spellStart"/>
+      <w:r>
+        <w:t>parâmetro</w:t>
+      </w:r>
+      <w:proofErr w:type="spellEnd"/>
+      <w:r>
+        <w:t xml:space="preserve"> d = 1 </w:t>
+      </w:r>
+      <w:proofErr w:type="spellStart"/>
+      <w:r>
+        <w:t>representa</w:t>
+      </w:r>
+      <w:proofErr w:type="spellEnd"/>
+      <w:r>
+        <w:t xml:space="preserve"> a </w:t>
+      </w:r>
+      <w:proofErr w:type="spellStart"/>
+      <w:r>
+        <w:t>diferenciação</w:t>
+      </w:r>
+      <w:proofErr w:type="spellEnd"/>
+      <w:r>
+        <w:t xml:space="preserve"> regular </w:t>
+      </w:r>
+      <w:proofErr w:type="spellStart"/>
+      <w:r>
+        <w:t>aplicada</w:t>
+      </w:r>
+      <w:proofErr w:type="spellEnd"/>
+      <w:r>
+        <w:t xml:space="preserve"> para </w:t>
+      </w:r>
+      <w:proofErr w:type="spellStart"/>
+      <w:r>
+        <w:t>reduzir</w:t>
+      </w:r>
+      <w:proofErr w:type="spellEnd"/>
+      <w:r>
+        <w:t xml:space="preserve"> a </w:t>
+      </w:r>
+      <w:proofErr w:type="spellStart"/>
+      <w:r>
+        <w:t>não</w:t>
+      </w:r>
+      <w:proofErr w:type="spellEnd"/>
+      <w:r>
+        <w:t xml:space="preserve"> </w:t>
+      </w:r>
+      <w:proofErr w:type="spellStart"/>
+      <w:r>
+        <w:t>estacionariedade</w:t>
+      </w:r>
+      <w:proofErr w:type="spellEnd"/>
+      <w:r>
+        <w:t xml:space="preserve">; e o </w:t>
+      </w:r>
+      <w:proofErr w:type="spellStart"/>
+      <w:r>
+        <w:t>parâmetro</w:t>
+      </w:r>
+      <w:proofErr w:type="spellEnd"/>
+      <w:r>
+        <w:t xml:space="preserve"> q = 1 indica o </w:t>
+      </w:r>
+      <w:proofErr w:type="spellStart"/>
+      <w:r>
+        <w:t>uso</w:t>
+      </w:r>
+      <w:proofErr w:type="spellEnd"/>
+      <w:r>
+        <w:t xml:space="preserve"> do </w:t>
+      </w:r>
+      <w:proofErr w:type="spellStart"/>
+      <w:r>
+        <w:t>erro</w:t>
+      </w:r>
+      <w:proofErr w:type="spellEnd"/>
+      <w:r>
+        <w:t xml:space="preserve"> passado para </w:t>
+      </w:r>
+      <w:proofErr w:type="spellStart"/>
+      <w:r>
+        <w:t>corrigir</w:t>
+      </w:r>
+      <w:proofErr w:type="spellEnd"/>
+      <w:r>
+        <w:t xml:space="preserve"> a </w:t>
+      </w:r>
+      <w:proofErr w:type="spellStart"/>
+      <w:r>
+        <w:t>previsão</w:t>
+      </w:r>
+      <w:proofErr w:type="spellEnd"/>
+      <w:r>
+        <w:t xml:space="preserve">. Na </w:t>
+      </w:r>
+      <w:proofErr w:type="spellStart"/>
+      <w:r>
+        <w:t>parte</w:t>
+      </w:r>
+      <w:proofErr w:type="spellEnd"/>
+      <w:r>
+        <w:t xml:space="preserve"> </w:t>
+      </w:r>
+      <w:proofErr w:type="spellStart"/>
+      <w:r>
+        <w:t>sazonal</w:t>
+      </w:r>
+      <w:proofErr w:type="spellEnd"/>
+      <w:r>
+        <w:t xml:space="preserve">, P = 1 e Q = 1 </w:t>
+      </w:r>
+      <w:proofErr w:type="spellStart"/>
+      <w:r>
+        <w:t>indicam</w:t>
+      </w:r>
+      <w:proofErr w:type="spellEnd"/>
+      <w:r>
+        <w:t xml:space="preserve"> </w:t>
+      </w:r>
+      <w:proofErr w:type="spellStart"/>
+      <w:r>
+        <w:t>que</w:t>
+      </w:r>
+      <w:proofErr w:type="spellEnd"/>
+      <w:r>
+        <w:t xml:space="preserve"> o </w:t>
+      </w:r>
+      <w:proofErr w:type="spellStart"/>
+      <w:r>
+        <w:t>modelo</w:t>
+      </w:r>
+      <w:proofErr w:type="spellEnd"/>
+      <w:r>
+        <w:t xml:space="preserve"> </w:t>
+      </w:r>
+      <w:proofErr w:type="spellStart"/>
+      <w:r>
+        <w:t>também</w:t>
+      </w:r>
+      <w:proofErr w:type="spellEnd"/>
+      <w:r>
+        <w:t xml:space="preserve"> </w:t>
+      </w:r>
+      <w:proofErr w:type="spellStart"/>
+      <w:r>
+        <w:t>considera</w:t>
+      </w:r>
+      <w:proofErr w:type="spellEnd"/>
+      <w:r>
+        <w:t xml:space="preserve"> </w:t>
+      </w:r>
+      <w:proofErr w:type="spellStart"/>
+      <w:r>
+        <w:t>padrões</w:t>
+      </w:r>
+      <w:proofErr w:type="spellEnd"/>
+      <w:r>
+        <w:t xml:space="preserve"> </w:t>
+      </w:r>
+      <w:proofErr w:type="spellStart"/>
+      <w:r>
+        <w:t>sazonais</w:t>
+      </w:r>
+      <w:proofErr w:type="spellEnd"/>
+      <w:r>
+        <w:t xml:space="preserve"> </w:t>
+      </w:r>
+      <w:proofErr w:type="spellStart"/>
+      <w:r>
+        <w:t>anteriores</w:t>
+      </w:r>
+      <w:proofErr w:type="spellEnd"/>
+      <w:r>
+        <w:t xml:space="preserve"> e </w:t>
+      </w:r>
+      <w:proofErr w:type="spellStart"/>
+      <w:r>
+        <w:t>erros</w:t>
+      </w:r>
+      <w:proofErr w:type="spellEnd"/>
+      <w:r>
+        <w:t xml:space="preserve"> </w:t>
+      </w:r>
+      <w:proofErr w:type="spellStart"/>
+      <w:r>
+        <w:t>sazonais</w:t>
+      </w:r>
+      <w:proofErr w:type="spellEnd"/>
+      <w:r>
+        <w:t xml:space="preserve"> </w:t>
+      </w:r>
+      <w:proofErr w:type="spellStart"/>
+      <w:r>
+        <w:t>anteriores</w:t>
+      </w:r>
+      <w:proofErr w:type="spellEnd"/>
+      <w:r>
+        <w:t xml:space="preserve">. O </w:t>
+      </w:r>
+      <w:proofErr w:type="spellStart"/>
+      <w:r>
+        <w:t>período</w:t>
+      </w:r>
+      <w:proofErr w:type="spellEnd"/>
+      <w:r>
+        <w:t xml:space="preserve"> m = 28</w:t>
+      </w:r>
+      <w:r>
+        <w:t xml:space="preserve"> </w:t>
+      </w:r>
+      <w:proofErr w:type="spellStart"/>
+      <w:r>
+        <w:t>sugere</w:t>
+      </w:r>
+      <w:proofErr w:type="spellEnd"/>
+      <w:r>
+        <w:t xml:space="preserve"> </w:t>
+      </w:r>
+      <w:proofErr w:type="spellStart"/>
+      <w:r>
+        <w:t>que</w:t>
+      </w:r>
+      <w:proofErr w:type="spellEnd"/>
+      <w:r>
+        <w:t xml:space="preserve"> </w:t>
+      </w:r>
+      <w:proofErr w:type="spellStart"/>
+      <w:r>
+        <w:t>o</w:t>
+      </w:r>
+      <w:proofErr w:type="spellEnd"/>
+      <w:r>
+        <w:t xml:space="preserve"> </w:t>
+      </w:r>
+      <w:proofErr w:type="spellStart"/>
+      <w:r>
+        <w:t>melhor</w:t>
+      </w:r>
+      <w:proofErr w:type="spellEnd"/>
+      <w:r>
+        <w:t xml:space="preserve"> </w:t>
+      </w:r>
+      <w:proofErr w:type="spellStart"/>
+      <w:r>
+        <w:t>desempenho</w:t>
+      </w:r>
+      <w:proofErr w:type="spellEnd"/>
+      <w:r>
+        <w:t xml:space="preserve"> </w:t>
+      </w:r>
+      <w:proofErr w:type="spellStart"/>
+      <w:r>
+        <w:t>foi</w:t>
+      </w:r>
+      <w:proofErr w:type="spellEnd"/>
+      <w:r>
+        <w:t xml:space="preserve"> </w:t>
+      </w:r>
+      <w:proofErr w:type="spellStart"/>
+      <w:r>
+        <w:t>obtido</w:t>
+      </w:r>
+      <w:proofErr w:type="spellEnd"/>
+      <w:r>
+        <w:t xml:space="preserve"> </w:t>
+      </w:r>
+      <w:proofErr w:type="spellStart"/>
+      <w:r>
+        <w:t>ao</w:t>
+      </w:r>
+      <w:proofErr w:type="spellEnd"/>
+      <w:r>
+        <w:t xml:space="preserve"> </w:t>
+      </w:r>
+      <w:proofErr w:type="spellStart"/>
+      <w:r>
+        <w:t>capturar</w:t>
+      </w:r>
+      <w:proofErr w:type="spellEnd"/>
+      <w:r>
+        <w:t xml:space="preserve"> um </w:t>
+      </w:r>
+      <w:proofErr w:type="spellStart"/>
+      <w:r>
+        <w:t>ciclo</w:t>
+      </w:r>
+      <w:proofErr w:type="spellEnd"/>
+      <w:r>
+        <w:t xml:space="preserve"> </w:t>
+      </w:r>
+      <w:proofErr w:type="spellStart"/>
+      <w:r>
+        <w:t>mais</w:t>
+      </w:r>
+      <w:proofErr w:type="spellEnd"/>
+      <w:r>
+        <w:t xml:space="preserve"> </w:t>
+      </w:r>
+      <w:proofErr w:type="spellStart"/>
+      <w:r>
+        <w:t>amplo</w:t>
+      </w:r>
+      <w:proofErr w:type="spellEnd"/>
+      <w:r>
+        <w:t xml:space="preserve">, </w:t>
+      </w:r>
+      <w:proofErr w:type="spellStart"/>
+      <w:r>
+        <w:t>equivalente</w:t>
+      </w:r>
+      <w:proofErr w:type="spellEnd"/>
+      <w:r>
+        <w:t xml:space="preserve"> a </w:t>
+      </w:r>
+      <w:proofErr w:type="spellStart"/>
+      <w:r>
+        <w:t>quatro</w:t>
+      </w:r>
+      <w:proofErr w:type="spellEnd"/>
+      <w:r>
+        <w:t xml:space="preserve"> </w:t>
+      </w:r>
+      <w:proofErr w:type="spellStart"/>
+      <w:r>
+        <w:t>semanas</w:t>
+      </w:r>
+      <w:proofErr w:type="spellEnd"/>
+      <w:r>
+        <w:t>.</w:t>
+      </w:r>
+      <w:r>
+        <w:t xml:space="preserve"> </w:t>
+      </w:r>
+    </w:p>
+    <w:p>
+      <w:pPr>
+        <w:jc w:val="both"/>
+      </w:pPr>
+      <w:r>
+        <w:t xml:space="preserve">O </w:t>
+      </w:r>
+      <w:proofErr w:type="spellStart"/>
+      <w:r>
+        <w:t>parâmetro</w:t>
+      </w:r>
+      <w:proofErr w:type="spellEnd"/>
+      <w:r>
+        <w:t xml:space="preserve"> de </w:t>
+      </w:r>
+      <w:proofErr w:type="spellStart"/>
+      <w:r>
+        <w:t>diferenciação</w:t>
+      </w:r>
+      <w:proofErr w:type="spellEnd"/>
+      <w:r>
+        <w:t xml:space="preserve"> d=1 confirma a não estacionariedade apontada pelos testes ADF e KPSS. Além disso, essa estrutura matemática indica que o algoritmo identificou não apenas o ciclo puro de 7 dias, mas encontrou otimização superior modelando o ciclo expandido de 28 dias (quatro semanas), capturando flutuações e comportamentos rítmicos mais profundos do mês calendário.</w:t>
       </w:r>
     </w:p>
     <w:p>
@@ -1889,14 +3596,7 @@
         <w:rPr>
           <w:lang w:val="pt-BR"/>
         </w:rPr>
-        <w:t xml:space="preserve">Em termos gerenciais, essa estrutura indica que o tráfego do dia corrente é predito com base na taxa observada no passado recente, combinada com uma </w:t>
-      </w:r>
-      <w:r>
-        <w:rPr>
-          <w:lang w:val="pt-BR"/>
-        </w:rPr>
-        <w:lastRenderedPageBreak/>
-        <w:t>correção de erro ponderada e sazonalidade de janelas alargadas, capturando tanto a inércia diária quanto ciclos expandidos de mobilidade.</w:t>
+        <w:t>Em termos gerenciais, essa estrutura indica que o tráfego do dia corrente é predito com base na taxa observada no passado recente, combinada com uma correção de erro ponderada e sazonalidade de janelas alargadas, capturando tanto a inércia diária quanto ciclos expandidos de mobilidade.</w:t>
       </w:r>
     </w:p>
     <w:p>
@@ -1911,6 +3611,7 @@
         <w:rPr>
           <w:lang w:val="pt-BR"/>
         </w:rPr>
+        <w:lastRenderedPageBreak/>
         <w:t>Comparação com Base Models</w:t>
       </w:r>
       <w:bookmarkEnd w:id="7"/>
@@ -2210,52 +3911,103 @@
           </wp:inline>
         </w:drawing>
       </w:r>
+      <w:bookmarkStart w:id="8" w:name="_Toc230464596"/>
+      <w:r>
+        <w:rPr>
+          <w:color w:val="000000" w:themeColor="text1"/>
+          <w:szCs w:val="24"/>
+          <w:lang w:val="pt-BR"/>
+        </w:rPr>
+        <w:t xml:space="preserve">O modelo </w:t>
+      </w:r>
+      <w:proofErr w:type="spellStart"/>
+      <w:r>
+        <w:rPr>
+          <w:color w:val="000000" w:themeColor="text1"/>
+          <w:szCs w:val="24"/>
+          <w:lang w:val="pt-BR"/>
+        </w:rPr>
+        <w:t>Seasonal</w:t>
+      </w:r>
+      <w:proofErr w:type="spellEnd"/>
+      <w:r>
+        <w:rPr>
+          <w:color w:val="000000" w:themeColor="text1"/>
+          <w:szCs w:val="24"/>
+          <w:lang w:val="pt-BR"/>
+        </w:rPr>
+        <w:t xml:space="preserve"> </w:t>
+      </w:r>
+      <w:proofErr w:type="spellStart"/>
+      <w:r>
+        <w:rPr>
+          <w:color w:val="000000" w:themeColor="text1"/>
+          <w:szCs w:val="24"/>
+          <w:lang w:val="pt-BR"/>
+        </w:rPr>
+        <w:t>Naive</w:t>
+      </w:r>
+      <w:proofErr w:type="spellEnd"/>
+      <w:r>
+        <w:rPr>
+          <w:color w:val="000000" w:themeColor="text1"/>
+          <w:szCs w:val="24"/>
+          <w:lang w:val="pt-BR"/>
+        </w:rPr>
+        <w:t xml:space="preserve"> apresentou desempenho bastante competitivo no conjunto de teste, com MAE de 327,38, superando o SARIMA Estático, que obteve MAE de 364,89. Esse resultado indica que, em séries com sazonalidade semanal muito forte, um modelo simples que replica o comportamento observado no mesmo dia da semana anterior já consegue capturar parte relevante da estrutura temporal.</w:t>
+      </w:r>
     </w:p>
     <w:p>
       <w:pPr>
-        <w:jc w:val="both"/>
+        <w:pStyle w:val="Ttulo2"/>
         <w:rPr>
+          <w:rFonts w:ascii="Arial" w:hAnsi="Arial" w:cs="Arial"/>
+          <w:b w:val="0"/>
+          <w:bCs w:val="0"/>
+          <w:color w:val="000000" w:themeColor="text1"/>
+          <w:sz w:val="24"/>
+          <w:szCs w:val="24"/>
           <w:lang w:val="pt-BR"/>
         </w:rPr>
       </w:pPr>
       <w:r>
         <w:rPr>
-          <w:lang w:val="pt-BR"/>
-        </w:rPr>
-        <w:t xml:space="preserve">O modelo Sazonal </w:t>
-      </w:r>
-      <w:proofErr w:type="spellStart"/>
-      <w:r>
-        <w:rPr>
-          <w:lang w:val="pt-BR"/>
-        </w:rPr>
-        <w:t>Naive</w:t>
-      </w:r>
-      <w:proofErr w:type="spellEnd"/>
-      <w:r>
-        <w:rPr>
-          <w:lang w:val="pt-BR"/>
-        </w:rPr>
-        <w:t xml:space="preserve"> apresenta um erro menor (327,38), pois respeita a periodicidade, mas falha em se ajustar a pequenas tendências locais. A implementação do SARIMA Estático conseguiu modelar estatisticamente o comportamento, mas foi a abordagem de Rolling Forecast do </w:t>
-      </w:r>
-      <w:r>
-        <w:rPr>
-          <w:lang w:val="pt-BR"/>
-        </w:rPr>
-        <w:t>SARIMA</w:t>
-      </w:r>
-      <w:r>
-        <w:rPr>
-          <w:lang w:val="pt-BR"/>
-        </w:rPr>
-        <w:t xml:space="preserve"> (que será </w:t>
-      </w:r>
-      <w:r>
-        <w:rPr>
+          <w:rFonts w:ascii="Arial" w:hAnsi="Arial" w:cs="Arial"/>
+          <w:b w:val="0"/>
+          <w:bCs w:val="0"/>
+          <w:color w:val="000000" w:themeColor="text1"/>
+          <w:sz w:val="24"/>
+          <w:szCs w:val="24"/>
           <w:lang w:val="pt-BR"/>
         </w:rPr>
         <w:lastRenderedPageBreak/>
-        <w:t>detalhada a seguir) que derrubou o erro absoluto para 268,07 veículos/dia, consagrando-se como a abordagem superior e evidenciando a utilidade da inteligência de dados.</w:t>
+        <w:t xml:space="preserve">No entanto, o melhor desempenho geral foi alcançado pelo SARIMA com Rolling Forecast, que reduziu o MAE para 268,07. Portanto, o SARIMA não foi superior </w:t>
+      </w:r>
+      <w:proofErr w:type="gramStart"/>
+      <w:r>
+        <w:rPr>
+          <w:rFonts w:ascii="Arial" w:hAnsi="Arial" w:cs="Arial"/>
+          <w:b w:val="0"/>
+          <w:bCs w:val="0"/>
+          <w:color w:val="000000" w:themeColor="text1"/>
+          <w:sz w:val="24"/>
+          <w:szCs w:val="24"/>
+          <w:lang w:val="pt-BR"/>
+        </w:rPr>
+        <w:t>aos base</w:t>
+      </w:r>
+      <w:proofErr w:type="gramEnd"/>
+      <w:r>
+        <w:rPr>
+          <w:rFonts w:ascii="Arial" w:hAnsi="Arial" w:cs="Arial"/>
+          <w:b w:val="0"/>
+          <w:bCs w:val="0"/>
+          <w:color w:val="000000" w:themeColor="text1"/>
+          <w:sz w:val="24"/>
+          <w:szCs w:val="24"/>
+          <w:lang w:val="pt-BR"/>
+        </w:rPr>
+        <w:t xml:space="preserve"> models em sua versão estática, mas tornou-se a melhor abordagem quando utilizado de forma dinâmica, incorporando novas observações ao longo do tempo. Isso mostra que a complexidade do SARIMA se justifica principalmente em um cenário operacional atualizado continuamente.</w:t>
       </w:r>
     </w:p>
     <w:p>
@@ -2265,7 +4017,6 @@
           <w:lang w:val="pt-BR"/>
         </w:rPr>
       </w:pPr>
-      <w:bookmarkStart w:id="8" w:name="_Toc230464596"/>
       <w:r>
         <w:rPr>
           <w:lang w:val="pt-BR"/>
@@ -2355,7 +4106,431 @@
         <w:rPr>
           <w:lang w:val="pt-BR"/>
         </w:rPr>
-        <w:t>Esta metodologia reduziu de forma marcante o erro de previsão absoluta do tráfego rodoviário. O MAE despencou no contexto do Rolling Forecast (268,07), comprovando que modelos preditivos estáticos perdem valor rapidamente. Para que as previsões apoiem decisões com eficiência, o modelo deve rodar sob rotinas de retroalimentação contínua.</w:t>
+        <w:t>Esta metodologia reduziu de forma marcante o erro de previsão absoluta do tráfego rodoviário. O MAE despencou no contexto do Rolling Forecast (268,07), comprovando que modelos preditivos estáticos perdem valor rapidamente.</w:t>
+      </w:r>
+      <w:r>
+        <w:t xml:space="preserve"> </w:t>
+      </w:r>
+      <w:r>
+        <w:t xml:space="preserve">A </w:t>
+      </w:r>
+      <w:proofErr w:type="spellStart"/>
+      <w:r>
+        <w:t>melhora</w:t>
+      </w:r>
+      <w:proofErr w:type="spellEnd"/>
+      <w:r>
+        <w:t xml:space="preserve"> </w:t>
+      </w:r>
+      <w:proofErr w:type="spellStart"/>
+      <w:r>
+        <w:t>obtida</w:t>
+      </w:r>
+      <w:proofErr w:type="spellEnd"/>
+      <w:r>
+        <w:t xml:space="preserve"> </w:t>
+      </w:r>
+      <w:proofErr w:type="spellStart"/>
+      <w:r>
+        <w:t>pelo</w:t>
+      </w:r>
+      <w:proofErr w:type="spellEnd"/>
+      <w:r>
+        <w:t xml:space="preserve"> Rolling Forecast </w:t>
+      </w:r>
+      <w:proofErr w:type="spellStart"/>
+      <w:r>
+        <w:t>mostra</w:t>
+      </w:r>
+      <w:proofErr w:type="spellEnd"/>
+      <w:r>
+        <w:t xml:space="preserve"> </w:t>
+      </w:r>
+      <w:proofErr w:type="spellStart"/>
+      <w:r>
+        <w:t>que</w:t>
+      </w:r>
+      <w:proofErr w:type="spellEnd"/>
+      <w:r>
+        <w:t xml:space="preserve"> a </w:t>
+      </w:r>
+      <w:proofErr w:type="spellStart"/>
+      <w:r>
+        <w:t>série</w:t>
+      </w:r>
+      <w:proofErr w:type="spellEnd"/>
+      <w:r>
+        <w:t xml:space="preserve"> de </w:t>
+      </w:r>
+      <w:proofErr w:type="spellStart"/>
+      <w:r>
+        <w:t>tráfego</w:t>
+      </w:r>
+      <w:proofErr w:type="spellEnd"/>
+      <w:r>
+        <w:t xml:space="preserve"> se beneficia da </w:t>
+      </w:r>
+      <w:proofErr w:type="spellStart"/>
+      <w:r>
+        <w:t>atualização</w:t>
+      </w:r>
+      <w:proofErr w:type="spellEnd"/>
+      <w:r>
+        <w:t xml:space="preserve"> </w:t>
+      </w:r>
+      <w:proofErr w:type="spellStart"/>
+      <w:r>
+        <w:t>frequente</w:t>
+      </w:r>
+      <w:proofErr w:type="spellEnd"/>
+      <w:r>
+        <w:t xml:space="preserve"> com dados </w:t>
+      </w:r>
+      <w:proofErr w:type="spellStart"/>
+      <w:r>
+        <w:t>recentes</w:t>
+      </w:r>
+      <w:proofErr w:type="spellEnd"/>
+      <w:r>
+        <w:t xml:space="preserve">. Como o </w:t>
+      </w:r>
+      <w:proofErr w:type="spellStart"/>
+      <w:r>
+        <w:t>fluxo</w:t>
+      </w:r>
+      <w:proofErr w:type="spellEnd"/>
+      <w:r>
+        <w:t xml:space="preserve"> </w:t>
+      </w:r>
+      <w:proofErr w:type="spellStart"/>
+      <w:r>
+        <w:t>rodoviário</w:t>
+      </w:r>
+      <w:proofErr w:type="spellEnd"/>
+      <w:r>
+        <w:t xml:space="preserve"> </w:t>
+      </w:r>
+      <w:proofErr w:type="spellStart"/>
+      <w:r>
+        <w:t>pode</w:t>
+      </w:r>
+      <w:proofErr w:type="spellEnd"/>
+      <w:r>
+        <w:t xml:space="preserve"> ser </w:t>
+      </w:r>
+      <w:proofErr w:type="spellStart"/>
+      <w:r>
+        <w:t>afetado</w:t>
+      </w:r>
+      <w:proofErr w:type="spellEnd"/>
+      <w:r>
+        <w:t xml:space="preserve"> </w:t>
+      </w:r>
+      <w:proofErr w:type="spellStart"/>
+      <w:r>
+        <w:t>por</w:t>
+      </w:r>
+      <w:proofErr w:type="spellEnd"/>
+      <w:r>
+        <w:t xml:space="preserve"> </w:t>
+      </w:r>
+      <w:proofErr w:type="spellStart"/>
+      <w:r>
+        <w:t>alterações</w:t>
+      </w:r>
+      <w:proofErr w:type="spellEnd"/>
+      <w:r>
+        <w:t xml:space="preserve"> de </w:t>
+      </w:r>
+      <w:proofErr w:type="spellStart"/>
+      <w:r>
+        <w:t>rotina</w:t>
+      </w:r>
+      <w:proofErr w:type="spellEnd"/>
+      <w:r>
+        <w:t xml:space="preserve">, </w:t>
+      </w:r>
+      <w:proofErr w:type="spellStart"/>
+      <w:r>
+        <w:t>feriados</w:t>
+      </w:r>
+      <w:proofErr w:type="spellEnd"/>
+      <w:r>
+        <w:t xml:space="preserve">, </w:t>
+      </w:r>
+      <w:proofErr w:type="spellStart"/>
+      <w:r>
+        <w:t>clima</w:t>
+      </w:r>
+      <w:proofErr w:type="spellEnd"/>
+      <w:r>
+        <w:t xml:space="preserve"> e </w:t>
+      </w:r>
+      <w:proofErr w:type="spellStart"/>
+      <w:r>
+        <w:t>choques</w:t>
+      </w:r>
+      <w:proofErr w:type="spellEnd"/>
+      <w:r>
+        <w:t xml:space="preserve"> </w:t>
+      </w:r>
+      <w:proofErr w:type="spellStart"/>
+      <w:r>
+        <w:t>pontuais</w:t>
+      </w:r>
+      <w:proofErr w:type="spellEnd"/>
+      <w:r>
+        <w:t xml:space="preserve">, </w:t>
+      </w:r>
+      <w:proofErr w:type="spellStart"/>
+      <w:r>
+        <w:t>utilizar</w:t>
+      </w:r>
+      <w:proofErr w:type="spellEnd"/>
+      <w:r>
+        <w:t xml:space="preserve"> </w:t>
+      </w:r>
+      <w:proofErr w:type="spellStart"/>
+      <w:r>
+        <w:t>apenas</w:t>
+      </w:r>
+      <w:proofErr w:type="spellEnd"/>
+      <w:r>
+        <w:t xml:space="preserve"> </w:t>
+      </w:r>
+      <w:proofErr w:type="spellStart"/>
+      <w:r>
+        <w:t>uma</w:t>
+      </w:r>
+      <w:proofErr w:type="spellEnd"/>
+      <w:r>
+        <w:t xml:space="preserve"> </w:t>
+      </w:r>
+      <w:proofErr w:type="spellStart"/>
+      <w:r>
+        <w:t>previsão</w:t>
+      </w:r>
+      <w:proofErr w:type="spellEnd"/>
+      <w:r>
+        <w:t xml:space="preserve"> </w:t>
+      </w:r>
+      <w:proofErr w:type="spellStart"/>
+      <w:r>
+        <w:t>estática</w:t>
+      </w:r>
+      <w:proofErr w:type="spellEnd"/>
+      <w:r>
+        <w:t xml:space="preserve"> para </w:t>
+      </w:r>
+      <w:proofErr w:type="spellStart"/>
+      <w:r>
+        <w:t>todo</w:t>
+      </w:r>
+      <w:proofErr w:type="spellEnd"/>
+      <w:r>
+        <w:t xml:space="preserve"> o </w:t>
+      </w:r>
+      <w:proofErr w:type="spellStart"/>
+      <w:r>
+        <w:t>período</w:t>
+      </w:r>
+      <w:proofErr w:type="spellEnd"/>
+      <w:r>
+        <w:t xml:space="preserve"> de teste </w:t>
+      </w:r>
+      <w:proofErr w:type="spellStart"/>
+      <w:r>
+        <w:t>reduz</w:t>
+      </w:r>
+      <w:proofErr w:type="spellEnd"/>
+      <w:r>
+        <w:t xml:space="preserve"> a </w:t>
+      </w:r>
+      <w:proofErr w:type="spellStart"/>
+      <w:r>
+        <w:t>capacidade</w:t>
+      </w:r>
+      <w:proofErr w:type="spellEnd"/>
+      <w:r>
+        <w:t xml:space="preserve"> </w:t>
+      </w:r>
+      <w:r>
+        <w:lastRenderedPageBreak/>
+        <w:t xml:space="preserve">de </w:t>
+      </w:r>
+      <w:proofErr w:type="spellStart"/>
+      <w:r>
+        <w:t>adaptação</w:t>
+      </w:r>
+      <w:proofErr w:type="spellEnd"/>
+      <w:r>
+        <w:t xml:space="preserve"> do </w:t>
+      </w:r>
+      <w:proofErr w:type="spellStart"/>
+      <w:r>
+        <w:t>modelo</w:t>
+      </w:r>
+      <w:proofErr w:type="spellEnd"/>
+      <w:r>
+        <w:t xml:space="preserve">. Assim, o Rolling Forecast </w:t>
+      </w:r>
+      <w:proofErr w:type="spellStart"/>
+      <w:r>
+        <w:t>representa</w:t>
+      </w:r>
+      <w:proofErr w:type="spellEnd"/>
+      <w:r>
+        <w:t xml:space="preserve"> um </w:t>
+      </w:r>
+      <w:proofErr w:type="spellStart"/>
+      <w:r>
+        <w:t>cenário</w:t>
+      </w:r>
+      <w:proofErr w:type="spellEnd"/>
+      <w:r>
+        <w:t xml:space="preserve"> </w:t>
+      </w:r>
+      <w:proofErr w:type="spellStart"/>
+      <w:r>
+        <w:t>mais</w:t>
+      </w:r>
+      <w:proofErr w:type="spellEnd"/>
+      <w:r>
+        <w:t xml:space="preserve"> </w:t>
+      </w:r>
+      <w:proofErr w:type="spellStart"/>
+      <w:r>
+        <w:t>realista</w:t>
+      </w:r>
+      <w:proofErr w:type="spellEnd"/>
+      <w:r>
+        <w:t xml:space="preserve"> de </w:t>
+      </w:r>
+      <w:proofErr w:type="spellStart"/>
+      <w:r>
+        <w:t>uso</w:t>
+      </w:r>
+      <w:proofErr w:type="spellEnd"/>
+      <w:r>
+        <w:t xml:space="preserve"> </w:t>
+      </w:r>
+      <w:proofErr w:type="spellStart"/>
+      <w:r>
+        <w:t>prático</w:t>
+      </w:r>
+      <w:proofErr w:type="spellEnd"/>
+      <w:r>
+        <w:t xml:space="preserve">, pois </w:t>
+      </w:r>
+      <w:proofErr w:type="spellStart"/>
+      <w:r>
+        <w:t>simula</w:t>
+      </w:r>
+      <w:proofErr w:type="spellEnd"/>
+      <w:r>
+        <w:t xml:space="preserve"> </w:t>
+      </w:r>
+      <w:proofErr w:type="gramStart"/>
+      <w:r>
+        <w:t>a</w:t>
+      </w:r>
+      <w:proofErr w:type="gramEnd"/>
+      <w:r>
+        <w:t xml:space="preserve"> </w:t>
+      </w:r>
+      <w:proofErr w:type="spellStart"/>
+      <w:r>
+        <w:t>atualização</w:t>
+      </w:r>
+      <w:proofErr w:type="spellEnd"/>
+      <w:r>
+        <w:t xml:space="preserve"> </w:t>
+      </w:r>
+      <w:proofErr w:type="spellStart"/>
+      <w:r>
+        <w:t>contínua</w:t>
+      </w:r>
+      <w:proofErr w:type="spellEnd"/>
+      <w:r>
+        <w:t xml:space="preserve"> </w:t>
+      </w:r>
+      <w:proofErr w:type="spellStart"/>
+      <w:r>
+        <w:t>que</w:t>
+      </w:r>
+      <w:proofErr w:type="spellEnd"/>
+      <w:r>
+        <w:t xml:space="preserve"> </w:t>
+      </w:r>
+      <w:proofErr w:type="spellStart"/>
+      <w:r>
+        <w:t>ocorreria</w:t>
+      </w:r>
+      <w:proofErr w:type="spellEnd"/>
+      <w:r>
+        <w:t xml:space="preserve"> </w:t>
+      </w:r>
+      <w:proofErr w:type="spellStart"/>
+      <w:r>
+        <w:t>em</w:t>
+      </w:r>
+      <w:proofErr w:type="spellEnd"/>
+      <w:r>
+        <w:t xml:space="preserve"> </w:t>
+      </w:r>
+      <w:proofErr w:type="spellStart"/>
+      <w:r>
+        <w:t>uma</w:t>
+      </w:r>
+      <w:proofErr w:type="spellEnd"/>
+      <w:r>
+        <w:t xml:space="preserve"> </w:t>
+      </w:r>
+      <w:proofErr w:type="spellStart"/>
+      <w:r>
+        <w:t>operação</w:t>
+      </w:r>
+      <w:proofErr w:type="spellEnd"/>
+      <w:r>
+        <w:t xml:space="preserve"> </w:t>
+      </w:r>
+      <w:proofErr w:type="spellStart"/>
+      <w:r>
+        <w:t>diária</w:t>
+      </w:r>
+      <w:proofErr w:type="spellEnd"/>
+      <w:r>
+        <w:t xml:space="preserve"> de </w:t>
+      </w:r>
+      <w:proofErr w:type="spellStart"/>
+      <w:r>
+        <w:t>monitoramento</w:t>
+      </w:r>
+      <w:proofErr w:type="spellEnd"/>
+      <w:r>
+        <w:t xml:space="preserve"> de </w:t>
+      </w:r>
+      <w:proofErr w:type="spellStart"/>
+      <w:r>
+        <w:t>tráfego</w:t>
+      </w:r>
+      <w:proofErr w:type="spellEnd"/>
+      <w:r>
+        <w:t>.</w:t>
+      </w:r>
+    </w:p>
+    <w:p>
+      <w:pPr>
+        <w:jc w:val="both"/>
+        <w:rPr>
+          <w:lang w:val="pt-BR"/>
+        </w:rPr>
+      </w:pPr>
+      <w:r>
+        <w:rPr>
+          <w:lang w:val="pt-BR"/>
+        </w:rPr>
+        <w:t xml:space="preserve"> Para que as previsões apoiem decisões com eficiência, o modelo deve rodar sob rotinas de retroalimentação contínua.</w:t>
       </w:r>
     </w:p>
     <w:p>
@@ -2385,14 +4560,7 @@
         <w:rPr>
           <w:lang w:val="pt-BR"/>
         </w:rPr>
-        <w:t xml:space="preserve">A validação final do modelo exigiu a realização de uma análise diagnóstica minuciosa sobre a série de resíduos obtida após o ajuste. O diagnóstico visual mostrou que a distribuição dos erros de previsão é predominantemente </w:t>
-      </w:r>
-      <w:r>
-        <w:rPr>
-          <w:lang w:val="pt-BR"/>
-        </w:rPr>
-        <w:lastRenderedPageBreak/>
-        <w:t xml:space="preserve">simétrica, apresentando média zero e variância </w:t>
+        <w:t xml:space="preserve">A validação final do modelo exigiu a realização de uma análise diagnóstica minuciosa sobre a série de resíduos obtida após o ajuste. O diagnóstico visual mostrou que a distribuição dos erros de previsão é predominantemente simétrica, apresentando média zero e variância </w:t>
       </w:r>
       <w:proofErr w:type="spellStart"/>
       <w:r>
@@ -2454,12 +4622,401 @@
     <w:p>
       <w:pPr>
         <w:jc w:val="both"/>
+      </w:pPr>
+      <w:proofErr w:type="gramStart"/>
+      <w:r>
+        <w:t>A</w:t>
+      </w:r>
+      <w:proofErr w:type="gramEnd"/>
+      <w:r>
+        <w:t xml:space="preserve"> aplicação do Teste de Ljung-Box sobre os resíduos para avaliar a presença de autocorrelação serial restante resultou em um p-value de 0,96 (para o Lag 20), estritamente superior ao limite de 0,05, falhando em rejeitar a hipótese nula de independência de erros e indicando que os resíduos formam, estatisticamente, um ruído branco válido. </w:t>
+      </w:r>
+      <w:proofErr w:type="spellStart"/>
+      <w:r>
+        <w:t>Isso</w:t>
+      </w:r>
+      <w:proofErr w:type="spellEnd"/>
+      <w:r>
+        <w:t xml:space="preserve"> </w:t>
+      </w:r>
+      <w:proofErr w:type="spellStart"/>
+      <w:r>
+        <w:t>significa</w:t>
+      </w:r>
+      <w:proofErr w:type="spellEnd"/>
+      <w:r>
+        <w:t xml:space="preserve"> </w:t>
+      </w:r>
+      <w:proofErr w:type="spellStart"/>
+      <w:r>
+        <w:t>que</w:t>
+      </w:r>
+      <w:proofErr w:type="spellEnd"/>
+      <w:r>
+        <w:t xml:space="preserve"> o </w:t>
+      </w:r>
+      <w:proofErr w:type="spellStart"/>
+      <w:r>
+        <w:t>modelo</w:t>
+      </w:r>
+      <w:proofErr w:type="spellEnd"/>
+      <w:r>
+        <w:t xml:space="preserve"> </w:t>
+      </w:r>
+      <w:proofErr w:type="spellStart"/>
+      <w:r>
+        <w:t>conseguiu</w:t>
+      </w:r>
+      <w:proofErr w:type="spellEnd"/>
+      <w:r>
+        <w:t xml:space="preserve"> </w:t>
+      </w:r>
+      <w:proofErr w:type="spellStart"/>
+      <w:r>
+        <w:t>capturar</w:t>
+      </w:r>
+      <w:proofErr w:type="spellEnd"/>
+      <w:r>
+        <w:t xml:space="preserve"> a </w:t>
+      </w:r>
+      <w:proofErr w:type="spellStart"/>
+      <w:r>
+        <w:t>maior</w:t>
+      </w:r>
+      <w:proofErr w:type="spellEnd"/>
+      <w:r>
+        <w:t xml:space="preserve"> </w:t>
+      </w:r>
+      <w:proofErr w:type="spellStart"/>
+      <w:r>
+        <w:t>parte</w:t>
+      </w:r>
+      <w:proofErr w:type="spellEnd"/>
+      <w:r>
+        <w:t xml:space="preserve"> da </w:t>
+      </w:r>
+      <w:proofErr w:type="spellStart"/>
+      <w:r>
+        <w:t>estrutura</w:t>
+      </w:r>
+      <w:proofErr w:type="spellEnd"/>
+      <w:r>
+        <w:t xml:space="preserve"> temporal linear </w:t>
+      </w:r>
+      <w:proofErr w:type="spellStart"/>
+      <w:r>
+        <w:t>presente</w:t>
+      </w:r>
+      <w:proofErr w:type="spellEnd"/>
+      <w:r>
+        <w:t xml:space="preserve"> </w:t>
+      </w:r>
+      <w:proofErr w:type="spellStart"/>
+      <w:r>
+        <w:t>na</w:t>
+      </w:r>
+      <w:proofErr w:type="spellEnd"/>
+      <w:r>
+        <w:t xml:space="preserve"> </w:t>
+      </w:r>
+      <w:proofErr w:type="spellStart"/>
+      <w:r>
+        <w:t>série</w:t>
+      </w:r>
+      <w:proofErr w:type="spellEnd"/>
+      <w:r>
+        <w:t xml:space="preserve">, </w:t>
+      </w:r>
+      <w:proofErr w:type="spellStart"/>
+      <w:r>
+        <w:t>restando</w:t>
+      </w:r>
+      <w:proofErr w:type="spellEnd"/>
+      <w:r>
+        <w:t xml:space="preserve"> </w:t>
+      </w:r>
+      <w:proofErr w:type="spellStart"/>
+      <w:r>
+        <w:t>nos</w:t>
+      </w:r>
+      <w:proofErr w:type="spellEnd"/>
+      <w:r>
+        <w:t xml:space="preserve"> </w:t>
+      </w:r>
+      <w:proofErr w:type="spellStart"/>
+      <w:r>
+        <w:t>resíduos</w:t>
+      </w:r>
+      <w:proofErr w:type="spellEnd"/>
+      <w:r>
+        <w:t xml:space="preserve"> </w:t>
+      </w:r>
+      <w:proofErr w:type="spellStart"/>
+      <w:r>
+        <w:t>apenas</w:t>
+      </w:r>
+      <w:proofErr w:type="spellEnd"/>
+      <w:r>
+        <w:t xml:space="preserve"> </w:t>
+      </w:r>
+      <w:proofErr w:type="spellStart"/>
+      <w:r>
+        <w:t>variações</w:t>
+      </w:r>
+      <w:proofErr w:type="spellEnd"/>
+      <w:r>
+        <w:t xml:space="preserve"> </w:t>
+      </w:r>
+      <w:proofErr w:type="spellStart"/>
+      <w:r>
+        <w:t>aleatórias</w:t>
+      </w:r>
+      <w:proofErr w:type="spellEnd"/>
+      <w:r>
+        <w:t xml:space="preserve"> </w:t>
+      </w:r>
+      <w:proofErr w:type="spellStart"/>
+      <w:r>
+        <w:t>ou</w:t>
+      </w:r>
+      <w:proofErr w:type="spellEnd"/>
+      <w:r>
+        <w:t xml:space="preserve"> </w:t>
+      </w:r>
+      <w:proofErr w:type="spellStart"/>
+      <w:r>
+        <w:t>fatores</w:t>
+      </w:r>
+      <w:proofErr w:type="spellEnd"/>
+      <w:r>
+        <w:t xml:space="preserve"> </w:t>
+      </w:r>
+      <w:proofErr w:type="spellStart"/>
+      <w:r>
+        <w:t>externos</w:t>
+      </w:r>
+      <w:proofErr w:type="spellEnd"/>
+      <w:r>
+        <w:t xml:space="preserve"> </w:t>
+      </w:r>
+      <w:proofErr w:type="spellStart"/>
+      <w:r>
+        <w:t>não</w:t>
+      </w:r>
+      <w:proofErr w:type="spellEnd"/>
+      <w:r>
+        <w:t xml:space="preserve"> </w:t>
+      </w:r>
+      <w:proofErr w:type="spellStart"/>
+      <w:r>
+        <w:t>modelados</w:t>
+      </w:r>
+      <w:proofErr w:type="spellEnd"/>
+      <w:r>
+        <w:t xml:space="preserve">. Como a ACF dos </w:t>
+      </w:r>
+      <w:proofErr w:type="spellStart"/>
+      <w:r>
+        <w:t>resíduos</w:t>
+      </w:r>
+      <w:proofErr w:type="spellEnd"/>
+      <w:r>
+        <w:t xml:space="preserve"> </w:t>
+      </w:r>
+      <w:proofErr w:type="spellStart"/>
+      <w:r>
+        <w:t>não</w:t>
+      </w:r>
+      <w:proofErr w:type="spellEnd"/>
+      <w:r>
+        <w:t xml:space="preserve"> </w:t>
+      </w:r>
+      <w:proofErr w:type="spellStart"/>
+      <w:r>
+        <w:t>apresentou</w:t>
+      </w:r>
+      <w:proofErr w:type="spellEnd"/>
+      <w:r>
+        <w:t xml:space="preserve"> </w:t>
+      </w:r>
+      <w:proofErr w:type="spellStart"/>
+      <w:r>
+        <w:t>autocorrelações</w:t>
+      </w:r>
+      <w:proofErr w:type="spellEnd"/>
+      <w:r>
+        <w:t xml:space="preserve"> </w:t>
+      </w:r>
+      <w:proofErr w:type="spellStart"/>
+      <w:r>
+        <w:t>relevantes</w:t>
+      </w:r>
+      <w:proofErr w:type="spellEnd"/>
+      <w:r>
+        <w:t xml:space="preserve"> e o teste de Ljung-Box </w:t>
+      </w:r>
+      <w:proofErr w:type="spellStart"/>
+      <w:r>
+        <w:t>não</w:t>
+      </w:r>
+      <w:proofErr w:type="spellEnd"/>
+      <w:r>
+        <w:t xml:space="preserve"> </w:t>
+      </w:r>
+      <w:proofErr w:type="spellStart"/>
+      <w:r>
+        <w:t>indicou</w:t>
+      </w:r>
+      <w:proofErr w:type="spellEnd"/>
+      <w:r>
+        <w:t xml:space="preserve"> </w:t>
+      </w:r>
+      <w:proofErr w:type="spellStart"/>
+      <w:r>
+        <w:t>dependência</w:t>
+      </w:r>
+      <w:proofErr w:type="spellEnd"/>
+      <w:r>
+        <w:t xml:space="preserve"> serial </w:t>
+      </w:r>
+      <w:proofErr w:type="spellStart"/>
+      <w:r>
+        <w:t>significativa</w:t>
+      </w:r>
+      <w:proofErr w:type="spellEnd"/>
+      <w:r>
+        <w:t xml:space="preserve">, </w:t>
+      </w:r>
+      <w:proofErr w:type="spellStart"/>
+      <w:r>
+        <w:t>não</w:t>
+      </w:r>
+      <w:proofErr w:type="spellEnd"/>
+      <w:r>
+        <w:t xml:space="preserve"> </w:t>
+      </w:r>
+      <w:proofErr w:type="spellStart"/>
+      <w:r>
+        <w:t>há</w:t>
+      </w:r>
+      <w:proofErr w:type="spellEnd"/>
+      <w:r>
+        <w:t xml:space="preserve"> </w:t>
+      </w:r>
+      <w:proofErr w:type="spellStart"/>
+      <w:r>
+        <w:t>evidências</w:t>
+      </w:r>
+      <w:proofErr w:type="spellEnd"/>
+      <w:r>
+        <w:t xml:space="preserve"> fortes de </w:t>
+      </w:r>
+      <w:proofErr w:type="spellStart"/>
+      <w:r>
+        <w:t>que</w:t>
+      </w:r>
+      <w:proofErr w:type="spellEnd"/>
+      <w:r>
+        <w:t xml:space="preserve"> o </w:t>
+      </w:r>
+      <w:proofErr w:type="spellStart"/>
+      <w:r>
+        <w:t>modelo</w:t>
+      </w:r>
+      <w:proofErr w:type="spellEnd"/>
+      <w:r>
+        <w:t xml:space="preserve"> </w:t>
+      </w:r>
+      <w:proofErr w:type="spellStart"/>
+      <w:r>
+        <w:t>tenha</w:t>
+      </w:r>
+      <w:proofErr w:type="spellEnd"/>
+      <w:r>
+        <w:t xml:space="preserve"> </w:t>
+      </w:r>
+      <w:proofErr w:type="spellStart"/>
+      <w:r>
+        <w:t>deixado</w:t>
+      </w:r>
+      <w:proofErr w:type="spellEnd"/>
+      <w:r>
+        <w:t xml:space="preserve"> </w:t>
+      </w:r>
+      <w:proofErr w:type="spellStart"/>
+      <w:r>
+        <w:t>padrões</w:t>
+      </w:r>
+      <w:proofErr w:type="spellEnd"/>
+      <w:r>
+        <w:t xml:space="preserve"> </w:t>
+      </w:r>
+      <w:proofErr w:type="spellStart"/>
+      <w:r>
+        <w:t>temporais</w:t>
+      </w:r>
+      <w:proofErr w:type="spellEnd"/>
+      <w:r>
+        <w:t xml:space="preserve"> </w:t>
+      </w:r>
+      <w:proofErr w:type="spellStart"/>
+      <w:r>
+        <w:t>importantes</w:t>
+      </w:r>
+      <w:proofErr w:type="spellEnd"/>
+      <w:r>
+        <w:t xml:space="preserve"> </w:t>
+      </w:r>
+      <w:proofErr w:type="spellStart"/>
+      <w:r>
+        <w:t>sem</w:t>
+      </w:r>
+      <w:proofErr w:type="spellEnd"/>
+      <w:r>
+        <w:t xml:space="preserve"> </w:t>
+      </w:r>
+      <w:proofErr w:type="spellStart"/>
+      <w:r>
+        <w:t>capturar</w:t>
+      </w:r>
+      <w:proofErr w:type="spellEnd"/>
+      <w:r>
+        <w:t>.</w:t>
+      </w:r>
+    </w:p>
+    <w:p>
+      <w:pPr>
+        <w:jc w:val="both"/>
         <w:rPr>
           <w:lang w:val="pt-BR"/>
         </w:rPr>
       </w:pPr>
       <w:r>
-        <w:t>A aplicação do Teste de Ljung-Box sobre os resíduos para avaliar a presença de autocorrelação serial restante resultou em um p-value de 0,96 (para o Lag 20), estritamente superior ao limite de 0,05, falhando em rejeitar a hipótese nula de independência de erros e indicando que os resíduos formam, estatisticamente, um ruído branco válido. Sob a ótica pura dos dados, esse resultado revela que a estrutura do SARIMA obteve excelência matemática, capturando virtualmente toda a informação temporal linear endógena disponível.</w:t>
+        <w:t xml:space="preserve">Sob a </w:t>
+      </w:r>
+      <w:proofErr w:type="spellStart"/>
+      <w:r>
+        <w:t>ótica</w:t>
+      </w:r>
+      <w:proofErr w:type="spellEnd"/>
+      <w:r>
+        <w:t xml:space="preserve"> pura dos dados, esse resultado revela que </w:t>
+      </w:r>
+      <w:proofErr w:type="gramStart"/>
+      <w:r>
+        <w:t>a</w:t>
+      </w:r>
+      <w:proofErr w:type="gramEnd"/>
+      <w:r>
+        <w:t xml:space="preserve"> estrutura do SARIMA obteve excelência matemática, capturando virtualmente toda </w:t>
+      </w:r>
+      <w:proofErr w:type="gramStart"/>
+      <w:r>
+        <w:t>a</w:t>
+      </w:r>
+      <w:proofErr w:type="gramEnd"/>
+      <w:r>
+        <w:t xml:space="preserve"> informação temporal linear endógena disponível.</w:t>
       </w:r>
     </w:p>
     <w:p>
@@ -2503,6 +5060,7 @@
           <w:rFonts w:ascii="Arial" w:hAnsi="Arial"/>
           <w:lang w:val="pt-BR"/>
         </w:rPr>
+        <w:lastRenderedPageBreak/>
         <w:t>Conclusão Gerencial e Recomendações</w:t>
       </w:r>
       <w:bookmarkEnd w:id="10"/>
@@ -2518,19 +5076,290 @@
         <w:rPr>
           <w:lang w:val="pt-BR"/>
         </w:rPr>
-        <w:t xml:space="preserve">A modelagem preditiva avançada aplicada ao fluxo diário de tráfego na rodovia interestadual I-94 permitiu traçar diagnósticos e decisões cruciais para a concessionária rodoviária e para o planejamento de trânsito regional. O modelo </w:t>
-      </w:r>
-      <w:r>
-        <w:rPr>
-          <w:lang w:val="pt-BR"/>
-        </w:rPr>
-        <w:t>SARIMA</w:t>
-      </w:r>
-      <w:r>
-        <w:rPr>
-          <w:lang w:val="pt-BR"/>
-        </w:rPr>
-        <w:t xml:space="preserve"> otimizado via Grid Search associado à rotina de Rolling Forecast demonstrou superioridade incontestável.</w:t>
+        <w:t xml:space="preserve">A modelagem preditiva avançada aplicada ao fluxo diário de tráfego na rodovia interestadual I-94 permitiu traçar diagnósticos e decisões cruciais para a concessionária rodoviária e para o planejamento de trânsito regional. </w:t>
+      </w:r>
+      <w:r>
+        <w:t xml:space="preserve">O </w:t>
+      </w:r>
+      <w:proofErr w:type="spellStart"/>
+      <w:r>
+        <w:t>modelo</w:t>
+      </w:r>
+      <w:proofErr w:type="spellEnd"/>
+      <w:r>
+        <w:t xml:space="preserve"> SARIMA com Rolling Forecast </w:t>
+      </w:r>
+      <w:proofErr w:type="spellStart"/>
+      <w:r>
+        <w:t>demonstrou</w:t>
+      </w:r>
+      <w:proofErr w:type="spellEnd"/>
+      <w:r>
+        <w:t xml:space="preserve"> o </w:t>
+      </w:r>
+      <w:proofErr w:type="spellStart"/>
+      <w:r>
+        <w:t>melhor</w:t>
+      </w:r>
+      <w:proofErr w:type="spellEnd"/>
+      <w:r>
+        <w:t xml:space="preserve"> </w:t>
+      </w:r>
+      <w:proofErr w:type="spellStart"/>
+      <w:r>
+        <w:t>desempenho</w:t>
+      </w:r>
+      <w:proofErr w:type="spellEnd"/>
+      <w:r>
+        <w:t xml:space="preserve"> </w:t>
+      </w:r>
+      <w:proofErr w:type="spellStart"/>
+      <w:r>
+        <w:t>geral</w:t>
+      </w:r>
+      <w:proofErr w:type="spellEnd"/>
+      <w:r>
+        <w:t xml:space="preserve"> entre as </w:t>
+      </w:r>
+      <w:proofErr w:type="spellStart"/>
+      <w:r>
+        <w:t>abordagens</w:t>
+      </w:r>
+      <w:proofErr w:type="spellEnd"/>
+      <w:r>
+        <w:t xml:space="preserve"> </w:t>
+      </w:r>
+      <w:proofErr w:type="spellStart"/>
+      <w:r>
+        <w:t>avaliadas</w:t>
+      </w:r>
+      <w:proofErr w:type="spellEnd"/>
+      <w:r>
+        <w:t xml:space="preserve">, </w:t>
+      </w:r>
+      <w:proofErr w:type="spellStart"/>
+      <w:r>
+        <w:t>apresentando</w:t>
+      </w:r>
+      <w:proofErr w:type="spellEnd"/>
+      <w:r>
+        <w:t xml:space="preserve"> o </w:t>
+      </w:r>
+      <w:proofErr w:type="spellStart"/>
+      <w:r>
+        <w:t>menor</w:t>
+      </w:r>
+      <w:proofErr w:type="spellEnd"/>
+      <w:r>
+        <w:t xml:space="preserve"> MAE no conjunto de teste. </w:t>
+      </w:r>
+      <w:proofErr w:type="spellStart"/>
+      <w:r>
+        <w:t>Entretanto</w:t>
+      </w:r>
+      <w:proofErr w:type="spellEnd"/>
+      <w:r>
+        <w:t xml:space="preserve">, é </w:t>
+      </w:r>
+      <w:proofErr w:type="spellStart"/>
+      <w:r>
+        <w:t>importante</w:t>
+      </w:r>
+      <w:proofErr w:type="spellEnd"/>
+      <w:r>
+        <w:t xml:space="preserve"> </w:t>
+      </w:r>
+      <w:proofErr w:type="spellStart"/>
+      <w:r>
+        <w:t>destacar</w:t>
+      </w:r>
+      <w:proofErr w:type="spellEnd"/>
+      <w:r>
+        <w:t xml:space="preserve"> </w:t>
+      </w:r>
+      <w:proofErr w:type="spellStart"/>
+      <w:r>
+        <w:t>que</w:t>
+      </w:r>
+      <w:proofErr w:type="spellEnd"/>
+      <w:r>
+        <w:t xml:space="preserve"> </w:t>
+      </w:r>
+      <w:proofErr w:type="spellStart"/>
+      <w:r>
+        <w:t>o</w:t>
+      </w:r>
+      <w:proofErr w:type="spellEnd"/>
+      <w:r>
+        <w:t xml:space="preserve"> SARIMA </w:t>
+      </w:r>
+      <w:proofErr w:type="spellStart"/>
+      <w:r>
+        <w:t>em</w:t>
+      </w:r>
+      <w:proofErr w:type="spellEnd"/>
+      <w:r>
+        <w:t xml:space="preserve"> </w:t>
+      </w:r>
+      <w:proofErr w:type="spellStart"/>
+      <w:r>
+        <w:t>sua</w:t>
+      </w:r>
+      <w:proofErr w:type="spellEnd"/>
+      <w:r>
+        <w:t xml:space="preserve"> </w:t>
+      </w:r>
+      <w:proofErr w:type="spellStart"/>
+      <w:r>
+        <w:t>versão</w:t>
+      </w:r>
+      <w:proofErr w:type="spellEnd"/>
+      <w:r>
+        <w:t xml:space="preserve"> </w:t>
+      </w:r>
+      <w:proofErr w:type="spellStart"/>
+      <w:r>
+        <w:t>estática</w:t>
+      </w:r>
+      <w:proofErr w:type="spellEnd"/>
+      <w:r>
+        <w:t xml:space="preserve"> </w:t>
+      </w:r>
+      <w:proofErr w:type="spellStart"/>
+      <w:r>
+        <w:t>não</w:t>
+      </w:r>
+      <w:proofErr w:type="spellEnd"/>
+      <w:r>
+        <w:t xml:space="preserve"> </w:t>
+      </w:r>
+      <w:proofErr w:type="spellStart"/>
+      <w:r>
+        <w:t>superou</w:t>
+      </w:r>
+      <w:proofErr w:type="spellEnd"/>
+      <w:r>
+        <w:t xml:space="preserve"> </w:t>
+      </w:r>
+      <w:proofErr w:type="spellStart"/>
+      <w:r>
+        <w:t>todos</w:t>
+      </w:r>
+      <w:proofErr w:type="spellEnd"/>
+      <w:r>
+        <w:t xml:space="preserve"> </w:t>
+      </w:r>
+      <w:proofErr w:type="spellStart"/>
+      <w:r>
+        <w:t>os</w:t>
+      </w:r>
+      <w:proofErr w:type="spellEnd"/>
+      <w:r>
+        <w:t xml:space="preserve"> </w:t>
+      </w:r>
+      <w:proofErr w:type="spellStart"/>
+      <w:r>
+        <w:t>modelos</w:t>
+      </w:r>
+      <w:proofErr w:type="spellEnd"/>
+      <w:r>
+        <w:t xml:space="preserve"> simples, </w:t>
+      </w:r>
+      <w:proofErr w:type="spellStart"/>
+      <w:r>
+        <w:t>ficando</w:t>
+      </w:r>
+      <w:proofErr w:type="spellEnd"/>
+      <w:r>
+        <w:t xml:space="preserve"> atrás do Seasonal Naive. Dessa forma, a </w:t>
+      </w:r>
+      <w:proofErr w:type="spellStart"/>
+      <w:r>
+        <w:t>superioridade</w:t>
+      </w:r>
+      <w:proofErr w:type="spellEnd"/>
+      <w:r>
+        <w:t xml:space="preserve"> do SARIMA se </w:t>
+      </w:r>
+      <w:proofErr w:type="spellStart"/>
+      <w:r>
+        <w:t>confirmou</w:t>
+      </w:r>
+      <w:proofErr w:type="spellEnd"/>
+      <w:r>
+        <w:t xml:space="preserve"> </w:t>
+      </w:r>
+      <w:proofErr w:type="spellStart"/>
+      <w:r>
+        <w:t>principalmente</w:t>
+      </w:r>
+      <w:proofErr w:type="spellEnd"/>
+      <w:r>
+        <w:t xml:space="preserve"> </w:t>
+      </w:r>
+      <w:proofErr w:type="spellStart"/>
+      <w:r>
+        <w:t>quando</w:t>
+      </w:r>
+      <w:proofErr w:type="spellEnd"/>
+      <w:r>
+        <w:t xml:space="preserve"> </w:t>
+      </w:r>
+      <w:proofErr w:type="spellStart"/>
+      <w:r>
+        <w:t>aplicado</w:t>
+      </w:r>
+      <w:proofErr w:type="spellEnd"/>
+      <w:r>
+        <w:t xml:space="preserve"> </w:t>
+      </w:r>
+      <w:proofErr w:type="spellStart"/>
+      <w:r>
+        <w:t>em</w:t>
+      </w:r>
+      <w:proofErr w:type="spellEnd"/>
+      <w:r>
+        <w:t xml:space="preserve"> </w:t>
+      </w:r>
+      <w:proofErr w:type="spellStart"/>
+      <w:r>
+        <w:t>uma</w:t>
+      </w:r>
+      <w:proofErr w:type="spellEnd"/>
+      <w:r>
+        <w:t xml:space="preserve"> </w:t>
+      </w:r>
+      <w:proofErr w:type="spellStart"/>
+      <w:r>
+        <w:t>estratégia</w:t>
+      </w:r>
+      <w:proofErr w:type="spellEnd"/>
+      <w:r>
+        <w:t xml:space="preserve"> </w:t>
+      </w:r>
+      <w:proofErr w:type="spellStart"/>
+      <w:r>
+        <w:t>dinâmica</w:t>
+      </w:r>
+      <w:proofErr w:type="spellEnd"/>
+      <w:r>
+        <w:t xml:space="preserve"> de </w:t>
+      </w:r>
+      <w:proofErr w:type="spellStart"/>
+      <w:r>
+        <w:t>atualização</w:t>
+      </w:r>
+      <w:proofErr w:type="spellEnd"/>
+      <w:r>
+        <w:t xml:space="preserve"> </w:t>
+      </w:r>
+      <w:proofErr w:type="spellStart"/>
+      <w:r>
+        <w:t>contínua</w:t>
+      </w:r>
+      <w:proofErr w:type="spellEnd"/>
+      <w:r>
+        <w:t>.</w:t>
       </w:r>
     </w:p>
     <w:p>
@@ -2601,7 +5430,6 @@
         <w:rPr>
           <w:lang w:val="pt-BR"/>
         </w:rPr>
-        <w:lastRenderedPageBreak/>
         <w:t>Dimensionamento preventivo de frotas emergenciais (ambulâncias e reboques) com base no fluxo projetado para cada dia.</w:t>
       </w:r>
     </w:p>
@@ -2622,6 +5450,434 @@
           <w:lang w:val="pt-BR"/>
         </w:rPr>
         <w:t>Evolução futura do modelo para incorporar os chamados dados Exógenos (X), cruzando o calendário de chuvas e tempestades de neve de Minnesota ao modelo, absorvendo anomalias que o simples padrão do dia da semana não consegue explicar isoladamente.</w:t>
+      </w:r>
+    </w:p>
+    <w:p>
+      <w:pPr>
+        <w:pStyle w:val="PargrafodaLista"/>
+        <w:jc w:val="both"/>
+        <w:rPr>
+          <w:lang w:val="pt-BR"/>
+        </w:rPr>
+      </w:pPr>
+    </w:p>
+    <w:p>
+      <w:pPr>
+        <w:jc w:val="both"/>
+        <w:rPr>
+          <w:lang w:val="pt-BR"/>
+        </w:rPr>
+      </w:pPr>
+      <w:r>
+        <w:t xml:space="preserve">Como </w:t>
+      </w:r>
+      <w:proofErr w:type="spellStart"/>
+      <w:r>
+        <w:t>limitação</w:t>
+      </w:r>
+      <w:proofErr w:type="spellEnd"/>
+      <w:r>
+        <w:t xml:space="preserve">, o </w:t>
+      </w:r>
+      <w:proofErr w:type="spellStart"/>
+      <w:r>
+        <w:t>estudo</w:t>
+      </w:r>
+      <w:proofErr w:type="spellEnd"/>
+      <w:r>
+        <w:t xml:space="preserve"> </w:t>
+      </w:r>
+      <w:proofErr w:type="spellStart"/>
+      <w:r>
+        <w:t>utilizou</w:t>
+      </w:r>
+      <w:proofErr w:type="spellEnd"/>
+      <w:r>
+        <w:t xml:space="preserve"> </w:t>
+      </w:r>
+      <w:proofErr w:type="spellStart"/>
+      <w:r>
+        <w:t>uma</w:t>
+      </w:r>
+      <w:proofErr w:type="spellEnd"/>
+      <w:r>
+        <w:t xml:space="preserve"> </w:t>
+      </w:r>
+      <w:proofErr w:type="spellStart"/>
+      <w:r>
+        <w:t>abordagem</w:t>
+      </w:r>
+      <w:proofErr w:type="spellEnd"/>
+      <w:r>
+        <w:t xml:space="preserve"> </w:t>
+      </w:r>
+      <w:proofErr w:type="spellStart"/>
+      <w:r>
+        <w:t>univariada</w:t>
+      </w:r>
+      <w:proofErr w:type="spellEnd"/>
+      <w:r>
+        <w:t xml:space="preserve">, </w:t>
+      </w:r>
+      <w:proofErr w:type="spellStart"/>
+      <w:r>
+        <w:t>baseada</w:t>
+      </w:r>
+      <w:proofErr w:type="spellEnd"/>
+      <w:r>
+        <w:t xml:space="preserve"> </w:t>
+      </w:r>
+      <w:proofErr w:type="spellStart"/>
+      <w:r>
+        <w:t>apenas</w:t>
+      </w:r>
+      <w:proofErr w:type="spellEnd"/>
+      <w:r>
+        <w:t xml:space="preserve"> no histórico do </w:t>
+      </w:r>
+      <w:proofErr w:type="spellStart"/>
+      <w:r>
+        <w:t>próprio</w:t>
+      </w:r>
+      <w:proofErr w:type="spellEnd"/>
+      <w:r>
+        <w:t xml:space="preserve"> </w:t>
+      </w:r>
+      <w:proofErr w:type="spellStart"/>
+      <w:r>
+        <w:t>tráfego</w:t>
+      </w:r>
+      <w:proofErr w:type="spellEnd"/>
+      <w:r>
+        <w:t xml:space="preserve">. </w:t>
+      </w:r>
+      <w:proofErr w:type="spellStart"/>
+      <w:r>
+        <w:t>Embora</w:t>
+      </w:r>
+      <w:proofErr w:type="spellEnd"/>
+      <w:r>
+        <w:t xml:space="preserve"> </w:t>
+      </w:r>
+      <w:proofErr w:type="spellStart"/>
+      <w:r>
+        <w:t>isso</w:t>
+      </w:r>
+      <w:proofErr w:type="spellEnd"/>
+      <w:r>
+        <w:t xml:space="preserve"> </w:t>
+      </w:r>
+      <w:proofErr w:type="spellStart"/>
+      <w:r>
+        <w:t>tenha</w:t>
+      </w:r>
+      <w:proofErr w:type="spellEnd"/>
+      <w:r>
+        <w:t xml:space="preserve"> </w:t>
+      </w:r>
+      <w:proofErr w:type="spellStart"/>
+      <w:r>
+        <w:t>permitido</w:t>
+      </w:r>
+      <w:proofErr w:type="spellEnd"/>
+      <w:r>
+        <w:t xml:space="preserve"> </w:t>
+      </w:r>
+      <w:proofErr w:type="spellStart"/>
+      <w:r>
+        <w:t>capturar</w:t>
+      </w:r>
+      <w:proofErr w:type="spellEnd"/>
+      <w:r>
+        <w:t xml:space="preserve"> </w:t>
+      </w:r>
+      <w:proofErr w:type="spellStart"/>
+      <w:r>
+        <w:t>padrões</w:t>
+      </w:r>
+      <w:proofErr w:type="spellEnd"/>
+      <w:r>
+        <w:t xml:space="preserve"> </w:t>
+      </w:r>
+      <w:proofErr w:type="spellStart"/>
+      <w:r>
+        <w:t>temporais</w:t>
+      </w:r>
+      <w:proofErr w:type="spellEnd"/>
+      <w:r>
+        <w:t xml:space="preserve"> </w:t>
+      </w:r>
+      <w:proofErr w:type="spellStart"/>
+      <w:r>
+        <w:t>relevantes</w:t>
+      </w:r>
+      <w:proofErr w:type="spellEnd"/>
+      <w:r>
+        <w:t xml:space="preserve">, </w:t>
+      </w:r>
+      <w:proofErr w:type="spellStart"/>
+      <w:r>
+        <w:t>fatores</w:t>
+      </w:r>
+      <w:proofErr w:type="spellEnd"/>
+      <w:r>
+        <w:t xml:space="preserve"> </w:t>
+      </w:r>
+      <w:proofErr w:type="spellStart"/>
+      <w:r>
+        <w:t>externos</w:t>
+      </w:r>
+      <w:proofErr w:type="spellEnd"/>
+      <w:r>
+        <w:t xml:space="preserve"> </w:t>
+      </w:r>
+      <w:proofErr w:type="spellStart"/>
+      <w:r>
+        <w:t>como</w:t>
+      </w:r>
+      <w:proofErr w:type="spellEnd"/>
+      <w:r>
+        <w:t xml:space="preserve"> </w:t>
+      </w:r>
+      <w:proofErr w:type="spellStart"/>
+      <w:r>
+        <w:t>acidentes</w:t>
+      </w:r>
+      <w:proofErr w:type="spellEnd"/>
+      <w:r>
+        <w:t xml:space="preserve">, </w:t>
+      </w:r>
+      <w:proofErr w:type="spellStart"/>
+      <w:r>
+        <w:t>interdições</w:t>
+      </w:r>
+      <w:proofErr w:type="spellEnd"/>
+      <w:r>
+        <w:t xml:space="preserve">, </w:t>
+      </w:r>
+      <w:proofErr w:type="spellStart"/>
+      <w:r>
+        <w:t>feriados</w:t>
+      </w:r>
+      <w:proofErr w:type="spellEnd"/>
+      <w:r>
+        <w:t xml:space="preserve">, </w:t>
+      </w:r>
+      <w:proofErr w:type="spellStart"/>
+      <w:r>
+        <w:t>eventos</w:t>
+      </w:r>
+      <w:proofErr w:type="spellEnd"/>
+      <w:r>
+        <w:t xml:space="preserve"> </w:t>
+      </w:r>
+      <w:proofErr w:type="spellStart"/>
+      <w:r>
+        <w:t>climáticos</w:t>
+      </w:r>
+      <w:proofErr w:type="spellEnd"/>
+      <w:r>
+        <w:t xml:space="preserve"> </w:t>
+      </w:r>
+      <w:proofErr w:type="spellStart"/>
+      <w:r>
+        <w:t>severos</w:t>
+      </w:r>
+      <w:proofErr w:type="spellEnd"/>
+      <w:r>
+        <w:t xml:space="preserve"> e </w:t>
+      </w:r>
+      <w:proofErr w:type="spellStart"/>
+      <w:r>
+        <w:t>mudanças</w:t>
+      </w:r>
+      <w:proofErr w:type="spellEnd"/>
+      <w:r>
+        <w:t xml:space="preserve"> </w:t>
+      </w:r>
+      <w:proofErr w:type="spellStart"/>
+      <w:r>
+        <w:t>operacionais</w:t>
+      </w:r>
+      <w:proofErr w:type="spellEnd"/>
+      <w:r>
+        <w:t xml:space="preserve"> da </w:t>
+      </w:r>
+      <w:proofErr w:type="spellStart"/>
+      <w:r>
+        <w:t>rodovia</w:t>
+      </w:r>
+      <w:proofErr w:type="spellEnd"/>
+      <w:r>
+        <w:t xml:space="preserve"> </w:t>
+      </w:r>
+      <w:proofErr w:type="spellStart"/>
+      <w:r>
+        <w:t>não</w:t>
+      </w:r>
+      <w:proofErr w:type="spellEnd"/>
+      <w:r>
+        <w:t xml:space="preserve"> </w:t>
+      </w:r>
+      <w:proofErr w:type="spellStart"/>
+      <w:r>
+        <w:t>foram</w:t>
+      </w:r>
+      <w:proofErr w:type="spellEnd"/>
+      <w:r>
+        <w:t xml:space="preserve"> </w:t>
+      </w:r>
+      <w:proofErr w:type="spellStart"/>
+      <w:r>
+        <w:t>incorporados</w:t>
+      </w:r>
+      <w:proofErr w:type="spellEnd"/>
+      <w:r>
+        <w:t xml:space="preserve"> </w:t>
+      </w:r>
+      <w:proofErr w:type="spellStart"/>
+      <w:r>
+        <w:t>diretamente</w:t>
+      </w:r>
+      <w:proofErr w:type="spellEnd"/>
+      <w:r>
+        <w:t xml:space="preserve"> </w:t>
+      </w:r>
+      <w:proofErr w:type="spellStart"/>
+      <w:r>
+        <w:t>ao</w:t>
+      </w:r>
+      <w:proofErr w:type="spellEnd"/>
+      <w:r>
+        <w:t xml:space="preserve"> </w:t>
+      </w:r>
+      <w:proofErr w:type="spellStart"/>
+      <w:r>
+        <w:t>modelo</w:t>
+      </w:r>
+      <w:proofErr w:type="spellEnd"/>
+      <w:r>
+        <w:t xml:space="preserve">. Para </w:t>
+      </w:r>
+      <w:proofErr w:type="spellStart"/>
+      <w:r>
+        <w:t>trabalhos</w:t>
+      </w:r>
+      <w:proofErr w:type="spellEnd"/>
+      <w:r>
+        <w:t xml:space="preserve"> </w:t>
+      </w:r>
+      <w:proofErr w:type="spellStart"/>
+      <w:r>
+        <w:t>futuros</w:t>
+      </w:r>
+      <w:proofErr w:type="spellEnd"/>
+      <w:r>
+        <w:t xml:space="preserve">, </w:t>
+      </w:r>
+      <w:proofErr w:type="spellStart"/>
+      <w:r>
+        <w:t>recomenda</w:t>
+      </w:r>
+      <w:proofErr w:type="spellEnd"/>
+      <w:r>
+        <w:t xml:space="preserve">-se </w:t>
+      </w:r>
+      <w:proofErr w:type="spellStart"/>
+      <w:r>
+        <w:t>testar</w:t>
+      </w:r>
+      <w:proofErr w:type="spellEnd"/>
+      <w:r>
+        <w:t xml:space="preserve"> </w:t>
+      </w:r>
+      <w:proofErr w:type="spellStart"/>
+      <w:r>
+        <w:t>modelos</w:t>
+      </w:r>
+      <w:proofErr w:type="spellEnd"/>
+      <w:r>
+        <w:t xml:space="preserve"> com </w:t>
+      </w:r>
+      <w:proofErr w:type="spellStart"/>
+      <w:r>
+        <w:t>variáveis</w:t>
+      </w:r>
+      <w:proofErr w:type="spellEnd"/>
+      <w:r>
+        <w:t xml:space="preserve"> </w:t>
+      </w:r>
+      <w:proofErr w:type="spellStart"/>
+      <w:r>
+        <w:t>exógenas</w:t>
+      </w:r>
+      <w:proofErr w:type="spellEnd"/>
+      <w:r>
+        <w:t xml:space="preserve">, </w:t>
+      </w:r>
+      <w:proofErr w:type="spellStart"/>
+      <w:r>
+        <w:t>como</w:t>
+      </w:r>
+      <w:proofErr w:type="spellEnd"/>
+      <w:r>
+        <w:t xml:space="preserve"> o SARIMAX, </w:t>
+      </w:r>
+      <w:proofErr w:type="spellStart"/>
+      <w:r>
+        <w:t>incluindo</w:t>
+      </w:r>
+      <w:proofErr w:type="spellEnd"/>
+      <w:r>
+        <w:t xml:space="preserve"> </w:t>
+      </w:r>
+      <w:proofErr w:type="spellStart"/>
+      <w:r>
+        <w:t>informações</w:t>
+      </w:r>
+      <w:proofErr w:type="spellEnd"/>
+      <w:r>
+        <w:t xml:space="preserve"> de </w:t>
+      </w:r>
+      <w:proofErr w:type="spellStart"/>
+      <w:r>
+        <w:t>clima</w:t>
+      </w:r>
+      <w:proofErr w:type="spellEnd"/>
+      <w:r>
+        <w:t xml:space="preserve">, </w:t>
+      </w:r>
+      <w:proofErr w:type="spellStart"/>
+      <w:r>
+        <w:t>calendário</w:t>
+      </w:r>
+      <w:proofErr w:type="spellEnd"/>
+      <w:r>
+        <w:t xml:space="preserve">, </w:t>
+      </w:r>
+      <w:proofErr w:type="spellStart"/>
+      <w:r>
+        <w:t>feriados</w:t>
+      </w:r>
+      <w:proofErr w:type="spellEnd"/>
+      <w:r>
+        <w:t xml:space="preserve"> e </w:t>
+      </w:r>
+      <w:proofErr w:type="spellStart"/>
+      <w:r>
+        <w:t>eventos</w:t>
+      </w:r>
+      <w:proofErr w:type="spellEnd"/>
+      <w:r>
+        <w:t xml:space="preserve"> </w:t>
+      </w:r>
+      <w:proofErr w:type="spellStart"/>
+      <w:r>
+        <w:t>especiais</w:t>
+      </w:r>
+      <w:proofErr w:type="spellEnd"/>
+      <w:r>
+        <w:t>.</w:t>
       </w:r>
     </w:p>
     <w:sectPr>
@@ -3533,7 +6789,6 @@
   <w:style w:type="character" w:default="1" w:styleId="Fontepargpadro">
     <w:name w:val="Default Paragraph Font"/>
     <w:uiPriority w:val="1"/>
-    <w:semiHidden/>
     <w:unhideWhenUsed/>
   </w:style>
   <w:style w:type="table" w:default="1" w:styleId="Tabelanormal">

</xml_diff>

<commit_message>
docs: update executive summary report for sarima-model
</commit_message>
<xml_diff>
--- a/RelatorioGerencial.docx
+++ b/RelatorioGerencial.docx
@@ -175,6 +175,13 @@
           <w:lang w:val="pt-BR"/>
         </w:rPr>
         <w:br/>
+      </w:r>
+      <w:r>
+        <w:rPr>
+          <w:b/>
+          <w:sz w:val="28"/>
+          <w:lang w:val="pt-BR"/>
+        </w:rPr>
         <w:t>Modelagem Preditiva e Análise de Séries Temporais para Previsão de Tráfego Rodoviário na Rodovia I-94</w:t>
       </w:r>
     </w:p>
@@ -249,11 +256,12 @@
           <w:r>
             <w:fldChar w:fldCharType="separate"/>
           </w:r>
-          <w:hyperlink w:anchor="_Toc230464588" w:history="1">
+          <w:hyperlink w:anchor="_Toc230468950" w:history="1">
             <w:r>
               <w:rPr>
                 <w:rStyle w:val="Hyperlink"/>
                 <w:noProof/>
+                <w:lang w:val="pt-BR"/>
               </w:rPr>
               <w:t>Introdução</w:t>
             </w:r>
@@ -276,7 +284,7 @@
                 <w:noProof/>
                 <w:webHidden/>
               </w:rPr>
-              <w:instrText xml:space="preserve"> PAGEREF _Toc230464588 \h </w:instrText>
+              <w:instrText xml:space="preserve"> PAGEREF _Toc230468950 \h </w:instrText>
             </w:r>
             <w:r>
               <w:rPr>
@@ -322,7 +330,7 @@
               <w14:ligatures w14:val="standardContextual"/>
             </w:rPr>
           </w:pPr>
-          <w:hyperlink w:anchor="_Toc230464589" w:history="1">
+          <w:hyperlink w:anchor="_Toc230468951" w:history="1">
             <w:r>
               <w:rPr>
                 <w:rStyle w:val="Hyperlink"/>
@@ -350,7 +358,7 @@
                 <w:noProof/>
                 <w:webHidden/>
               </w:rPr>
-              <w:instrText xml:space="preserve"> PAGEREF _Toc230464589 \h </w:instrText>
+              <w:instrText xml:space="preserve"> PAGEREF _Toc230468951 \h </w:instrText>
             </w:r>
             <w:r>
               <w:rPr>
@@ -396,7 +404,7 @@
               <w14:ligatures w14:val="standardContextual"/>
             </w:rPr>
           </w:pPr>
-          <w:hyperlink w:anchor="_Toc230464590" w:history="1">
+          <w:hyperlink w:anchor="_Toc230468952" w:history="1">
             <w:r>
               <w:rPr>
                 <w:rStyle w:val="Hyperlink"/>
@@ -424,7 +432,7 @@
                 <w:noProof/>
                 <w:webHidden/>
               </w:rPr>
-              <w:instrText xml:space="preserve"> PAGEREF _Toc230464590 \h </w:instrText>
+              <w:instrText xml:space="preserve"> PAGEREF _Toc230468952 \h </w:instrText>
             </w:r>
             <w:r>
               <w:rPr>
@@ -470,7 +478,7 @@
               <w14:ligatures w14:val="standardContextual"/>
             </w:rPr>
           </w:pPr>
-          <w:hyperlink w:anchor="_Toc230464591" w:history="1">
+          <w:hyperlink w:anchor="_Toc230468953" w:history="1">
             <w:r>
               <w:rPr>
                 <w:rStyle w:val="Hyperlink"/>
@@ -498,7 +506,7 @@
                 <w:noProof/>
                 <w:webHidden/>
               </w:rPr>
-              <w:instrText xml:space="preserve"> PAGEREF _Toc230464591 \h </w:instrText>
+              <w:instrText xml:space="preserve"> PAGEREF _Toc230468953 \h </w:instrText>
             </w:r>
             <w:r>
               <w:rPr>
@@ -544,7 +552,7 @@
               <w14:ligatures w14:val="standardContextual"/>
             </w:rPr>
           </w:pPr>
-          <w:hyperlink w:anchor="_Toc230464592" w:history="1">
+          <w:hyperlink w:anchor="_Toc230468954" w:history="1">
             <w:r>
               <w:rPr>
                 <w:rStyle w:val="Hyperlink"/>
@@ -572,7 +580,7 @@
                 <w:noProof/>
                 <w:webHidden/>
               </w:rPr>
-              <w:instrText xml:space="preserve"> PAGEREF _Toc230464592 \h </w:instrText>
+              <w:instrText xml:space="preserve"> PAGEREF _Toc230468954 \h </w:instrText>
             </w:r>
             <w:r>
               <w:rPr>
@@ -618,7 +626,7 @@
               <w14:ligatures w14:val="standardContextual"/>
             </w:rPr>
           </w:pPr>
-          <w:hyperlink w:anchor="_Toc230464593" w:history="1">
+          <w:hyperlink w:anchor="_Toc230468955" w:history="1">
             <w:r>
               <w:rPr>
                 <w:rStyle w:val="Hyperlink"/>
@@ -646,7 +654,7 @@
                 <w:noProof/>
                 <w:webHidden/>
               </w:rPr>
-              <w:instrText xml:space="preserve"> PAGEREF _Toc230464593 \h </w:instrText>
+              <w:instrText xml:space="preserve"> PAGEREF _Toc230468955 \h </w:instrText>
             </w:r>
             <w:r>
               <w:rPr>
@@ -692,7 +700,7 @@
               <w14:ligatures w14:val="standardContextual"/>
             </w:rPr>
           </w:pPr>
-          <w:hyperlink w:anchor="_Toc230464594" w:history="1">
+          <w:hyperlink w:anchor="_Toc230468956" w:history="1">
             <w:r>
               <w:rPr>
                 <w:rStyle w:val="Hyperlink"/>
@@ -720,81 +728,7 @@
                 <w:noProof/>
                 <w:webHidden/>
               </w:rPr>
-              <w:instrText xml:space="preserve"> PAGEREF _Toc230464594 \h </w:instrText>
-            </w:r>
-            <w:r>
-              <w:rPr>
-                <w:noProof/>
-                <w:webHidden/>
-              </w:rPr>
-            </w:r>
-            <w:r>
-              <w:rPr>
-                <w:noProof/>
-                <w:webHidden/>
-              </w:rPr>
-              <w:fldChar w:fldCharType="separate"/>
-            </w:r>
-            <w:r>
-              <w:rPr>
-                <w:noProof/>
-                <w:webHidden/>
-              </w:rPr>
-              <w:t>6</w:t>
-            </w:r>
-            <w:r>
-              <w:rPr>
-                <w:noProof/>
-                <w:webHidden/>
-              </w:rPr>
-              <w:fldChar w:fldCharType="end"/>
-            </w:r>
-          </w:hyperlink>
-        </w:p>
-        <w:p>
-          <w:pPr>
-            <w:pStyle w:val="Sumrio2"/>
-            <w:tabs>
-              <w:tab w:val="right" w:leader="dot" w:pos="8630"/>
-            </w:tabs>
-            <w:rPr>
-              <w:rFonts w:asciiTheme="minorHAnsi" w:hAnsiTheme="minorHAnsi"/>
-              <w:noProof/>
-              <w:kern w:val="2"/>
-              <w:szCs w:val="24"/>
-              <w:lang w:val="pt-BR" w:eastAsia="pt-BR"/>
-              <w14:ligatures w14:val="standardContextual"/>
-            </w:rPr>
-          </w:pPr>
-          <w:hyperlink w:anchor="_Toc230464595" w:history="1">
-            <w:r>
-              <w:rPr>
-                <w:rStyle w:val="Hyperlink"/>
-                <w:noProof/>
-                <w:lang w:val="pt-BR"/>
-              </w:rPr>
-              <w:t>Comparação com Base Models</w:t>
-            </w:r>
-            <w:r>
-              <w:rPr>
-                <w:noProof/>
-                <w:webHidden/>
-              </w:rPr>
-              <w:tab/>
-            </w:r>
-            <w:r>
-              <w:rPr>
-                <w:noProof/>
-                <w:webHidden/>
-              </w:rPr>
-              <w:fldChar w:fldCharType="begin"/>
-            </w:r>
-            <w:r>
-              <w:rPr>
-                <w:noProof/>
-                <w:webHidden/>
-              </w:rPr>
-              <w:instrText xml:space="preserve"> PAGEREF _Toc230464595 \h </w:instrText>
+              <w:instrText xml:space="preserve"> PAGEREF _Toc230468956 \h </w:instrText>
             </w:r>
             <w:r>
               <w:rPr>
@@ -840,14 +774,14 @@
               <w14:ligatures w14:val="standardContextual"/>
             </w:rPr>
           </w:pPr>
-          <w:hyperlink w:anchor="_Toc230464596" w:history="1">
+          <w:hyperlink w:anchor="_Toc230468957" w:history="1">
             <w:r>
               <w:rPr>
                 <w:rStyle w:val="Hyperlink"/>
                 <w:noProof/>
                 <w:lang w:val="pt-BR"/>
               </w:rPr>
-              <w:t>Rolling Forecast</w:t>
+              <w:t>Comparação com Base Models</w:t>
             </w:r>
             <w:r>
               <w:rPr>
@@ -868,7 +802,7 @@
                 <w:noProof/>
                 <w:webHidden/>
               </w:rPr>
-              <w:instrText xml:space="preserve"> PAGEREF _Toc230464596 \h </w:instrText>
+              <w:instrText xml:space="preserve"> PAGEREF _Toc230468957 \h </w:instrText>
             </w:r>
             <w:r>
               <w:rPr>
@@ -914,14 +848,14 @@
               <w14:ligatures w14:val="standardContextual"/>
             </w:rPr>
           </w:pPr>
-          <w:hyperlink w:anchor="_Toc230464597" w:history="1">
+          <w:hyperlink w:anchor="_Toc230468958" w:history="1">
             <w:r>
               <w:rPr>
                 <w:rStyle w:val="Hyperlink"/>
                 <w:noProof/>
                 <w:lang w:val="pt-BR"/>
               </w:rPr>
-              <w:t>Análise de Diagnóstico dos Resíduos</w:t>
+              <w:t>Rolling Forecast</w:t>
             </w:r>
             <w:r>
               <w:rPr>
@@ -942,81 +876,7 @@
                 <w:noProof/>
                 <w:webHidden/>
               </w:rPr>
-              <w:instrText xml:space="preserve"> PAGEREF _Toc230464597 \h </w:instrText>
-            </w:r>
-            <w:r>
-              <w:rPr>
-                <w:noProof/>
-                <w:webHidden/>
-              </w:rPr>
-            </w:r>
-            <w:r>
-              <w:rPr>
-                <w:noProof/>
-                <w:webHidden/>
-              </w:rPr>
-              <w:fldChar w:fldCharType="separate"/>
-            </w:r>
-            <w:r>
-              <w:rPr>
-                <w:noProof/>
-                <w:webHidden/>
-              </w:rPr>
-              <w:t>8</w:t>
-            </w:r>
-            <w:r>
-              <w:rPr>
-                <w:noProof/>
-                <w:webHidden/>
-              </w:rPr>
-              <w:fldChar w:fldCharType="end"/>
-            </w:r>
-          </w:hyperlink>
-        </w:p>
-        <w:p>
-          <w:pPr>
-            <w:pStyle w:val="Sumrio1"/>
-            <w:tabs>
-              <w:tab w:val="right" w:leader="dot" w:pos="8630"/>
-            </w:tabs>
-            <w:rPr>
-              <w:rFonts w:asciiTheme="minorHAnsi" w:hAnsiTheme="minorHAnsi"/>
-              <w:noProof/>
-              <w:kern w:val="2"/>
-              <w:szCs w:val="24"/>
-              <w:lang w:val="pt-BR" w:eastAsia="pt-BR"/>
-              <w14:ligatures w14:val="standardContextual"/>
-            </w:rPr>
-          </w:pPr>
-          <w:hyperlink w:anchor="_Toc230464598" w:history="1">
-            <w:r>
-              <w:rPr>
-                <w:rStyle w:val="Hyperlink"/>
-                <w:noProof/>
-                <w:lang w:val="pt-BR"/>
-              </w:rPr>
-              <w:t>Conclusão Gerencial e Recomendações</w:t>
-            </w:r>
-            <w:r>
-              <w:rPr>
-                <w:noProof/>
-                <w:webHidden/>
-              </w:rPr>
-              <w:tab/>
-            </w:r>
-            <w:r>
-              <w:rPr>
-                <w:noProof/>
-                <w:webHidden/>
-              </w:rPr>
-              <w:fldChar w:fldCharType="begin"/>
-            </w:r>
-            <w:r>
-              <w:rPr>
-                <w:noProof/>
-                <w:webHidden/>
-              </w:rPr>
-              <w:instrText xml:space="preserve"> PAGEREF _Toc230464598 \h </w:instrText>
+              <w:instrText xml:space="preserve"> PAGEREF _Toc230468958 \h </w:instrText>
             </w:r>
             <w:r>
               <w:rPr>
@@ -1048,6 +908,154 @@
           </w:hyperlink>
         </w:p>
         <w:p>
+          <w:pPr>
+            <w:pStyle w:val="Sumrio2"/>
+            <w:tabs>
+              <w:tab w:val="right" w:leader="dot" w:pos="8630"/>
+            </w:tabs>
+            <w:rPr>
+              <w:rFonts w:asciiTheme="minorHAnsi" w:hAnsiTheme="minorHAnsi"/>
+              <w:noProof/>
+              <w:kern w:val="2"/>
+              <w:szCs w:val="24"/>
+              <w:lang w:val="pt-BR" w:eastAsia="pt-BR"/>
+              <w14:ligatures w14:val="standardContextual"/>
+            </w:rPr>
+          </w:pPr>
+          <w:hyperlink w:anchor="_Toc230468959" w:history="1">
+            <w:r>
+              <w:rPr>
+                <w:rStyle w:val="Hyperlink"/>
+                <w:noProof/>
+                <w:lang w:val="pt-BR"/>
+              </w:rPr>
+              <w:t>Análise de Diagnóstico dos Resíduos</w:t>
+            </w:r>
+            <w:r>
+              <w:rPr>
+                <w:noProof/>
+                <w:webHidden/>
+              </w:rPr>
+              <w:tab/>
+            </w:r>
+            <w:r>
+              <w:rPr>
+                <w:noProof/>
+                <w:webHidden/>
+              </w:rPr>
+              <w:fldChar w:fldCharType="begin"/>
+            </w:r>
+            <w:r>
+              <w:rPr>
+                <w:noProof/>
+                <w:webHidden/>
+              </w:rPr>
+              <w:instrText xml:space="preserve"> PAGEREF _Toc230468959 \h </w:instrText>
+            </w:r>
+            <w:r>
+              <w:rPr>
+                <w:noProof/>
+                <w:webHidden/>
+              </w:rPr>
+            </w:r>
+            <w:r>
+              <w:rPr>
+                <w:noProof/>
+                <w:webHidden/>
+              </w:rPr>
+              <w:fldChar w:fldCharType="separate"/>
+            </w:r>
+            <w:r>
+              <w:rPr>
+                <w:noProof/>
+                <w:webHidden/>
+              </w:rPr>
+              <w:t>10</w:t>
+            </w:r>
+            <w:r>
+              <w:rPr>
+                <w:noProof/>
+                <w:webHidden/>
+              </w:rPr>
+              <w:fldChar w:fldCharType="end"/>
+            </w:r>
+          </w:hyperlink>
+        </w:p>
+        <w:p>
+          <w:pPr>
+            <w:pStyle w:val="Sumrio1"/>
+            <w:tabs>
+              <w:tab w:val="right" w:leader="dot" w:pos="8630"/>
+            </w:tabs>
+            <w:rPr>
+              <w:rFonts w:asciiTheme="minorHAnsi" w:hAnsiTheme="minorHAnsi"/>
+              <w:noProof/>
+              <w:kern w:val="2"/>
+              <w:szCs w:val="24"/>
+              <w:lang w:val="pt-BR" w:eastAsia="pt-BR"/>
+              <w14:ligatures w14:val="standardContextual"/>
+            </w:rPr>
+          </w:pPr>
+          <w:hyperlink w:anchor="_Toc230468960" w:history="1">
+            <w:r>
+              <w:rPr>
+                <w:rStyle w:val="Hyperlink"/>
+                <w:noProof/>
+                <w:lang w:val="pt-BR"/>
+              </w:rPr>
+              <w:t>Conclusão Gerencial e Recomendações</w:t>
+            </w:r>
+            <w:r>
+              <w:rPr>
+                <w:noProof/>
+                <w:webHidden/>
+              </w:rPr>
+              <w:tab/>
+            </w:r>
+            <w:r>
+              <w:rPr>
+                <w:noProof/>
+                <w:webHidden/>
+              </w:rPr>
+              <w:fldChar w:fldCharType="begin"/>
+            </w:r>
+            <w:r>
+              <w:rPr>
+                <w:noProof/>
+                <w:webHidden/>
+              </w:rPr>
+              <w:instrText xml:space="preserve"> PAGEREF _Toc230468960 \h </w:instrText>
+            </w:r>
+            <w:r>
+              <w:rPr>
+                <w:noProof/>
+                <w:webHidden/>
+              </w:rPr>
+            </w:r>
+            <w:r>
+              <w:rPr>
+                <w:noProof/>
+                <w:webHidden/>
+              </w:rPr>
+              <w:fldChar w:fldCharType="separate"/>
+            </w:r>
+            <w:r>
+              <w:rPr>
+                <w:noProof/>
+                <w:webHidden/>
+              </w:rPr>
+              <w:t>11</w:t>
+            </w:r>
+            <w:r>
+              <w:rPr>
+                <w:noProof/>
+                <w:webHidden/>
+              </w:rPr>
+              <w:fldChar w:fldCharType="end"/>
+            </w:r>
+          </w:hyperlink>
+        </w:p>
+        <w:p>
           <w:r>
             <w:rPr>
               <w:b/>
@@ -1083,18 +1091,20 @@
     <w:p>
       <w:pPr>
         <w:pStyle w:val="Ttulo1"/>
+        <w:rPr>
+          <w:lang w:val="pt-BR"/>
+        </w:rPr>
       </w:pPr>
-      <w:bookmarkStart w:id="0" w:name="_Toc230464588"/>
-      <w:proofErr w:type="spellStart"/>
+      <w:bookmarkStart w:id="0" w:name="_Toc230468950"/>
       <w:r>
         <w:rPr>
           <w:rFonts w:ascii="Arial" w:hAnsi="Arial"/>
+          <w:lang w:val="pt-BR"/>
         </w:rPr>
         <w:lastRenderedPageBreak/>
         <w:t>Introdução</w:t>
       </w:r>
       <w:bookmarkEnd w:id="0"/>
-      <w:proofErr w:type="spellEnd"/>
     </w:p>
     <w:p>
       <w:pPr>
@@ -1107,7 +1117,13 @@
         <w:rPr>
           <w:lang w:val="pt-BR"/>
         </w:rPr>
-        <w:t>No planejamento urbano moderno e no desenvolvimento de Sistemas de Transporte Inteligentes (ITS), a modelagem preditiva do volume de tráfego de veículos desempenha um papel de extrema relevância. A estimativa acurada do fluxo em vias expressas constitui um insumo crítico para mitigar congestionamentos, otimizar a logística de distribuição, reduzir a emissão de poluentes e programar de forma racional obras civis e interdições de faixas. No entanto, os fluxos rodoviários são marcados por oscilações complexas decorrentes da rotina humana e de fatores climáticos que inviabilizam o uso de técnicas de regressão linear tradicionais.</w:t>
+        <w:t xml:space="preserve">No planejamento urbano moderno e no desenvolvimento de Sistemas de Transporte Inteligentes (ITS), a modelagem preditiva do volume de tráfego de veículos desempenha um papel de extrema relevância. A estimativa acurada do fluxo em vias expressas constitui um insumo crítico para mitigar congestionamentos, otimizar a logística de distribuição, reduzir a emissão de poluentes e programar de forma racional obras civis e interdições de faixas. No entanto, os fluxos rodoviários são marcados por oscilações complexas </w:t>
+      </w:r>
+      <w:r>
+        <w:rPr>
+          <w:lang w:val="pt-BR"/>
+        </w:rPr>
+        <w:t>decorrentes da rotina humana e de fatores climáticos que inviabilizam o uso de técnicas de regressão linear tradicionais.</w:t>
       </w:r>
     </w:p>
     <w:p>
@@ -1157,7 +1173,7 @@
           <w:lang w:val="pt-BR"/>
         </w:rPr>
       </w:pPr>
-      <w:bookmarkStart w:id="1" w:name="_Toc230464589"/>
+      <w:bookmarkStart w:id="1" w:name="_Toc230468951"/>
       <w:r>
         <w:rPr>
           <w:rFonts w:ascii="Arial" w:hAnsi="Arial"/>
@@ -1234,7 +1250,13 @@
         <w:rPr>
           <w:lang w:val="pt-BR"/>
         </w:rPr>
-        <w:t>), posicionada de maneira estratégica no ponto médio entre as cidades de Minneapolis e St. Paul. O conjunto bruto abrange 48.204 registros de tráfego horário, coletados continuamente de 2 de outubro de 2012 às 09:00:00 até 30 de setembro de 2018 às 23:00:00.</w:t>
+        <w:t xml:space="preserve">), posicionada de maneira estratégica no ponto médio entre as cidades de Minneapolis e St. Paul. O conjunto bruto abrange 48.204 registros de tráfego horário, coletados continuamente de 2 de outubro de 2012 às 09:00:00 até </w:t>
+      </w:r>
+      <w:r>
+        <w:rPr>
+          <w:lang w:val="pt-BR"/>
+        </w:rPr>
+        <w:t>30 de setembro de 2018 às 23:00:00.</w:t>
       </w:r>
     </w:p>
     <w:p>
@@ -1356,239 +1378,10 @@
         <w:t xml:space="preserve">) com exatamente 2.190 observações diárias. </w:t>
       </w:r>
       <w:r>
-        <w:t xml:space="preserve">A </w:t>
-      </w:r>
-      <w:proofErr w:type="spellStart"/>
-      <w:r>
-        <w:t>variável</w:t>
-      </w:r>
-      <w:proofErr w:type="spellEnd"/>
-      <w:r>
-        <w:t xml:space="preserve"> </w:t>
-      </w:r>
-      <w:proofErr w:type="spellStart"/>
-      <w:r>
-        <w:t>analisada</w:t>
-      </w:r>
-      <w:proofErr w:type="spellEnd"/>
-      <w:r>
-        <w:t xml:space="preserve"> </w:t>
-      </w:r>
-      <w:proofErr w:type="spellStart"/>
-      <w:r>
-        <w:t>corresponde</w:t>
-      </w:r>
-      <w:proofErr w:type="spellEnd"/>
-      <w:r>
-        <w:t xml:space="preserve"> à </w:t>
-      </w:r>
-      <w:proofErr w:type="spellStart"/>
-      <w:r>
-        <w:t>média</w:t>
-      </w:r>
-      <w:proofErr w:type="spellEnd"/>
-      <w:r>
-        <w:t xml:space="preserve"> </w:t>
-      </w:r>
-      <w:proofErr w:type="spellStart"/>
-      <w:r>
-        <w:t>diária</w:t>
-      </w:r>
-      <w:proofErr w:type="spellEnd"/>
-      <w:r>
-        <w:t xml:space="preserve"> do volume de </w:t>
-      </w:r>
-      <w:proofErr w:type="spellStart"/>
-      <w:r>
-        <w:t>tráfego</w:t>
-      </w:r>
-      <w:proofErr w:type="spellEnd"/>
-      <w:r>
-        <w:t xml:space="preserve"> </w:t>
-      </w:r>
-      <w:proofErr w:type="spellStart"/>
-      <w:r>
-        <w:t>registrado</w:t>
-      </w:r>
-      <w:proofErr w:type="spellEnd"/>
-      <w:r>
-        <w:t xml:space="preserve"> </w:t>
-      </w:r>
-      <w:proofErr w:type="spellStart"/>
-      <w:r>
-        <w:t>na</w:t>
-      </w:r>
-      <w:proofErr w:type="spellEnd"/>
-      <w:r>
-        <w:t xml:space="preserve"> </w:t>
-      </w:r>
-      <w:proofErr w:type="spellStart"/>
-      <w:r>
-        <w:t>rodovia</w:t>
-      </w:r>
-      <w:proofErr w:type="spellEnd"/>
-      <w:r>
-        <w:t xml:space="preserve"> I-94, </w:t>
-      </w:r>
-      <w:proofErr w:type="spellStart"/>
-      <w:r>
-        <w:t>obtida</w:t>
-      </w:r>
-      <w:proofErr w:type="spellEnd"/>
-      <w:r>
-        <w:t xml:space="preserve"> a </w:t>
-      </w:r>
-      <w:proofErr w:type="spellStart"/>
-      <w:r>
-        <w:t>partir</w:t>
-      </w:r>
-      <w:proofErr w:type="spellEnd"/>
-      <w:r>
-        <w:t xml:space="preserve"> da </w:t>
-      </w:r>
-      <w:proofErr w:type="spellStart"/>
-      <w:r>
-        <w:t>agregação</w:t>
-      </w:r>
-      <w:proofErr w:type="spellEnd"/>
-      <w:r>
-        <w:t xml:space="preserve"> dos </w:t>
-      </w:r>
-      <w:proofErr w:type="spellStart"/>
-      <w:r>
-        <w:t>registros</w:t>
-      </w:r>
-      <w:proofErr w:type="spellEnd"/>
-      <w:r>
-        <w:t xml:space="preserve"> </w:t>
-      </w:r>
-      <w:proofErr w:type="spellStart"/>
-      <w:r>
-        <w:t>horários</w:t>
-      </w:r>
-      <w:proofErr w:type="spellEnd"/>
-      <w:r>
-        <w:t xml:space="preserve"> </w:t>
-      </w:r>
-      <w:proofErr w:type="spellStart"/>
-      <w:r>
-        <w:t>originais</w:t>
-      </w:r>
-      <w:proofErr w:type="spellEnd"/>
-      <w:r>
-        <w:t xml:space="preserve">. Dessa forma, a </w:t>
-      </w:r>
-      <w:proofErr w:type="spellStart"/>
-      <w:r>
-        <w:t>série</w:t>
-      </w:r>
-      <w:proofErr w:type="spellEnd"/>
-      <w:r>
-        <w:t xml:space="preserve"> final </w:t>
-      </w:r>
-      <w:proofErr w:type="spellStart"/>
-      <w:r>
-        <w:t>representa</w:t>
-      </w:r>
-      <w:proofErr w:type="spellEnd"/>
-      <w:r>
-        <w:t xml:space="preserve"> o </w:t>
-      </w:r>
-      <w:proofErr w:type="spellStart"/>
-      <w:r>
-        <w:t>comportamento</w:t>
-      </w:r>
-      <w:proofErr w:type="spellEnd"/>
-      <w:r>
-        <w:t xml:space="preserve"> </w:t>
-      </w:r>
-      <w:proofErr w:type="spellStart"/>
-      <w:r>
-        <w:t>médio</w:t>
-      </w:r>
-      <w:proofErr w:type="spellEnd"/>
-      <w:r>
-        <w:t xml:space="preserve"> </w:t>
-      </w:r>
-      <w:proofErr w:type="spellStart"/>
-      <w:r>
-        <w:t>diário</w:t>
-      </w:r>
-      <w:proofErr w:type="spellEnd"/>
-      <w:r>
-        <w:t xml:space="preserve"> do </w:t>
-      </w:r>
-      <w:proofErr w:type="spellStart"/>
-      <w:r>
-        <w:t>fluxo</w:t>
-      </w:r>
-      <w:proofErr w:type="spellEnd"/>
-      <w:r>
-        <w:t xml:space="preserve"> de </w:t>
-      </w:r>
-      <w:proofErr w:type="spellStart"/>
-      <w:r>
-        <w:t>veículos</w:t>
-      </w:r>
-      <w:proofErr w:type="spellEnd"/>
-      <w:r>
-        <w:t xml:space="preserve">, </w:t>
-      </w:r>
-      <w:proofErr w:type="spellStart"/>
-      <w:r>
-        <w:t>permitindo</w:t>
-      </w:r>
-      <w:proofErr w:type="spellEnd"/>
-      <w:r>
-        <w:t xml:space="preserve"> </w:t>
-      </w:r>
-      <w:proofErr w:type="spellStart"/>
-      <w:r>
-        <w:t>uma</w:t>
-      </w:r>
-      <w:proofErr w:type="spellEnd"/>
-      <w:r>
-        <w:t xml:space="preserve"> </w:t>
-      </w:r>
-      <w:proofErr w:type="spellStart"/>
-      <w:r>
-        <w:t>análise</w:t>
-      </w:r>
-      <w:proofErr w:type="spellEnd"/>
-      <w:r>
-        <w:t xml:space="preserve"> temporal </w:t>
-      </w:r>
-      <w:proofErr w:type="spellStart"/>
-      <w:r>
-        <w:t>mais</w:t>
-      </w:r>
-      <w:proofErr w:type="spellEnd"/>
-      <w:r>
-        <w:t xml:space="preserve"> </w:t>
-      </w:r>
-      <w:proofErr w:type="spellStart"/>
-      <w:r>
-        <w:t>estável</w:t>
-      </w:r>
-      <w:proofErr w:type="spellEnd"/>
-      <w:r>
-        <w:t xml:space="preserve"> e </w:t>
-      </w:r>
-      <w:proofErr w:type="spellStart"/>
-      <w:r>
-        <w:t>adequada</w:t>
-      </w:r>
-      <w:proofErr w:type="spellEnd"/>
-      <w:r>
-        <w:t xml:space="preserve"> à </w:t>
-      </w:r>
-      <w:proofErr w:type="spellStart"/>
-      <w:r>
-        <w:t>modelagem</w:t>
-      </w:r>
-      <w:proofErr w:type="spellEnd"/>
-      <w:r>
-        <w:t xml:space="preserve"> SARIMA.</w:t>
+        <w:rPr>
+          <w:lang w:val="pt-BR"/>
+        </w:rPr>
+        <w:t>A variável analisada corresponde à média diária do volume de tráfego registrado na rodovia I-94, obtida a partir da agregação dos registros horários originais. Dessa forma, a série final representa o comportamento médio diário do fluxo de veículos, permitindo uma análise temporal mais estável e adequada à modelagem SARIMA.</w:t>
       </w:r>
     </w:p>
     <w:tbl>
@@ -1752,7 +1545,7 @@
           <w:lang w:val="pt-BR"/>
         </w:rPr>
       </w:pPr>
-      <w:bookmarkStart w:id="2" w:name="_Toc230464590"/>
+      <w:bookmarkStart w:id="2" w:name="_Toc230468952"/>
       <w:r>
         <w:rPr>
           <w:lang w:val="pt-BR"/>
@@ -1774,7 +1567,7 @@
           <w:lang w:val="pt-BR"/>
         </w:rPr>
       </w:pPr>
-      <w:bookmarkStart w:id="3" w:name="_Toc230464591"/>
+      <w:bookmarkStart w:id="3" w:name="_Toc230468953"/>
       <w:r>
         <w:rPr>
           <w:lang w:val="pt-BR"/>
@@ -1794,7 +1587,13 @@
         <w:rPr>
           <w:lang w:val="pt-BR"/>
         </w:rPr>
-        <w:t>A análise visual da série temporal revela características fundamentais que orientam a abordagem de modelagem. Diferente de séries de consumo de energia ou dados de faturamento que apresentam tendências de crescimento de caráter exponencial ou infinito, o tráfego na rodovia interestadual I-94 comporta-se como um sistema limitado, que oscila ao redor de um teto de saturação física definido pela capacidade máxima de escoamento de veículos da malha rodoviária. A média histórica de longo prazo permanece estável ao longo dos anos, indicando a inexistência de uma tendência determinística acentuada de crescimento.</w:t>
+        <w:t xml:space="preserve">A análise visual da série temporal revela características fundamentais que orientam a abordagem de modelagem. Diferente de séries de consumo de energia ou dados de faturamento que apresentam tendências de crescimento de caráter exponencial ou infinito, o tráfego na rodovia interestadual I-94 comporta-se como um sistema limitado, que oscila ao redor de um teto de saturação física definido pela capacidade máxima de escoamento de veículos da malha rodoviária. A média histórica de longo prazo permanece estável </w:t>
+      </w:r>
+      <w:r>
+        <w:rPr>
+          <w:lang w:val="pt-BR"/>
+        </w:rPr>
+        <w:t>ao longo dos anos, indicando a inexistência de uma tendência determinística acentuada de crescimento.</w:t>
       </w:r>
     </w:p>
     <w:p>
@@ -1828,7 +1627,13 @@
         <w:rPr>
           <w:lang w:val="pt-BR"/>
         </w:rPr>
-        <w:t>Adicionalmente, a série exibe vales profundos isolados que rompem a estabilidade do ciclo sazonal. Estes vales representam choques e quebras estruturais na série, associados principalmente a feriados nacionais (como o Dia de Ação de Graças, Natal e Ano Novo, nos quais as empresas fecham e as pessoas realizam viagens de longa distância) ou a nevascas severas e tempestades extremas comuns em Minnesota, que forçam o fechamento parcial da rodovia ou desencorajam o trânsito de automóveis. Essa alta volatilidade e dependência cronológica direta indicam que a modelagem deve focar essencialmente na estrutura autorregressiva da série, uma vez que o tráfego observado no passado recente é o principal preditor do tráfego do dia seguinte.</w:t>
+        <w:t xml:space="preserve">Adicionalmente, a série exibe vales profundos isolados que rompem a estabilidade do ciclo sazonal. Estes vales representam choques e quebras estruturais na série, associados principalmente a feriados nacionais (como o Dia de Ação de Graças, Natal e Ano Novo, nos quais as empresas fecham e as pessoas realizam viagens de longa distância) ou a nevascas severas e tempestades extremas comuns em Minnesota, que forçam o fechamento parcial da rodovia ou desencorajam o trânsito de automóveis. Essa alta volatilidade </w:t>
+      </w:r>
+      <w:r>
+        <w:rPr>
+          <w:lang w:val="pt-BR"/>
+        </w:rPr>
+        <w:t>e dependência cronológica direta indicam que a modelagem deve focar essencialmente na estrutura autorregressiva da série, uma vez que o tráfego observado no passado recente é o principal preditor do tráfego do dia seguinte.</w:t>
       </w:r>
     </w:p>
     <w:p>
@@ -1838,7 +1643,7 @@
           <w:lang w:val="pt-BR"/>
         </w:rPr>
       </w:pPr>
-      <w:bookmarkStart w:id="4" w:name="_Toc230464592"/>
+      <w:bookmarkStart w:id="4" w:name="_Toc230468954"/>
       <w:r>
         <w:rPr>
           <w:lang w:val="pt-BR"/>
@@ -1875,495 +1680,10 @@
         <w:t xml:space="preserve">) com período definido de m=7 dias. </w:t>
       </w:r>
       <w:r>
-        <w:t xml:space="preserve">Essa </w:t>
-      </w:r>
-      <w:proofErr w:type="spellStart"/>
-      <w:r>
-        <w:t>decomposição</w:t>
-      </w:r>
-      <w:proofErr w:type="spellEnd"/>
-      <w:r>
-        <w:t xml:space="preserve"> </w:t>
-      </w:r>
-      <w:proofErr w:type="spellStart"/>
-      <w:r>
-        <w:t>foi</w:t>
-      </w:r>
-      <w:proofErr w:type="spellEnd"/>
-      <w:r>
-        <w:t xml:space="preserve"> </w:t>
-      </w:r>
-      <w:proofErr w:type="spellStart"/>
-      <w:r>
-        <w:t>importante</w:t>
-      </w:r>
-      <w:proofErr w:type="spellEnd"/>
-      <w:r>
-        <w:t xml:space="preserve"> </w:t>
-      </w:r>
-      <w:proofErr w:type="spellStart"/>
-      <w:r>
-        <w:t>porque</w:t>
-      </w:r>
-      <w:proofErr w:type="spellEnd"/>
-      <w:r>
-        <w:t xml:space="preserve"> </w:t>
-      </w:r>
-      <w:proofErr w:type="spellStart"/>
-      <w:r>
-        <w:t>permitiu</w:t>
-      </w:r>
-      <w:proofErr w:type="spellEnd"/>
-      <w:r>
-        <w:t xml:space="preserve"> </w:t>
-      </w:r>
-      <w:proofErr w:type="spellStart"/>
-      <w:r>
-        <w:t>separar</w:t>
-      </w:r>
-      <w:proofErr w:type="spellEnd"/>
-      <w:r>
-        <w:t xml:space="preserve"> o </w:t>
-      </w:r>
-      <w:proofErr w:type="spellStart"/>
-      <w:r>
-        <w:t>comportamento</w:t>
-      </w:r>
-      <w:proofErr w:type="spellEnd"/>
-      <w:r>
-        <w:t xml:space="preserve"> </w:t>
-      </w:r>
-      <w:proofErr w:type="spellStart"/>
-      <w:r>
-        <w:t>observado</w:t>
-      </w:r>
-      <w:proofErr w:type="spellEnd"/>
-      <w:r>
-        <w:t xml:space="preserve"> </w:t>
-      </w:r>
-      <w:proofErr w:type="spellStart"/>
-      <w:r>
-        <w:t>em</w:t>
-      </w:r>
-      <w:proofErr w:type="spellEnd"/>
-      <w:r>
-        <w:t xml:space="preserve"> partes </w:t>
-      </w:r>
-      <w:proofErr w:type="spellStart"/>
-      <w:r>
-        <w:t>interpretáveis</w:t>
-      </w:r>
-      <w:proofErr w:type="spellEnd"/>
-      <w:r>
-        <w:t xml:space="preserve">. A </w:t>
-      </w:r>
-      <w:proofErr w:type="spellStart"/>
-      <w:r>
-        <w:t>tendência</w:t>
-      </w:r>
-      <w:proofErr w:type="spellEnd"/>
-      <w:r>
-        <w:t xml:space="preserve"> </w:t>
-      </w:r>
-      <w:proofErr w:type="spellStart"/>
-      <w:r>
-        <w:t>mostrou</w:t>
-      </w:r>
-      <w:proofErr w:type="spellEnd"/>
-      <w:r>
-        <w:t xml:space="preserve"> </w:t>
-      </w:r>
-      <w:proofErr w:type="spellStart"/>
-      <w:r>
-        <w:t>que</w:t>
-      </w:r>
-      <w:proofErr w:type="spellEnd"/>
-      <w:r>
-        <w:t xml:space="preserve"> </w:t>
-      </w:r>
-      <w:proofErr w:type="spellStart"/>
-      <w:r>
-        <w:t>o</w:t>
-      </w:r>
-      <w:proofErr w:type="spellEnd"/>
-      <w:r>
-        <w:t xml:space="preserve"> </w:t>
-      </w:r>
-      <w:proofErr w:type="spellStart"/>
-      <w:r>
-        <w:t>tráfego</w:t>
-      </w:r>
-      <w:proofErr w:type="spellEnd"/>
-      <w:r>
-        <w:t xml:space="preserve"> </w:t>
-      </w:r>
-      <w:proofErr w:type="spellStart"/>
-      <w:r>
-        <w:t>não</w:t>
-      </w:r>
-      <w:proofErr w:type="spellEnd"/>
-      <w:r>
-        <w:t xml:space="preserve"> </w:t>
-      </w:r>
-      <w:proofErr w:type="spellStart"/>
-      <w:r>
-        <w:t>apresentou</w:t>
-      </w:r>
-      <w:proofErr w:type="spellEnd"/>
-      <w:r>
-        <w:t xml:space="preserve"> </w:t>
-      </w:r>
-      <w:proofErr w:type="spellStart"/>
-      <w:r>
-        <w:t>crescimento</w:t>
-      </w:r>
-      <w:proofErr w:type="spellEnd"/>
-      <w:r>
-        <w:t xml:space="preserve"> </w:t>
-      </w:r>
-      <w:proofErr w:type="spellStart"/>
-      <w:r>
-        <w:t>contínuo</w:t>
-      </w:r>
-      <w:proofErr w:type="spellEnd"/>
-      <w:r>
-        <w:t xml:space="preserve"> de </w:t>
-      </w:r>
-      <w:proofErr w:type="spellStart"/>
-      <w:r>
-        <w:t>longo</w:t>
-      </w:r>
-      <w:proofErr w:type="spellEnd"/>
-      <w:r>
-        <w:t xml:space="preserve"> </w:t>
-      </w:r>
-      <w:proofErr w:type="spellStart"/>
-      <w:r>
-        <w:t>prazo</w:t>
-      </w:r>
-      <w:proofErr w:type="spellEnd"/>
-      <w:r>
-        <w:t xml:space="preserve">, </w:t>
-      </w:r>
-      <w:proofErr w:type="spellStart"/>
-      <w:r>
-        <w:t>mantendo</w:t>
-      </w:r>
-      <w:proofErr w:type="spellEnd"/>
-      <w:r>
-        <w:t xml:space="preserve">-se </w:t>
-      </w:r>
-      <w:proofErr w:type="spellStart"/>
-      <w:r>
-        <w:t>relativamente</w:t>
-      </w:r>
-      <w:proofErr w:type="spellEnd"/>
-      <w:r>
-        <w:t xml:space="preserve"> </w:t>
-      </w:r>
-      <w:proofErr w:type="spellStart"/>
-      <w:r>
-        <w:t>estável</w:t>
-      </w:r>
-      <w:proofErr w:type="spellEnd"/>
-      <w:r>
-        <w:t xml:space="preserve"> </w:t>
-      </w:r>
-      <w:proofErr w:type="spellStart"/>
-      <w:r>
-        <w:t>ao</w:t>
-      </w:r>
-      <w:proofErr w:type="spellEnd"/>
-      <w:r>
-        <w:t xml:space="preserve"> </w:t>
-      </w:r>
-      <w:proofErr w:type="spellStart"/>
-      <w:r>
-        <w:t>longo</w:t>
-      </w:r>
-      <w:proofErr w:type="spellEnd"/>
-      <w:r>
-        <w:t xml:space="preserve"> do </w:t>
-      </w:r>
-      <w:proofErr w:type="spellStart"/>
-      <w:r>
-        <w:t>período</w:t>
-      </w:r>
-      <w:proofErr w:type="spellEnd"/>
-      <w:r>
-        <w:t xml:space="preserve">. </w:t>
-      </w:r>
-      <w:proofErr w:type="spellStart"/>
-      <w:r>
-        <w:t>Já</w:t>
-      </w:r>
-      <w:proofErr w:type="spellEnd"/>
-      <w:r>
-        <w:t xml:space="preserve"> o </w:t>
-      </w:r>
-      <w:proofErr w:type="spellStart"/>
-      <w:r>
-        <w:t>componente</w:t>
-      </w:r>
-      <w:proofErr w:type="spellEnd"/>
-      <w:r>
-        <w:t xml:space="preserve"> </w:t>
-      </w:r>
-      <w:proofErr w:type="spellStart"/>
-      <w:r>
-        <w:t>sazonal</w:t>
-      </w:r>
-      <w:proofErr w:type="spellEnd"/>
-      <w:r>
-        <w:t xml:space="preserve"> </w:t>
-      </w:r>
-      <w:proofErr w:type="spellStart"/>
-      <w:r>
-        <w:t>evidenciou</w:t>
-      </w:r>
-      <w:proofErr w:type="spellEnd"/>
-      <w:r>
-        <w:t xml:space="preserve"> a </w:t>
-      </w:r>
-      <w:proofErr w:type="spellStart"/>
-      <w:r>
-        <w:t>repetição</w:t>
-      </w:r>
-      <w:proofErr w:type="spellEnd"/>
-      <w:r>
-        <w:t xml:space="preserve"> de </w:t>
-      </w:r>
-      <w:proofErr w:type="spellStart"/>
-      <w:r>
-        <w:t>padrões</w:t>
-      </w:r>
-      <w:proofErr w:type="spellEnd"/>
-      <w:r>
-        <w:t xml:space="preserve"> </w:t>
-      </w:r>
-      <w:proofErr w:type="spellStart"/>
-      <w:r>
-        <w:t>ligados</w:t>
-      </w:r>
-      <w:proofErr w:type="spellEnd"/>
-      <w:r>
-        <w:t xml:space="preserve"> </w:t>
-      </w:r>
-      <w:proofErr w:type="spellStart"/>
-      <w:r>
-        <w:t>aos</w:t>
-      </w:r>
-      <w:proofErr w:type="spellEnd"/>
-      <w:r>
-        <w:t xml:space="preserve"> </w:t>
-      </w:r>
-      <w:proofErr w:type="spellStart"/>
-      <w:r>
-        <w:t>dias</w:t>
-      </w:r>
-      <w:proofErr w:type="spellEnd"/>
-      <w:r>
-        <w:t xml:space="preserve"> da </w:t>
-      </w:r>
-      <w:proofErr w:type="spellStart"/>
-      <w:r>
-        <w:t>semana</w:t>
-      </w:r>
-      <w:proofErr w:type="spellEnd"/>
-      <w:r>
-        <w:t xml:space="preserve">, </w:t>
-      </w:r>
-      <w:proofErr w:type="spellStart"/>
-      <w:r>
-        <w:t>especialmente</w:t>
-      </w:r>
-      <w:proofErr w:type="spellEnd"/>
-      <w:r>
-        <w:t xml:space="preserve"> a </w:t>
-      </w:r>
-      <w:proofErr w:type="spellStart"/>
-      <w:r>
-        <w:t>queda</w:t>
-      </w:r>
-      <w:proofErr w:type="spellEnd"/>
-      <w:r>
-        <w:t xml:space="preserve"> do </w:t>
-      </w:r>
-      <w:proofErr w:type="spellStart"/>
-      <w:r>
-        <w:t>fluxo</w:t>
-      </w:r>
-      <w:proofErr w:type="spellEnd"/>
-      <w:r>
-        <w:t xml:space="preserve"> </w:t>
-      </w:r>
-      <w:proofErr w:type="spellStart"/>
-      <w:r>
-        <w:t>aos</w:t>
-      </w:r>
-      <w:proofErr w:type="spellEnd"/>
-      <w:r>
-        <w:t xml:space="preserve"> </w:t>
-      </w:r>
-      <w:proofErr w:type="spellStart"/>
-      <w:r>
-        <w:t>sábados</w:t>
-      </w:r>
-      <w:proofErr w:type="spellEnd"/>
-      <w:r>
-        <w:t xml:space="preserve"> e </w:t>
-      </w:r>
-      <w:proofErr w:type="spellStart"/>
-      <w:r>
-        <w:t>domingos</w:t>
-      </w:r>
-      <w:proofErr w:type="spellEnd"/>
-      <w:r>
-        <w:t xml:space="preserve">. Por </w:t>
-      </w:r>
-      <w:proofErr w:type="spellStart"/>
-      <w:r>
-        <w:t>fim</w:t>
-      </w:r>
-      <w:proofErr w:type="spellEnd"/>
-      <w:r>
-        <w:t xml:space="preserve">, </w:t>
-      </w:r>
-      <w:proofErr w:type="spellStart"/>
-      <w:r>
-        <w:t>os</w:t>
-      </w:r>
-      <w:proofErr w:type="spellEnd"/>
-      <w:r>
-        <w:t xml:space="preserve"> </w:t>
-      </w:r>
-      <w:proofErr w:type="spellStart"/>
-      <w:r>
-        <w:t>resíduos</w:t>
-      </w:r>
-      <w:proofErr w:type="spellEnd"/>
-      <w:r>
-        <w:t xml:space="preserve"> </w:t>
-      </w:r>
-      <w:proofErr w:type="spellStart"/>
-      <w:r>
-        <w:t>concentraram</w:t>
-      </w:r>
-      <w:proofErr w:type="spellEnd"/>
-      <w:r>
-        <w:t xml:space="preserve"> as </w:t>
-      </w:r>
-      <w:proofErr w:type="spellStart"/>
-      <w:r>
-        <w:t>oscilações</w:t>
-      </w:r>
-      <w:proofErr w:type="spellEnd"/>
-      <w:r>
-        <w:t xml:space="preserve"> </w:t>
-      </w:r>
-      <w:proofErr w:type="spellStart"/>
-      <w:r>
-        <w:t>não</w:t>
-      </w:r>
-      <w:proofErr w:type="spellEnd"/>
-      <w:r>
-        <w:t xml:space="preserve"> </w:t>
-      </w:r>
-      <w:proofErr w:type="spellStart"/>
-      <w:r>
-        <w:t>explicadas</w:t>
-      </w:r>
-      <w:proofErr w:type="spellEnd"/>
-      <w:r>
-        <w:t xml:space="preserve"> pela </w:t>
-      </w:r>
-      <w:proofErr w:type="spellStart"/>
-      <w:r>
-        <w:t>tendência</w:t>
-      </w:r>
-      <w:proofErr w:type="spellEnd"/>
-      <w:r>
-        <w:t xml:space="preserve"> e pela </w:t>
-      </w:r>
-      <w:proofErr w:type="spellStart"/>
-      <w:r>
-        <w:t>sazonalidade</w:t>
-      </w:r>
-      <w:proofErr w:type="spellEnd"/>
-      <w:r>
-        <w:t xml:space="preserve">, </w:t>
-      </w:r>
-      <w:proofErr w:type="spellStart"/>
-      <w:r>
-        <w:t>como</w:t>
-      </w:r>
-      <w:proofErr w:type="spellEnd"/>
-      <w:r>
-        <w:t xml:space="preserve"> </w:t>
-      </w:r>
-      <w:proofErr w:type="spellStart"/>
-      <w:r>
-        <w:t>possíveis</w:t>
-      </w:r>
-      <w:proofErr w:type="spellEnd"/>
-      <w:r>
-        <w:t xml:space="preserve"> </w:t>
-      </w:r>
-      <w:proofErr w:type="spellStart"/>
-      <w:r>
-        <w:t>efeitos</w:t>
-      </w:r>
-      <w:proofErr w:type="spellEnd"/>
-      <w:r>
-        <w:t xml:space="preserve"> de </w:t>
-      </w:r>
-      <w:proofErr w:type="spellStart"/>
-      <w:r>
-        <w:t>feriados</w:t>
-      </w:r>
-      <w:proofErr w:type="spellEnd"/>
-      <w:r>
-        <w:t xml:space="preserve">, </w:t>
-      </w:r>
-      <w:proofErr w:type="spellStart"/>
-      <w:r>
-        <w:t>clima</w:t>
-      </w:r>
-      <w:proofErr w:type="spellEnd"/>
-      <w:r>
-        <w:t xml:space="preserve"> </w:t>
-      </w:r>
-      <w:proofErr w:type="spellStart"/>
-      <w:r>
-        <w:t>severo</w:t>
-      </w:r>
-      <w:proofErr w:type="spellEnd"/>
-      <w:r>
-        <w:t xml:space="preserve"> </w:t>
-      </w:r>
-      <w:proofErr w:type="spellStart"/>
-      <w:r>
-        <w:t>ou</w:t>
-      </w:r>
-      <w:proofErr w:type="spellEnd"/>
-      <w:r>
-        <w:t xml:space="preserve"> </w:t>
-      </w:r>
-      <w:proofErr w:type="spellStart"/>
-      <w:r>
-        <w:t>eventos</w:t>
-      </w:r>
-      <w:proofErr w:type="spellEnd"/>
-      <w:r>
-        <w:t xml:space="preserve"> </w:t>
-      </w:r>
-      <w:proofErr w:type="spellStart"/>
-      <w:r>
-        <w:t>atípicos</w:t>
-      </w:r>
-      <w:proofErr w:type="spellEnd"/>
-      <w:r>
-        <w:t>.</w:t>
+        <w:rPr>
+          <w:lang w:val="pt-BR"/>
+        </w:rPr>
+        <w:t>Essa decomposição foi importante porque permitiu separar o comportamento observado em partes interpretáveis. A tendência mostrou que o tráfego não apresentou crescimento contínuo de longo prazo, mantendo-se relativamente estável ao longo do período. Já o componente sazonal evidenciou a repetição de padrões ligados aos dias da semana, especialmente a queda do fluxo aos sábados e domingos. Por fim, os resíduos concentraram as oscilações não explicadas pela tendência e pela sazonalidade, como possíveis efeitos de feriados, clima severo ou eventos atípicos.</w:t>
       </w:r>
       <w:r>
         <w:rPr>
@@ -2426,7 +1746,13 @@
         <w:rPr>
           <w:lang w:val="pt-BR"/>
         </w:rPr>
-        <w:t>A força da sazonalidade semanal (F_S) foi calculada com base na variância do componente residual e do componente sazonal resultantes da decomposição STL. O cálculo numérico no ambiente Python retornou um valor de F_S ≈ 0,88, o que indica uma presença de sazonalidade semanal extremamente forte e estrutural. Na ciência de séries temporais, uma força sazonal superior a 0,60 indica que o padrão periódico desempenha um papel determinante na geração dos dados, justificando tecnicamente a escolha de um modelo sazonal robusto como o SARIMA para capturar a dependência cíclica de período.</w:t>
+        <w:t>A força da sazonalidade semanal (F_S) foi calculada com base na variância do componente residual e do componente sazonal resultantes da decomposição STL. O cálculo numérico no ambiente Python retornou um valor de F_S ≈ 0,88, o que indica uma presença de sazonalidade semanal extremamente forte e estrutural. Na ciência de séries temporais, uma força sazonal superior a 0,60 indica que o padrão periódico desempenha um papel determinante na geração dos dados, justificando tecnicamente a escolha de um modelo sazo</w:t>
+      </w:r>
+      <w:r>
+        <w:rPr>
+          <w:lang w:val="pt-BR"/>
+        </w:rPr>
+        <w:t>nal robusto como o SARIMA para capturar a dependência cíclica de período.</w:t>
       </w:r>
     </w:p>
     <w:p>
@@ -2436,7 +1762,7 @@
           <w:lang w:val="pt-BR"/>
         </w:rPr>
       </w:pPr>
-      <w:bookmarkStart w:id="5" w:name="_Toc230464593"/>
+      <w:bookmarkStart w:id="5" w:name="_Toc230468955"/>
       <w:proofErr w:type="spellStart"/>
       <w:r>
         <w:rPr>
@@ -2517,7 +1843,24 @@
         </w:rPr>
       </w:pPr>
       <w:r>
-        <w:t>- Resultado do Teste ADF: Apresentou um p-value superior a 0,05 (p = 0,0669), falhando em rejeitar a hipótese de raiz unitária estocástica.</w:t>
+        <w:rPr>
+          <w:lang w:val="pt-BR"/>
+        </w:rPr>
+        <w:t>- Resultado do Teste ADF: Apresentou um p-</w:t>
+      </w:r>
+      <w:proofErr w:type="spellStart"/>
+      <w:r>
+        <w:rPr>
+          <w:lang w:val="pt-BR"/>
+        </w:rPr>
+        <w:t>value</w:t>
+      </w:r>
+      <w:proofErr w:type="spellEnd"/>
+      <w:r>
+        <w:rPr>
+          <w:lang w:val="pt-BR"/>
+        </w:rPr>
+        <w:t xml:space="preserve"> superior a 0,05 (p = 0,0669), falhando em rejeitar a hipótese de raiz unitária estocástica.</w:t>
       </w:r>
     </w:p>
     <w:p>
@@ -2528,31 +1871,66 @@
         </w:rPr>
       </w:pPr>
       <w:r>
-        <w:t>- Resultado do Teste KPSS: Apresentou um p-value igual a 0,0100 (p &lt; 0,05), acarretando a rejeição da hipótese de estacionariedade.</w:t>
+        <w:rPr>
+          <w:lang w:val="pt-BR"/>
+        </w:rPr>
+        <w:t>- Resultado do Teste KPSS: Apresentou um p-</w:t>
+      </w:r>
+      <w:proofErr w:type="spellStart"/>
+      <w:r>
+        <w:rPr>
+          <w:lang w:val="pt-BR"/>
+        </w:rPr>
+        <w:t>value</w:t>
+      </w:r>
+      <w:proofErr w:type="spellEnd"/>
+      <w:r>
+        <w:rPr>
+          <w:lang w:val="pt-BR"/>
+        </w:rPr>
+        <w:t xml:space="preserve"> igual a 0,0100 (p &lt; 0,05), acarretando a rejeição da hipótese de </w:t>
+      </w:r>
+      <w:proofErr w:type="spellStart"/>
+      <w:r>
+        <w:rPr>
+          <w:lang w:val="pt-BR"/>
+        </w:rPr>
+        <w:t>estacionariedade</w:t>
+      </w:r>
+      <w:proofErr w:type="spellEnd"/>
+      <w:r>
+        <w:rPr>
+          <w:lang w:val="pt-BR"/>
+        </w:rPr>
+        <w:t>.</w:t>
       </w:r>
     </w:p>
     <w:p>
       <w:pPr>
         <w:jc w:val="both"/>
+        <w:rPr>
+          <w:lang w:val="pt-BR"/>
+        </w:rPr>
       </w:pPr>
       <w:r>
-        <w:t xml:space="preserve">Dado que ambos os testes indicam de forma unânime a não estacionariedade da série original diária, conclui-se que o tráfego não oscila de forma estacionária, justificando a necessidade de diferenciação </w:t>
+        <w:rPr>
+          <w:lang w:val="pt-BR"/>
+        </w:rPr>
+        <w:t xml:space="preserve">Dado que ambos os testes indicam de forma unânime a não </w:t>
       </w:r>
       <w:proofErr w:type="spellStart"/>
       <w:r>
-        <w:t>matemática</w:t>
+        <w:rPr>
+          <w:lang w:val="pt-BR"/>
+        </w:rPr>
+        <w:t>estacionariedade</w:t>
       </w:r>
       <w:proofErr w:type="spellEnd"/>
       <w:r>
-        <w:t xml:space="preserve"> para a </w:t>
-      </w:r>
-      <w:proofErr w:type="spellStart"/>
-      <w:r>
-        <w:t>modelagem</w:t>
-      </w:r>
-      <w:proofErr w:type="spellEnd"/>
-      <w:r>
-        <w:t>.</w:t>
+        <w:rPr>
+          <w:lang w:val="pt-BR"/>
+        </w:rPr>
+        <w:t xml:space="preserve"> da série original diária, conclui-se que o tráfego não oscila de forma estacionária, justificando a necessidade de diferenciação matemática para a modelagem.</w:t>
       </w:r>
     </w:p>
     <w:p>
@@ -2563,412 +1941,53 @@
         </w:rPr>
       </w:pPr>
       <w:r>
+        <w:rPr>
+          <w:lang w:val="pt-BR"/>
+        </w:rPr>
         <w:lastRenderedPageBreak/>
-        <w:t xml:space="preserve">Com base </w:t>
-      </w:r>
-      <w:proofErr w:type="spellStart"/>
-      <w:r>
-        <w:t>nessa</w:t>
-      </w:r>
-      <w:proofErr w:type="spellEnd"/>
-      <w:r>
-        <w:t xml:space="preserve"> </w:t>
-      </w:r>
-      <w:proofErr w:type="spellStart"/>
-      <w:r>
-        <w:t>análise</w:t>
-      </w:r>
-      <w:proofErr w:type="spellEnd"/>
-      <w:r>
-        <w:t xml:space="preserve">, </w:t>
-      </w:r>
-      <w:proofErr w:type="spellStart"/>
-      <w:r>
-        <w:t>foi</w:t>
-      </w:r>
-      <w:proofErr w:type="spellEnd"/>
-      <w:r>
-        <w:t xml:space="preserve"> </w:t>
-      </w:r>
-      <w:proofErr w:type="spellStart"/>
-      <w:r>
-        <w:t>aplicada</w:t>
-      </w:r>
-      <w:proofErr w:type="spellEnd"/>
-      <w:r>
-        <w:t xml:space="preserve"> </w:t>
-      </w:r>
-      <w:proofErr w:type="spellStart"/>
-      <w:r>
-        <w:t>uma</w:t>
-      </w:r>
-      <w:proofErr w:type="spellEnd"/>
-      <w:r>
-        <w:t xml:space="preserve"> </w:t>
-      </w:r>
-      <w:proofErr w:type="spellStart"/>
-      <w:r>
-        <w:t>diferenciação</w:t>
-      </w:r>
-      <w:proofErr w:type="spellEnd"/>
-      <w:r>
-        <w:t xml:space="preserve"> regular </w:t>
-      </w:r>
-      <w:proofErr w:type="spellStart"/>
-      <w:r>
-        <w:t>na</w:t>
-      </w:r>
-      <w:proofErr w:type="spellEnd"/>
-      <w:r>
-        <w:t xml:space="preserve"> </w:t>
-      </w:r>
-      <w:proofErr w:type="spellStart"/>
-      <w:r>
-        <w:t>série</w:t>
-      </w:r>
-      <w:proofErr w:type="spellEnd"/>
-      <w:r>
-        <w:t xml:space="preserve">, </w:t>
-      </w:r>
-      <w:proofErr w:type="spellStart"/>
-      <w:r>
-        <w:t>representada</w:t>
-      </w:r>
-      <w:proofErr w:type="spellEnd"/>
-      <w:r>
-        <w:t xml:space="preserve"> </w:t>
-      </w:r>
-      <w:proofErr w:type="spellStart"/>
-      <w:r>
-        <w:t>pelo</w:t>
-      </w:r>
-      <w:proofErr w:type="spellEnd"/>
-      <w:r>
-        <w:t xml:space="preserve"> </w:t>
-      </w:r>
-      <w:proofErr w:type="spellStart"/>
-      <w:r>
-        <w:t>parâmetro</w:t>
-      </w:r>
-      <w:proofErr w:type="spellEnd"/>
-      <w:r>
-        <w:t xml:space="preserve"> </w:t>
+        <w:t xml:space="preserve">Com base nessa análise, foi aplicada uma diferenciação regular na série, representada pelo parâmetro </w:t>
       </w:r>
       <w:r>
         <w:rPr>
           <w:b/>
           <w:bCs/>
+          <w:lang w:val="pt-BR"/>
         </w:rPr>
         <w:t>d = 1</w:t>
       </w:r>
       <w:r>
-        <w:t xml:space="preserve"> no </w:t>
+        <w:rPr>
+          <w:lang w:val="pt-BR"/>
+        </w:rPr>
+        <w:t xml:space="preserve"> no modelo SARIMA final. Essa diferenciação teve como objetivo reduzir a não </w:t>
       </w:r>
       <w:proofErr w:type="spellStart"/>
       <w:r>
-        <w:t>modelo</w:t>
+        <w:rPr>
+          <w:lang w:val="pt-BR"/>
+        </w:rPr>
+        <w:t>estacionariedade</w:t>
       </w:r>
       <w:proofErr w:type="spellEnd"/>
       <w:r>
-        <w:t xml:space="preserve"> SARIMA final. Essa </w:t>
-      </w:r>
-      <w:proofErr w:type="spellStart"/>
-      <w:r>
-        <w:t>diferenciação</w:t>
-      </w:r>
-      <w:proofErr w:type="spellEnd"/>
-      <w:r>
-        <w:t xml:space="preserve"> </w:t>
-      </w:r>
-      <w:proofErr w:type="spellStart"/>
-      <w:r>
-        <w:t>teve</w:t>
-      </w:r>
-      <w:proofErr w:type="spellEnd"/>
-      <w:r>
-        <w:t xml:space="preserve"> </w:t>
-      </w:r>
-      <w:proofErr w:type="spellStart"/>
-      <w:r>
-        <w:t>como</w:t>
-      </w:r>
-      <w:proofErr w:type="spellEnd"/>
-      <w:r>
-        <w:t xml:space="preserve"> </w:t>
-      </w:r>
-      <w:proofErr w:type="spellStart"/>
-      <w:r>
-        <w:t>objetivo</w:t>
-      </w:r>
-      <w:proofErr w:type="spellEnd"/>
-      <w:r>
-        <w:t xml:space="preserve"> </w:t>
-      </w:r>
-      <w:proofErr w:type="spellStart"/>
-      <w:r>
-        <w:t>reduzir</w:t>
-      </w:r>
-      <w:proofErr w:type="spellEnd"/>
-      <w:r>
-        <w:t xml:space="preserve"> a </w:t>
-      </w:r>
-      <w:proofErr w:type="spellStart"/>
-      <w:r>
-        <w:t>não</w:t>
-      </w:r>
-      <w:proofErr w:type="spellEnd"/>
-      <w:r>
-        <w:t xml:space="preserve"> </w:t>
-      </w:r>
-      <w:proofErr w:type="spellStart"/>
-      <w:r>
-        <w:t>estacionariedade</w:t>
-      </w:r>
-      <w:proofErr w:type="spellEnd"/>
-      <w:r>
-        <w:t xml:space="preserve"> </w:t>
-      </w:r>
-      <w:proofErr w:type="spellStart"/>
-      <w:r>
-        <w:t>identificada</w:t>
-      </w:r>
-      <w:proofErr w:type="spellEnd"/>
-      <w:r>
-        <w:t xml:space="preserve"> </w:t>
-      </w:r>
-      <w:proofErr w:type="spellStart"/>
-      <w:r>
-        <w:t>pelos</w:t>
-      </w:r>
-      <w:proofErr w:type="spellEnd"/>
-      <w:r>
-        <w:t xml:space="preserve"> testes ADF e KPSS. </w:t>
-      </w:r>
-      <w:proofErr w:type="spellStart"/>
-      <w:r>
-        <w:t>Entretanto</w:t>
-      </w:r>
-      <w:proofErr w:type="spellEnd"/>
-      <w:r>
-        <w:t xml:space="preserve">, </w:t>
-      </w:r>
-      <w:proofErr w:type="spellStart"/>
-      <w:r>
-        <w:t>não</w:t>
-      </w:r>
-      <w:proofErr w:type="spellEnd"/>
-      <w:r>
-        <w:t xml:space="preserve"> </w:t>
-      </w:r>
-      <w:proofErr w:type="spellStart"/>
-      <w:r>
-        <w:t>foi</w:t>
-      </w:r>
-      <w:proofErr w:type="spellEnd"/>
-      <w:r>
-        <w:t xml:space="preserve"> </w:t>
-      </w:r>
-      <w:proofErr w:type="spellStart"/>
-      <w:r>
-        <w:t>necessária</w:t>
-      </w:r>
-      <w:proofErr w:type="spellEnd"/>
-      <w:r>
-        <w:t xml:space="preserve"> </w:t>
-      </w:r>
-      <w:proofErr w:type="gramStart"/>
-      <w:r>
-        <w:t>a</w:t>
-      </w:r>
-      <w:proofErr w:type="gramEnd"/>
-      <w:r>
-        <w:t xml:space="preserve"> </w:t>
-      </w:r>
-      <w:proofErr w:type="spellStart"/>
-      <w:r>
-        <w:t>aplicação</w:t>
-      </w:r>
-      <w:proofErr w:type="spellEnd"/>
-      <w:r>
-        <w:t xml:space="preserve"> de </w:t>
-      </w:r>
-      <w:proofErr w:type="spellStart"/>
-      <w:r>
-        <w:t>diferenciação</w:t>
-      </w:r>
-      <w:proofErr w:type="spellEnd"/>
-      <w:r>
-        <w:t xml:space="preserve"> </w:t>
-      </w:r>
-      <w:proofErr w:type="spellStart"/>
-      <w:r>
-        <w:t>sazonal</w:t>
-      </w:r>
-      <w:proofErr w:type="spellEnd"/>
-      <w:r>
-        <w:t xml:space="preserve">, pois o </w:t>
-      </w:r>
-      <w:proofErr w:type="spellStart"/>
-      <w:r>
-        <w:t>parâmetro</w:t>
-      </w:r>
-      <w:proofErr w:type="spellEnd"/>
-      <w:r>
-        <w:t xml:space="preserve"> </w:t>
-      </w:r>
-      <w:proofErr w:type="spellStart"/>
-      <w:r>
-        <w:t>sazonal</w:t>
-      </w:r>
-      <w:proofErr w:type="spellEnd"/>
-      <w:r>
-        <w:t xml:space="preserve"> </w:t>
+        <w:rPr>
+          <w:lang w:val="pt-BR"/>
+        </w:rPr>
+        <w:t xml:space="preserve"> identificada pelos testes ADF e KPSS. Entretanto, não foi necessária a aplicação de diferenciação sazonal, pois o parâmetro sazonal </w:t>
       </w:r>
       <w:r>
         <w:rPr>
           <w:b/>
           <w:bCs/>
+          <w:lang w:val="pt-BR"/>
         </w:rPr>
         <w:t>D = 0</w:t>
       </w:r>
       <w:r>
-        <w:t xml:space="preserve"> no </w:t>
-      </w:r>
-      <w:proofErr w:type="spellStart"/>
-      <w:r>
-        <w:t>modelo</w:t>
-      </w:r>
-      <w:proofErr w:type="spellEnd"/>
-      <w:r>
-        <w:t xml:space="preserve"> </w:t>
-      </w:r>
-      <w:proofErr w:type="spellStart"/>
-      <w:r>
-        <w:t>escolhido</w:t>
-      </w:r>
-      <w:proofErr w:type="spellEnd"/>
-      <w:r>
-        <w:t xml:space="preserve">. Assim, a </w:t>
-      </w:r>
-      <w:proofErr w:type="spellStart"/>
-      <w:r>
-        <w:t>sazonalidade</w:t>
-      </w:r>
-      <w:proofErr w:type="spellEnd"/>
-      <w:r>
-        <w:t xml:space="preserve"> </w:t>
-      </w:r>
-      <w:proofErr w:type="spellStart"/>
-      <w:r>
-        <w:t>foi</w:t>
-      </w:r>
-      <w:proofErr w:type="spellEnd"/>
-      <w:r>
-        <w:t xml:space="preserve"> </w:t>
-      </w:r>
-      <w:proofErr w:type="spellStart"/>
-      <w:r>
-        <w:t>tratada</w:t>
-      </w:r>
-      <w:proofErr w:type="spellEnd"/>
-      <w:r>
-        <w:t xml:space="preserve"> </w:t>
-      </w:r>
-      <w:proofErr w:type="spellStart"/>
-      <w:r>
-        <w:t>pelos</w:t>
-      </w:r>
-      <w:proofErr w:type="spellEnd"/>
-      <w:r>
-        <w:t xml:space="preserve"> </w:t>
-      </w:r>
-      <w:proofErr w:type="spellStart"/>
-      <w:r>
-        <w:t>componentes</w:t>
-      </w:r>
-      <w:proofErr w:type="spellEnd"/>
-      <w:r>
-        <w:t xml:space="preserve"> </w:t>
-      </w:r>
-      <w:proofErr w:type="spellStart"/>
-      <w:r>
-        <w:t>sazonais</w:t>
-      </w:r>
-      <w:proofErr w:type="spellEnd"/>
-      <w:r>
-        <w:t xml:space="preserve"> </w:t>
-      </w:r>
-      <w:proofErr w:type="spellStart"/>
-      <w:r>
-        <w:t>autorregressivo</w:t>
-      </w:r>
-      <w:proofErr w:type="spellEnd"/>
-      <w:r>
-        <w:t xml:space="preserve"> e de </w:t>
-      </w:r>
-      <w:proofErr w:type="spellStart"/>
-      <w:r>
-        <w:t>médias</w:t>
-      </w:r>
-      <w:proofErr w:type="spellEnd"/>
-      <w:r>
-        <w:t xml:space="preserve"> </w:t>
-      </w:r>
-      <w:proofErr w:type="spellStart"/>
-      <w:r>
-        <w:t>móveis</w:t>
-      </w:r>
-      <w:proofErr w:type="spellEnd"/>
-      <w:r>
-        <w:t xml:space="preserve">, e </w:t>
-      </w:r>
-      <w:proofErr w:type="spellStart"/>
-      <w:r>
-        <w:t>não</w:t>
-      </w:r>
-      <w:proofErr w:type="spellEnd"/>
-      <w:r>
-        <w:t xml:space="preserve"> </w:t>
-      </w:r>
-      <w:proofErr w:type="spellStart"/>
-      <w:r>
-        <w:t>por</w:t>
-      </w:r>
-      <w:proofErr w:type="spellEnd"/>
-      <w:r>
-        <w:t xml:space="preserve"> </w:t>
-      </w:r>
-      <w:proofErr w:type="spellStart"/>
-      <w:r>
-        <w:t>uma</w:t>
-      </w:r>
-      <w:proofErr w:type="spellEnd"/>
-      <w:r>
-        <w:t xml:space="preserve"> </w:t>
-      </w:r>
-      <w:proofErr w:type="spellStart"/>
-      <w:r>
-        <w:t>diferenciação</w:t>
-      </w:r>
-      <w:proofErr w:type="spellEnd"/>
-      <w:r>
-        <w:t xml:space="preserve"> </w:t>
-      </w:r>
-      <w:proofErr w:type="spellStart"/>
-      <w:r>
-        <w:t>sazonal</w:t>
-      </w:r>
-      <w:proofErr w:type="spellEnd"/>
-      <w:r>
-        <w:t xml:space="preserve"> </w:t>
-      </w:r>
-      <w:proofErr w:type="spellStart"/>
-      <w:r>
-        <w:t>direta</w:t>
-      </w:r>
-      <w:proofErr w:type="spellEnd"/>
-      <w:r>
-        <w:t>.</w:t>
+        <w:rPr>
+          <w:lang w:val="pt-BR"/>
+        </w:rPr>
+        <w:t xml:space="preserve"> no modelo escolhido. Assim, a sazonalidade foi tratada pelos componentes sazonais autorregressivo e de médias móveis, e não por uma diferenciação sazonal direta.</w:t>
       </w:r>
     </w:p>
     <w:p>
@@ -2978,7 +1997,7 @@
           <w:lang w:val="pt-BR"/>
         </w:rPr>
       </w:pPr>
-      <w:bookmarkStart w:id="6" w:name="_Toc230464594"/>
+      <w:bookmarkStart w:id="6" w:name="_Toc230468956"/>
       <w:r>
         <w:rPr>
           <w:lang w:val="pt-BR"/>
@@ -3032,557 +2051,83 @@
     <w:p>
       <w:pPr>
         <w:jc w:val="both"/>
+        <w:rPr>
+          <w:lang w:val="pt-BR"/>
+        </w:rPr>
       </w:pPr>
       <w:r>
-        <w:t xml:space="preserve">O modelo ótimo selecionado matematicamente pela busca em grade iterativa foi o </w:t>
-      </w:r>
-      <w:proofErr w:type="gramStart"/>
-      <w:r>
-        <w:t>SARIMA(</w:t>
-      </w:r>
-      <w:proofErr w:type="gramEnd"/>
-      <w:r>
-        <w:t xml:space="preserve">1, 1, 1) x (1, 0, 1) [28], atingindo o </w:t>
+        <w:rPr>
+          <w:lang w:val="pt-BR"/>
+        </w:rPr>
+        <w:t>O modelo ótimo selecionado matematicamente pela busca em grade iterativa foi o SARIMA(1, 1, 1) x (1, 0, 1) [28], atingindo o menor BIC de 26.043,95.</w:t>
+      </w:r>
+      <w:r>
+        <w:rPr>
+          <w:lang w:val="pt-BR"/>
+        </w:rPr>
+        <w:t xml:space="preserve"> A escolha desse modelo considerou tanto os resultados dos testes de </w:t>
       </w:r>
       <w:proofErr w:type="spellStart"/>
       <w:r>
-        <w:t>menor</w:t>
+        <w:rPr>
+          <w:lang w:val="pt-BR"/>
+        </w:rPr>
+        <w:t>estacionariedade</w:t>
       </w:r>
       <w:proofErr w:type="spellEnd"/>
       <w:r>
-        <w:t xml:space="preserve"> BIC de 26.043,95.</w:t>
-      </w:r>
-      <w:r>
-        <w:t xml:space="preserve"> </w:t>
-      </w:r>
-      <w:r>
-        <w:t xml:space="preserve">A </w:t>
+        <w:rPr>
+          <w:lang w:val="pt-BR"/>
+        </w:rPr>
+        <w:t xml:space="preserve"> quanto o desempenho das combinações avaliadas na busca em grade. O parâmetro p = 1 indica que o modelo utiliza a influência do valor anterior da série; o parâmetro d = 1 representa a diferenciação regular aplicada para reduzir a não </w:t>
       </w:r>
       <w:proofErr w:type="spellStart"/>
       <w:r>
-        <w:t>escolha</w:t>
+        <w:rPr>
+          <w:lang w:val="pt-BR"/>
+        </w:rPr>
+        <w:t>estacionariedade</w:t>
       </w:r>
       <w:proofErr w:type="spellEnd"/>
       <w:r>
-        <w:t xml:space="preserve"> </w:t>
-      </w:r>
-      <w:proofErr w:type="spellStart"/>
-      <w:r>
-        <w:t>desse</w:t>
-      </w:r>
-      <w:proofErr w:type="spellEnd"/>
-      <w:r>
-        <w:t xml:space="preserve"> </w:t>
-      </w:r>
-      <w:proofErr w:type="spellStart"/>
-      <w:r>
-        <w:t>modelo</w:t>
-      </w:r>
-      <w:proofErr w:type="spellEnd"/>
-      <w:r>
-        <w:t xml:space="preserve"> </w:t>
-      </w:r>
-      <w:proofErr w:type="spellStart"/>
-      <w:r>
-        <w:t>considerou</w:t>
-      </w:r>
-      <w:proofErr w:type="spellEnd"/>
-      <w:r>
-        <w:t xml:space="preserve"> tanto </w:t>
-      </w:r>
-      <w:proofErr w:type="spellStart"/>
-      <w:r>
-        <w:t>os</w:t>
-      </w:r>
-      <w:proofErr w:type="spellEnd"/>
-      <w:r>
-        <w:t xml:space="preserve"> </w:t>
-      </w:r>
-      <w:proofErr w:type="spellStart"/>
-      <w:r>
-        <w:t>resultados</w:t>
-      </w:r>
-      <w:proofErr w:type="spellEnd"/>
-      <w:r>
-        <w:t xml:space="preserve"> dos testes de </w:t>
-      </w:r>
-      <w:proofErr w:type="spellStart"/>
-      <w:r>
-        <w:t>estacionariedade</w:t>
-      </w:r>
-      <w:proofErr w:type="spellEnd"/>
-      <w:r>
-        <w:t xml:space="preserve"> </w:t>
-      </w:r>
-      <w:proofErr w:type="spellStart"/>
-      <w:r>
-        <w:t>quanto</w:t>
-      </w:r>
-      <w:proofErr w:type="spellEnd"/>
-      <w:r>
-        <w:t xml:space="preserve"> o </w:t>
-      </w:r>
-      <w:proofErr w:type="spellStart"/>
-      <w:r>
-        <w:t>desempenho</w:t>
-      </w:r>
-      <w:proofErr w:type="spellEnd"/>
-      <w:r>
-        <w:t xml:space="preserve"> das </w:t>
-      </w:r>
-      <w:proofErr w:type="spellStart"/>
-      <w:r>
-        <w:t>combinações</w:t>
-      </w:r>
-      <w:proofErr w:type="spellEnd"/>
-      <w:r>
-        <w:t xml:space="preserve"> </w:t>
-      </w:r>
-      <w:proofErr w:type="spellStart"/>
-      <w:r>
-        <w:t>avaliadas</w:t>
-      </w:r>
-      <w:proofErr w:type="spellEnd"/>
-      <w:r>
-        <w:t xml:space="preserve"> </w:t>
-      </w:r>
-      <w:proofErr w:type="spellStart"/>
-      <w:r>
-        <w:t>na</w:t>
-      </w:r>
-      <w:proofErr w:type="spellEnd"/>
-      <w:r>
-        <w:t xml:space="preserve"> </w:t>
-      </w:r>
-      <w:proofErr w:type="spellStart"/>
-      <w:r>
-        <w:t>busca</w:t>
-      </w:r>
-      <w:proofErr w:type="spellEnd"/>
-      <w:r>
-        <w:t xml:space="preserve"> </w:t>
-      </w:r>
-      <w:proofErr w:type="spellStart"/>
-      <w:r>
-        <w:t>em</w:t>
-      </w:r>
-      <w:proofErr w:type="spellEnd"/>
-      <w:r>
-        <w:t xml:space="preserve"> grade. O </w:t>
-      </w:r>
-      <w:proofErr w:type="spellStart"/>
-      <w:r>
-        <w:t>parâmetro</w:t>
-      </w:r>
-      <w:proofErr w:type="spellEnd"/>
-      <w:r>
-        <w:t xml:space="preserve"> p = 1 indica </w:t>
-      </w:r>
-      <w:proofErr w:type="spellStart"/>
-      <w:r>
-        <w:t>que</w:t>
-      </w:r>
-      <w:proofErr w:type="spellEnd"/>
-      <w:r>
-        <w:t xml:space="preserve"> o </w:t>
-      </w:r>
-      <w:proofErr w:type="spellStart"/>
-      <w:r>
-        <w:t>modelo</w:t>
-      </w:r>
-      <w:proofErr w:type="spellEnd"/>
-      <w:r>
-        <w:t xml:space="preserve"> </w:t>
-      </w:r>
-      <w:proofErr w:type="spellStart"/>
-      <w:r>
-        <w:t>utiliza</w:t>
-      </w:r>
-      <w:proofErr w:type="spellEnd"/>
-      <w:r>
-        <w:t xml:space="preserve"> </w:t>
-      </w:r>
-      <w:proofErr w:type="gramStart"/>
-      <w:r>
-        <w:t>a</w:t>
-      </w:r>
-      <w:proofErr w:type="gramEnd"/>
-      <w:r>
-        <w:t xml:space="preserve"> </w:t>
-      </w:r>
-      <w:proofErr w:type="spellStart"/>
-      <w:r>
-        <w:t>influência</w:t>
-      </w:r>
-      <w:proofErr w:type="spellEnd"/>
-      <w:r>
-        <w:t xml:space="preserve"> do valor anterior da </w:t>
-      </w:r>
-      <w:proofErr w:type="spellStart"/>
-      <w:r>
-        <w:t>série</w:t>
-      </w:r>
-      <w:proofErr w:type="spellEnd"/>
-      <w:r>
-        <w:t xml:space="preserve">; o </w:t>
-      </w:r>
-      <w:proofErr w:type="spellStart"/>
-      <w:r>
-        <w:t>parâmetro</w:t>
-      </w:r>
-      <w:proofErr w:type="spellEnd"/>
-      <w:r>
-        <w:t xml:space="preserve"> d = 1 </w:t>
-      </w:r>
-      <w:proofErr w:type="spellStart"/>
-      <w:r>
-        <w:t>representa</w:t>
-      </w:r>
-      <w:proofErr w:type="spellEnd"/>
-      <w:r>
-        <w:t xml:space="preserve"> a </w:t>
-      </w:r>
-      <w:proofErr w:type="spellStart"/>
-      <w:r>
-        <w:t>diferenciação</w:t>
-      </w:r>
-      <w:proofErr w:type="spellEnd"/>
-      <w:r>
-        <w:t xml:space="preserve"> regular </w:t>
-      </w:r>
-      <w:proofErr w:type="spellStart"/>
-      <w:r>
-        <w:t>aplicada</w:t>
-      </w:r>
-      <w:proofErr w:type="spellEnd"/>
-      <w:r>
-        <w:t xml:space="preserve"> para </w:t>
-      </w:r>
-      <w:proofErr w:type="spellStart"/>
-      <w:r>
-        <w:t>reduzir</w:t>
-      </w:r>
-      <w:proofErr w:type="spellEnd"/>
-      <w:r>
-        <w:t xml:space="preserve"> a </w:t>
-      </w:r>
-      <w:proofErr w:type="spellStart"/>
-      <w:r>
-        <w:t>não</w:t>
-      </w:r>
-      <w:proofErr w:type="spellEnd"/>
-      <w:r>
-        <w:t xml:space="preserve"> </w:t>
-      </w:r>
-      <w:proofErr w:type="spellStart"/>
-      <w:r>
-        <w:t>estacionariedade</w:t>
-      </w:r>
-      <w:proofErr w:type="spellEnd"/>
-      <w:r>
-        <w:t xml:space="preserve">; e o </w:t>
-      </w:r>
-      <w:proofErr w:type="spellStart"/>
-      <w:r>
-        <w:t>parâmetro</w:t>
-      </w:r>
-      <w:proofErr w:type="spellEnd"/>
-      <w:r>
-        <w:t xml:space="preserve"> q = 1 indica o </w:t>
-      </w:r>
-      <w:proofErr w:type="spellStart"/>
-      <w:r>
-        <w:t>uso</w:t>
-      </w:r>
-      <w:proofErr w:type="spellEnd"/>
-      <w:r>
-        <w:t xml:space="preserve"> do </w:t>
-      </w:r>
-      <w:proofErr w:type="spellStart"/>
-      <w:r>
-        <w:t>erro</w:t>
-      </w:r>
-      <w:proofErr w:type="spellEnd"/>
-      <w:r>
-        <w:t xml:space="preserve"> passado para </w:t>
-      </w:r>
-      <w:proofErr w:type="spellStart"/>
-      <w:r>
-        <w:t>corrigir</w:t>
-      </w:r>
-      <w:proofErr w:type="spellEnd"/>
-      <w:r>
-        <w:t xml:space="preserve"> a </w:t>
-      </w:r>
-      <w:proofErr w:type="spellStart"/>
-      <w:r>
-        <w:t>previsão</w:t>
-      </w:r>
-      <w:proofErr w:type="spellEnd"/>
-      <w:r>
-        <w:t xml:space="preserve">. Na </w:t>
-      </w:r>
-      <w:proofErr w:type="spellStart"/>
-      <w:r>
-        <w:t>parte</w:t>
-      </w:r>
-      <w:proofErr w:type="spellEnd"/>
-      <w:r>
-        <w:t xml:space="preserve"> </w:t>
-      </w:r>
-      <w:proofErr w:type="spellStart"/>
-      <w:r>
-        <w:t>sazonal</w:t>
-      </w:r>
-      <w:proofErr w:type="spellEnd"/>
-      <w:r>
-        <w:t xml:space="preserve">, P = 1 e Q = 1 </w:t>
-      </w:r>
-      <w:proofErr w:type="spellStart"/>
-      <w:r>
-        <w:t>indicam</w:t>
-      </w:r>
-      <w:proofErr w:type="spellEnd"/>
-      <w:r>
-        <w:t xml:space="preserve"> </w:t>
-      </w:r>
-      <w:proofErr w:type="spellStart"/>
-      <w:r>
-        <w:t>que</w:t>
-      </w:r>
-      <w:proofErr w:type="spellEnd"/>
-      <w:r>
-        <w:t xml:space="preserve"> o </w:t>
-      </w:r>
-      <w:proofErr w:type="spellStart"/>
-      <w:r>
-        <w:t>modelo</w:t>
-      </w:r>
-      <w:proofErr w:type="spellEnd"/>
-      <w:r>
-        <w:t xml:space="preserve"> </w:t>
-      </w:r>
-      <w:proofErr w:type="spellStart"/>
-      <w:r>
-        <w:t>também</w:t>
-      </w:r>
-      <w:proofErr w:type="spellEnd"/>
-      <w:r>
-        <w:t xml:space="preserve"> </w:t>
-      </w:r>
-      <w:proofErr w:type="spellStart"/>
-      <w:r>
-        <w:t>considera</w:t>
-      </w:r>
-      <w:proofErr w:type="spellEnd"/>
-      <w:r>
-        <w:t xml:space="preserve"> </w:t>
-      </w:r>
-      <w:proofErr w:type="spellStart"/>
-      <w:r>
-        <w:t>padrões</w:t>
-      </w:r>
-      <w:proofErr w:type="spellEnd"/>
-      <w:r>
-        <w:t xml:space="preserve"> </w:t>
-      </w:r>
-      <w:proofErr w:type="spellStart"/>
-      <w:r>
-        <w:t>sazonais</w:t>
-      </w:r>
-      <w:proofErr w:type="spellEnd"/>
-      <w:r>
-        <w:t xml:space="preserve"> </w:t>
-      </w:r>
-      <w:proofErr w:type="spellStart"/>
-      <w:r>
-        <w:t>anteriores</w:t>
-      </w:r>
-      <w:proofErr w:type="spellEnd"/>
-      <w:r>
-        <w:t xml:space="preserve"> e </w:t>
-      </w:r>
-      <w:proofErr w:type="spellStart"/>
-      <w:r>
-        <w:t>erros</w:t>
-      </w:r>
-      <w:proofErr w:type="spellEnd"/>
-      <w:r>
-        <w:t xml:space="preserve"> </w:t>
-      </w:r>
-      <w:proofErr w:type="spellStart"/>
-      <w:r>
-        <w:t>sazonais</w:t>
-      </w:r>
-      <w:proofErr w:type="spellEnd"/>
-      <w:r>
-        <w:t xml:space="preserve"> </w:t>
-      </w:r>
-      <w:proofErr w:type="spellStart"/>
-      <w:r>
-        <w:t>anteriores</w:t>
-      </w:r>
-      <w:proofErr w:type="spellEnd"/>
-      <w:r>
-        <w:t xml:space="preserve">. O </w:t>
-      </w:r>
-      <w:proofErr w:type="spellStart"/>
-      <w:r>
-        <w:t>período</w:t>
-      </w:r>
-      <w:proofErr w:type="spellEnd"/>
-      <w:r>
-        <w:t xml:space="preserve"> m = 28</w:t>
-      </w:r>
-      <w:r>
-        <w:t xml:space="preserve"> </w:t>
-      </w:r>
-      <w:proofErr w:type="spellStart"/>
-      <w:r>
-        <w:t>sugere</w:t>
-      </w:r>
-      <w:proofErr w:type="spellEnd"/>
-      <w:r>
-        <w:t xml:space="preserve"> </w:t>
-      </w:r>
-      <w:proofErr w:type="spellStart"/>
-      <w:r>
-        <w:t>que</w:t>
-      </w:r>
-      <w:proofErr w:type="spellEnd"/>
-      <w:r>
-        <w:t xml:space="preserve"> </w:t>
-      </w:r>
-      <w:proofErr w:type="spellStart"/>
-      <w:r>
-        <w:t>o</w:t>
-      </w:r>
-      <w:proofErr w:type="spellEnd"/>
-      <w:r>
-        <w:t xml:space="preserve"> </w:t>
-      </w:r>
-      <w:proofErr w:type="spellStart"/>
-      <w:r>
-        <w:t>melhor</w:t>
-      </w:r>
-      <w:proofErr w:type="spellEnd"/>
-      <w:r>
-        <w:t xml:space="preserve"> </w:t>
-      </w:r>
-      <w:proofErr w:type="spellStart"/>
-      <w:r>
-        <w:t>desempenho</w:t>
-      </w:r>
-      <w:proofErr w:type="spellEnd"/>
-      <w:r>
-        <w:t xml:space="preserve"> </w:t>
-      </w:r>
-      <w:proofErr w:type="spellStart"/>
-      <w:r>
-        <w:t>foi</w:t>
-      </w:r>
-      <w:proofErr w:type="spellEnd"/>
-      <w:r>
-        <w:t xml:space="preserve"> </w:t>
-      </w:r>
-      <w:proofErr w:type="spellStart"/>
-      <w:r>
-        <w:t>obtido</w:t>
-      </w:r>
-      <w:proofErr w:type="spellEnd"/>
-      <w:r>
-        <w:t xml:space="preserve"> </w:t>
-      </w:r>
-      <w:proofErr w:type="spellStart"/>
-      <w:r>
-        <w:t>ao</w:t>
-      </w:r>
-      <w:proofErr w:type="spellEnd"/>
-      <w:r>
-        <w:t xml:space="preserve"> </w:t>
-      </w:r>
-      <w:proofErr w:type="spellStart"/>
-      <w:r>
-        <w:t>capturar</w:t>
-      </w:r>
-      <w:proofErr w:type="spellEnd"/>
-      <w:r>
-        <w:t xml:space="preserve"> um </w:t>
-      </w:r>
-      <w:proofErr w:type="spellStart"/>
-      <w:r>
-        <w:t>ciclo</w:t>
-      </w:r>
-      <w:proofErr w:type="spellEnd"/>
-      <w:r>
-        <w:t xml:space="preserve"> </w:t>
-      </w:r>
-      <w:proofErr w:type="spellStart"/>
-      <w:r>
-        <w:t>mais</w:t>
-      </w:r>
-      <w:proofErr w:type="spellEnd"/>
-      <w:r>
-        <w:t xml:space="preserve"> </w:t>
-      </w:r>
-      <w:proofErr w:type="spellStart"/>
-      <w:r>
-        <w:t>amplo</w:t>
-      </w:r>
-      <w:proofErr w:type="spellEnd"/>
-      <w:r>
-        <w:t xml:space="preserve">, </w:t>
-      </w:r>
-      <w:proofErr w:type="spellStart"/>
-      <w:r>
-        <w:t>equivalente</w:t>
-      </w:r>
-      <w:proofErr w:type="spellEnd"/>
-      <w:r>
-        <w:t xml:space="preserve"> a </w:t>
-      </w:r>
-      <w:proofErr w:type="spellStart"/>
-      <w:r>
-        <w:t>quatro</w:t>
-      </w:r>
-      <w:proofErr w:type="spellEnd"/>
-      <w:r>
-        <w:t xml:space="preserve"> </w:t>
-      </w:r>
-      <w:proofErr w:type="spellStart"/>
-      <w:r>
-        <w:t>semanas</w:t>
-      </w:r>
-      <w:proofErr w:type="spellEnd"/>
-      <w:r>
-        <w:t>.</w:t>
-      </w:r>
-      <w:r>
+        <w:rPr>
+          <w:lang w:val="pt-BR"/>
+        </w:rPr>
+        <w:t>; e o parâmetro q = 1 indica o uso do erro passado para corrigir a previsão. Na parte sazonal, P = 1 e Q = 1 indicam que o modelo também considera padrões sazonais anteriores e erros sazonais anteriores. O período m = 28 sugere que o melhor desempenho foi obtido ao capturar um ciclo mais amplo, equivalente a quatro semanas.</w:t>
+      </w:r>
+      <w:r>
+        <w:rPr>
+          <w:lang w:val="pt-BR"/>
+        </w:rPr>
         <w:t xml:space="preserve"> </w:t>
       </w:r>
     </w:p>
     <w:p>
       <w:pPr>
         <w:jc w:val="both"/>
+        <w:rPr>
+          <w:lang w:val="pt-BR"/>
+        </w:rPr>
       </w:pPr>
       <w:r>
-        <w:t xml:space="preserve">O </w:t>
+        <w:rPr>
+          <w:lang w:val="pt-BR"/>
+        </w:rPr>
+        <w:t xml:space="preserve">O parâmetro de diferenciação d=1 confirma a não </w:t>
       </w:r>
       <w:proofErr w:type="spellStart"/>
       <w:r>
-        <w:t>parâmetro</w:t>
+        <w:rPr>
+          <w:lang w:val="pt-BR"/>
+        </w:rPr>
+        <w:t>estacionariedade</w:t>
       </w:r>
       <w:proofErr w:type="spellEnd"/>
       <w:r>
-        <w:t xml:space="preserve"> de </w:t>
-      </w:r>
-      <w:proofErr w:type="spellStart"/>
-      <w:r>
-        <w:t>diferenciação</w:t>
-      </w:r>
-      <w:proofErr w:type="spellEnd"/>
-      <w:r>
-        <w:t xml:space="preserve"> d=1 confirma a não estacionariedade apontada pelos testes ADF e KPSS. Além disso, essa estrutura matemática indica que o algoritmo identificou não apenas o ciclo puro de 7 dias, mas encontrou otimização superior modelando o ciclo expandido de 28 dias (quatro semanas), capturando flutuações e comportamentos rítmicos mais profundos do mês calendário.</w:t>
+        <w:rPr>
+          <w:lang w:val="pt-BR"/>
+        </w:rPr>
+        <w:t xml:space="preserve"> apontada pelos testes ADF e KPSS. Além disso, essa estrutura matemática indica que o algoritmo identificou não apenas o ciclo puro de 7 dias, mas encontrou otimização superior modelando o ciclo expandido de 28 dias (quatro semanas), capturando flutuações e comportamentos rítmicos mais profundos do mês calendário.</w:t>
       </w:r>
     </w:p>
     <w:p>
@@ -3606,7 +2151,7 @@
           <w:lang w:val="pt-BR"/>
         </w:rPr>
       </w:pPr>
-      <w:bookmarkStart w:id="7" w:name="_Toc230464595"/>
+      <w:bookmarkStart w:id="7" w:name="_Toc230468957"/>
       <w:r>
         <w:rPr>
           <w:lang w:val="pt-BR"/>
@@ -3871,6 +2416,11 @@
       </w:tr>
     </w:tbl>
     <w:p>
+      <w:pPr>
+        <w:rPr>
+          <w:lang w:val="pt-BR"/>
+        </w:rPr>
+      </w:pPr>
       <w:r>
         <w:rPr>
           <w:noProof/>
@@ -3911,7 +2461,6 @@
           </wp:inline>
         </w:drawing>
       </w:r>
-      <w:bookmarkStart w:id="8" w:name="_Toc230464596"/>
       <w:r>
         <w:rPr>
           <w:color w:val="000000" w:themeColor="text1"/>
@@ -3955,68 +2504,46 @@
           <w:lang w:val="pt-BR"/>
         </w:rPr>
         <w:t xml:space="preserve"> apresentou desempenho bastante competitivo no conjunto de teste, com MAE de 327,38, superando o SARIMA Estático, que obteve MAE de 364,89. Esse resultado indica que, em séries com sazonalidade semanal muito forte, um modelo simples que replica o comportamento observado no mesmo dia da semana anterior já consegue capturar parte relevante da estrutura temporal.</w:t>
+      </w:r>
+    </w:p>
+    <w:p>
+      <w:pPr>
+        <w:rPr>
+          <w:b/>
+          <w:bCs/>
+          <w:lang w:val="pt-BR"/>
+        </w:rPr>
+      </w:pPr>
+      <w:r>
+        <w:rPr>
+          <w:lang w:val="pt-BR"/>
+        </w:rPr>
+        <w:lastRenderedPageBreak/>
+        <w:t xml:space="preserve">No entanto, o melhor desempenho geral foi alcançado pelo SARIMA com Rolling Forecast, que reduziu o MAE para 268,07. Portanto, o SARIMA não foi superior </w:t>
+      </w:r>
+      <w:proofErr w:type="gramStart"/>
+      <w:r>
+        <w:rPr>
+          <w:lang w:val="pt-BR"/>
+        </w:rPr>
+        <w:t>aos base</w:t>
+      </w:r>
+      <w:proofErr w:type="gramEnd"/>
+      <w:r>
+        <w:rPr>
+          <w:lang w:val="pt-BR"/>
+        </w:rPr>
+        <w:t xml:space="preserve"> models em sua versão estática, mas tornou-se a melhor abordagem quando utilizado de forma dinâmica, incorporando novas observações ao longo do tempo. Isso mostra que a complexidade do SARIMA se justifica principalmente em um cenário operacional atualizado continuamente.</w:t>
       </w:r>
     </w:p>
     <w:p>
       <w:pPr>
         <w:pStyle w:val="Ttulo2"/>
         <w:rPr>
-          <w:rFonts w:ascii="Arial" w:hAnsi="Arial" w:cs="Arial"/>
-          <w:b w:val="0"/>
-          <w:bCs w:val="0"/>
-          <w:color w:val="000000" w:themeColor="text1"/>
-          <w:sz w:val="24"/>
-          <w:szCs w:val="24"/>
           <w:lang w:val="pt-BR"/>
         </w:rPr>
       </w:pPr>
-      <w:r>
-        <w:rPr>
-          <w:rFonts w:ascii="Arial" w:hAnsi="Arial" w:cs="Arial"/>
-          <w:b w:val="0"/>
-          <w:bCs w:val="0"/>
-          <w:color w:val="000000" w:themeColor="text1"/>
-          <w:sz w:val="24"/>
-          <w:szCs w:val="24"/>
-          <w:lang w:val="pt-BR"/>
-        </w:rPr>
-        <w:lastRenderedPageBreak/>
-        <w:t xml:space="preserve">No entanto, o melhor desempenho geral foi alcançado pelo SARIMA com Rolling Forecast, que reduziu o MAE para 268,07. Portanto, o SARIMA não foi superior </w:t>
-      </w:r>
-      <w:proofErr w:type="gramStart"/>
-      <w:r>
-        <w:rPr>
-          <w:rFonts w:ascii="Arial" w:hAnsi="Arial" w:cs="Arial"/>
-          <w:b w:val="0"/>
-          <w:bCs w:val="0"/>
-          <w:color w:val="000000" w:themeColor="text1"/>
-          <w:sz w:val="24"/>
-          <w:szCs w:val="24"/>
-          <w:lang w:val="pt-BR"/>
-        </w:rPr>
-        <w:t>aos base</w:t>
-      </w:r>
-      <w:proofErr w:type="gramEnd"/>
-      <w:r>
-        <w:rPr>
-          <w:rFonts w:ascii="Arial" w:hAnsi="Arial" w:cs="Arial"/>
-          <w:b w:val="0"/>
-          <w:bCs w:val="0"/>
-          <w:color w:val="000000" w:themeColor="text1"/>
-          <w:sz w:val="24"/>
-          <w:szCs w:val="24"/>
-          <w:lang w:val="pt-BR"/>
-        </w:rPr>
-        <w:t xml:space="preserve"> models em sua versão estática, mas tornou-se a melhor abordagem quando utilizado de forma dinâmica, incorporando novas observações ao longo do tempo. Isso mostra que a complexidade do SARIMA se justifica principalmente em um cenário operacional atualizado continuamente.</w:t>
-      </w:r>
-    </w:p>
-    <w:p>
-      <w:pPr>
-        <w:pStyle w:val="Ttulo2"/>
-        <w:rPr>
-          <w:lang w:val="pt-BR"/>
-        </w:rPr>
-      </w:pPr>
+      <w:bookmarkStart w:id="8" w:name="_Toc230468958"/>
       <w:r>
         <w:rPr>
           <w:lang w:val="pt-BR"/>
@@ -4109,414 +2636,17 @@
         <w:t>Esta metodologia reduziu de forma marcante o erro de previsão absoluta do tráfego rodoviário. O MAE despencou no contexto do Rolling Forecast (268,07), comprovando que modelos preditivos estáticos perdem valor rapidamente.</w:t>
       </w:r>
       <w:r>
-        <w:t xml:space="preserve"> </w:t>
-      </w:r>
-      <w:r>
-        <w:t xml:space="preserve">A </w:t>
-      </w:r>
-      <w:proofErr w:type="spellStart"/>
-      <w:r>
-        <w:t>melhora</w:t>
-      </w:r>
-      <w:proofErr w:type="spellEnd"/>
-      <w:r>
-        <w:t xml:space="preserve"> </w:t>
-      </w:r>
-      <w:proofErr w:type="spellStart"/>
-      <w:r>
-        <w:t>obtida</w:t>
-      </w:r>
-      <w:proofErr w:type="spellEnd"/>
-      <w:r>
-        <w:t xml:space="preserve"> </w:t>
-      </w:r>
-      <w:proofErr w:type="spellStart"/>
-      <w:r>
-        <w:t>pelo</w:t>
-      </w:r>
-      <w:proofErr w:type="spellEnd"/>
-      <w:r>
-        <w:t xml:space="preserve"> Rolling Forecast </w:t>
-      </w:r>
-      <w:proofErr w:type="spellStart"/>
-      <w:r>
-        <w:t>mostra</w:t>
-      </w:r>
-      <w:proofErr w:type="spellEnd"/>
-      <w:r>
-        <w:t xml:space="preserve"> </w:t>
-      </w:r>
-      <w:proofErr w:type="spellStart"/>
-      <w:r>
-        <w:t>que</w:t>
-      </w:r>
-      <w:proofErr w:type="spellEnd"/>
-      <w:r>
-        <w:t xml:space="preserve"> a </w:t>
-      </w:r>
-      <w:proofErr w:type="spellStart"/>
-      <w:r>
-        <w:t>série</w:t>
-      </w:r>
-      <w:proofErr w:type="spellEnd"/>
-      <w:r>
-        <w:t xml:space="preserve"> de </w:t>
-      </w:r>
-      <w:proofErr w:type="spellStart"/>
-      <w:r>
-        <w:t>tráfego</w:t>
-      </w:r>
-      <w:proofErr w:type="spellEnd"/>
-      <w:r>
-        <w:t xml:space="preserve"> se beneficia da </w:t>
-      </w:r>
-      <w:proofErr w:type="spellStart"/>
-      <w:r>
-        <w:t>atualização</w:t>
-      </w:r>
-      <w:proofErr w:type="spellEnd"/>
-      <w:r>
-        <w:t xml:space="preserve"> </w:t>
-      </w:r>
-      <w:proofErr w:type="spellStart"/>
-      <w:r>
-        <w:t>frequente</w:t>
-      </w:r>
-      <w:proofErr w:type="spellEnd"/>
-      <w:r>
-        <w:t xml:space="preserve"> com dados </w:t>
-      </w:r>
-      <w:proofErr w:type="spellStart"/>
-      <w:r>
-        <w:t>recentes</w:t>
-      </w:r>
-      <w:proofErr w:type="spellEnd"/>
-      <w:r>
-        <w:t xml:space="preserve">. Como o </w:t>
-      </w:r>
-      <w:proofErr w:type="spellStart"/>
-      <w:r>
-        <w:t>fluxo</w:t>
-      </w:r>
-      <w:proofErr w:type="spellEnd"/>
-      <w:r>
-        <w:t xml:space="preserve"> </w:t>
-      </w:r>
-      <w:proofErr w:type="spellStart"/>
-      <w:r>
-        <w:t>rodoviário</w:t>
-      </w:r>
-      <w:proofErr w:type="spellEnd"/>
-      <w:r>
-        <w:t xml:space="preserve"> </w:t>
-      </w:r>
-      <w:proofErr w:type="spellStart"/>
-      <w:r>
-        <w:t>pode</w:t>
-      </w:r>
-      <w:proofErr w:type="spellEnd"/>
-      <w:r>
-        <w:t xml:space="preserve"> ser </w:t>
-      </w:r>
-      <w:proofErr w:type="spellStart"/>
-      <w:r>
-        <w:t>afetado</w:t>
-      </w:r>
-      <w:proofErr w:type="spellEnd"/>
-      <w:r>
-        <w:t xml:space="preserve"> </w:t>
-      </w:r>
-      <w:proofErr w:type="spellStart"/>
-      <w:r>
-        <w:t>por</w:t>
-      </w:r>
-      <w:proofErr w:type="spellEnd"/>
-      <w:r>
-        <w:t xml:space="preserve"> </w:t>
-      </w:r>
-      <w:proofErr w:type="spellStart"/>
-      <w:r>
-        <w:t>alterações</w:t>
-      </w:r>
-      <w:proofErr w:type="spellEnd"/>
-      <w:r>
-        <w:t xml:space="preserve"> de </w:t>
-      </w:r>
-      <w:proofErr w:type="spellStart"/>
-      <w:r>
-        <w:t>rotina</w:t>
-      </w:r>
-      <w:proofErr w:type="spellEnd"/>
-      <w:r>
-        <w:t xml:space="preserve">, </w:t>
-      </w:r>
-      <w:proofErr w:type="spellStart"/>
-      <w:r>
-        <w:t>feriados</w:t>
-      </w:r>
-      <w:proofErr w:type="spellEnd"/>
-      <w:r>
-        <w:t xml:space="preserve">, </w:t>
-      </w:r>
-      <w:proofErr w:type="spellStart"/>
-      <w:r>
-        <w:t>clima</w:t>
-      </w:r>
-      <w:proofErr w:type="spellEnd"/>
-      <w:r>
-        <w:t xml:space="preserve"> e </w:t>
-      </w:r>
-      <w:proofErr w:type="spellStart"/>
-      <w:r>
-        <w:t>choques</w:t>
-      </w:r>
-      <w:proofErr w:type="spellEnd"/>
-      <w:r>
-        <w:t xml:space="preserve"> </w:t>
-      </w:r>
-      <w:proofErr w:type="spellStart"/>
-      <w:r>
-        <w:t>pontuais</w:t>
-      </w:r>
-      <w:proofErr w:type="spellEnd"/>
-      <w:r>
-        <w:t xml:space="preserve">, </w:t>
-      </w:r>
-      <w:proofErr w:type="spellStart"/>
-      <w:r>
-        <w:t>utilizar</w:t>
-      </w:r>
-      <w:proofErr w:type="spellEnd"/>
-      <w:r>
-        <w:t xml:space="preserve"> </w:t>
-      </w:r>
-      <w:proofErr w:type="spellStart"/>
-      <w:r>
-        <w:t>apenas</w:t>
-      </w:r>
-      <w:proofErr w:type="spellEnd"/>
-      <w:r>
-        <w:t xml:space="preserve"> </w:t>
-      </w:r>
-      <w:proofErr w:type="spellStart"/>
-      <w:r>
-        <w:t>uma</w:t>
-      </w:r>
-      <w:proofErr w:type="spellEnd"/>
-      <w:r>
-        <w:t xml:space="preserve"> </w:t>
-      </w:r>
-      <w:proofErr w:type="spellStart"/>
-      <w:r>
-        <w:t>previsão</w:t>
-      </w:r>
-      <w:proofErr w:type="spellEnd"/>
-      <w:r>
-        <w:t xml:space="preserve"> </w:t>
-      </w:r>
-      <w:proofErr w:type="spellStart"/>
-      <w:r>
-        <w:t>estática</w:t>
-      </w:r>
-      <w:proofErr w:type="spellEnd"/>
-      <w:r>
-        <w:t xml:space="preserve"> para </w:t>
-      </w:r>
-      <w:proofErr w:type="spellStart"/>
-      <w:r>
-        <w:t>todo</w:t>
-      </w:r>
-      <w:proofErr w:type="spellEnd"/>
-      <w:r>
-        <w:t xml:space="preserve"> o </w:t>
-      </w:r>
-      <w:proofErr w:type="spellStart"/>
-      <w:r>
-        <w:t>período</w:t>
-      </w:r>
-      <w:proofErr w:type="spellEnd"/>
-      <w:r>
-        <w:t xml:space="preserve"> de teste </w:t>
-      </w:r>
-      <w:proofErr w:type="spellStart"/>
-      <w:r>
-        <w:t>reduz</w:t>
-      </w:r>
-      <w:proofErr w:type="spellEnd"/>
-      <w:r>
-        <w:t xml:space="preserve"> a </w:t>
-      </w:r>
-      <w:proofErr w:type="spellStart"/>
-      <w:r>
-        <w:t>capacidade</w:t>
-      </w:r>
-      <w:proofErr w:type="spellEnd"/>
-      <w:r>
-        <w:t xml:space="preserve"> </w:t>
-      </w:r>
-      <w:r>
+        <w:rPr>
+          <w:lang w:val="pt-BR"/>
+        </w:rPr>
+        <w:t xml:space="preserve"> A melhora obtida pelo Rolling Forecast mostra que a série de tráfego se beneficia da atualização frequente com dados recentes. Como o fluxo rodoviário pode ser afetado por alterações de rotina, feriados, clima e choques pontuais, utilizar apenas uma previsão estática para todo o período de teste reduz a capacidade </w:t>
+      </w:r>
+      <w:r>
+        <w:rPr>
+          <w:lang w:val="pt-BR"/>
+        </w:rPr>
         <w:lastRenderedPageBreak/>
-        <w:t xml:space="preserve">de </w:t>
-      </w:r>
-      <w:proofErr w:type="spellStart"/>
-      <w:r>
-        <w:t>adaptação</w:t>
-      </w:r>
-      <w:proofErr w:type="spellEnd"/>
-      <w:r>
-        <w:t xml:space="preserve"> do </w:t>
-      </w:r>
-      <w:proofErr w:type="spellStart"/>
-      <w:r>
-        <w:t>modelo</w:t>
-      </w:r>
-      <w:proofErr w:type="spellEnd"/>
-      <w:r>
-        <w:t xml:space="preserve">. Assim, o Rolling Forecast </w:t>
-      </w:r>
-      <w:proofErr w:type="spellStart"/>
-      <w:r>
-        <w:t>representa</w:t>
-      </w:r>
-      <w:proofErr w:type="spellEnd"/>
-      <w:r>
-        <w:t xml:space="preserve"> um </w:t>
-      </w:r>
-      <w:proofErr w:type="spellStart"/>
-      <w:r>
-        <w:t>cenário</w:t>
-      </w:r>
-      <w:proofErr w:type="spellEnd"/>
-      <w:r>
-        <w:t xml:space="preserve"> </w:t>
-      </w:r>
-      <w:proofErr w:type="spellStart"/>
-      <w:r>
-        <w:t>mais</w:t>
-      </w:r>
-      <w:proofErr w:type="spellEnd"/>
-      <w:r>
-        <w:t xml:space="preserve"> </w:t>
-      </w:r>
-      <w:proofErr w:type="spellStart"/>
-      <w:r>
-        <w:t>realista</w:t>
-      </w:r>
-      <w:proofErr w:type="spellEnd"/>
-      <w:r>
-        <w:t xml:space="preserve"> de </w:t>
-      </w:r>
-      <w:proofErr w:type="spellStart"/>
-      <w:r>
-        <w:t>uso</w:t>
-      </w:r>
-      <w:proofErr w:type="spellEnd"/>
-      <w:r>
-        <w:t xml:space="preserve"> </w:t>
-      </w:r>
-      <w:proofErr w:type="spellStart"/>
-      <w:r>
-        <w:t>prático</w:t>
-      </w:r>
-      <w:proofErr w:type="spellEnd"/>
-      <w:r>
-        <w:t xml:space="preserve">, pois </w:t>
-      </w:r>
-      <w:proofErr w:type="spellStart"/>
-      <w:r>
-        <w:t>simula</w:t>
-      </w:r>
-      <w:proofErr w:type="spellEnd"/>
-      <w:r>
-        <w:t xml:space="preserve"> </w:t>
-      </w:r>
-      <w:proofErr w:type="gramStart"/>
-      <w:r>
-        <w:t>a</w:t>
-      </w:r>
-      <w:proofErr w:type="gramEnd"/>
-      <w:r>
-        <w:t xml:space="preserve"> </w:t>
-      </w:r>
-      <w:proofErr w:type="spellStart"/>
-      <w:r>
-        <w:t>atualização</w:t>
-      </w:r>
-      <w:proofErr w:type="spellEnd"/>
-      <w:r>
-        <w:t xml:space="preserve"> </w:t>
-      </w:r>
-      <w:proofErr w:type="spellStart"/>
-      <w:r>
-        <w:t>contínua</w:t>
-      </w:r>
-      <w:proofErr w:type="spellEnd"/>
-      <w:r>
-        <w:t xml:space="preserve"> </w:t>
-      </w:r>
-      <w:proofErr w:type="spellStart"/>
-      <w:r>
-        <w:t>que</w:t>
-      </w:r>
-      <w:proofErr w:type="spellEnd"/>
-      <w:r>
-        <w:t xml:space="preserve"> </w:t>
-      </w:r>
-      <w:proofErr w:type="spellStart"/>
-      <w:r>
-        <w:t>ocorreria</w:t>
-      </w:r>
-      <w:proofErr w:type="spellEnd"/>
-      <w:r>
-        <w:t xml:space="preserve"> </w:t>
-      </w:r>
-      <w:proofErr w:type="spellStart"/>
-      <w:r>
-        <w:t>em</w:t>
-      </w:r>
-      <w:proofErr w:type="spellEnd"/>
-      <w:r>
-        <w:t xml:space="preserve"> </w:t>
-      </w:r>
-      <w:proofErr w:type="spellStart"/>
-      <w:r>
-        <w:t>uma</w:t>
-      </w:r>
-      <w:proofErr w:type="spellEnd"/>
-      <w:r>
-        <w:t xml:space="preserve"> </w:t>
-      </w:r>
-      <w:proofErr w:type="spellStart"/>
-      <w:r>
-        <w:t>operação</w:t>
-      </w:r>
-      <w:proofErr w:type="spellEnd"/>
-      <w:r>
-        <w:t xml:space="preserve"> </w:t>
-      </w:r>
-      <w:proofErr w:type="spellStart"/>
-      <w:r>
-        <w:t>diária</w:t>
-      </w:r>
-      <w:proofErr w:type="spellEnd"/>
-      <w:r>
-        <w:t xml:space="preserve"> de </w:t>
-      </w:r>
-      <w:proofErr w:type="spellStart"/>
-      <w:r>
-        <w:t>monitoramento</w:t>
-      </w:r>
-      <w:proofErr w:type="spellEnd"/>
-      <w:r>
-        <w:t xml:space="preserve"> de </w:t>
-      </w:r>
-      <w:proofErr w:type="spellStart"/>
-      <w:r>
-        <w:t>tráfego</w:t>
-      </w:r>
-      <w:proofErr w:type="spellEnd"/>
-      <w:r>
-        <w:t>.</w:t>
+        <w:t>de adaptação do modelo. Assim, o Rolling Forecast representa um cenário mais realista de uso prático, pois simula a atualização contínua que ocorreria em uma operação diária de monitoramento de tráfego.</w:t>
       </w:r>
     </w:p>
     <w:p>
@@ -4540,7 +2670,7 @@
           <w:lang w:val="pt-BR"/>
         </w:rPr>
       </w:pPr>
-      <w:bookmarkStart w:id="9" w:name="_Toc230464597"/>
+      <w:bookmarkStart w:id="9" w:name="_Toc230468959"/>
       <w:r>
         <w:rPr>
           <w:lang w:val="pt-BR"/>
@@ -4622,366 +2752,77 @@
     <w:p>
       <w:pPr>
         <w:jc w:val="both"/>
+        <w:rPr>
+          <w:lang w:val="pt-BR"/>
+        </w:rPr>
       </w:pPr>
-      <w:proofErr w:type="gramStart"/>
-      <w:r>
-        <w:t>A</w:t>
-      </w:r>
-      <w:proofErr w:type="gramEnd"/>
-      <w:r>
-        <w:t xml:space="preserve"> aplicação do Teste de Ljung-Box sobre os resíduos para avaliar a presença de autocorrelação serial restante resultou em um p-value de 0,96 (para o Lag 20), estritamente superior ao limite de 0,05, falhando em rejeitar a hipótese nula de independência de erros e indicando que os resíduos formam, estatisticamente, um ruído branco válido. </w:t>
+      <w:r>
+        <w:rPr>
+          <w:lang w:val="pt-BR"/>
+        </w:rPr>
+        <w:t xml:space="preserve">A aplicação do Teste de </w:t>
       </w:r>
       <w:proofErr w:type="spellStart"/>
       <w:r>
-        <w:t>Isso</w:t>
+        <w:rPr>
+          <w:lang w:val="pt-BR"/>
+        </w:rPr>
+        <w:t>Ljung</w:t>
       </w:r>
       <w:proofErr w:type="spellEnd"/>
       <w:r>
-        <w:t xml:space="preserve"> </w:t>
+        <w:rPr>
+          <w:lang w:val="pt-BR"/>
+        </w:rPr>
+        <w:t>-Box sobre os resíduos para avaliar a presença de autocorrelação serial restante resultou em um p-</w:t>
       </w:r>
       <w:proofErr w:type="spellStart"/>
       <w:r>
-        <w:t>significa</w:t>
+        <w:rPr>
+          <w:lang w:val="pt-BR"/>
+        </w:rPr>
+        <w:t>value</w:t>
       </w:r>
       <w:proofErr w:type="spellEnd"/>
       <w:r>
-        <w:t xml:space="preserve"> </w:t>
+        <w:rPr>
+          <w:lang w:val="pt-BR"/>
+        </w:rPr>
+        <w:t xml:space="preserve"> de 0,96 (para o </w:t>
       </w:r>
       <w:proofErr w:type="spellStart"/>
       <w:r>
-        <w:t>que</w:t>
+        <w:rPr>
+          <w:lang w:val="pt-BR"/>
+        </w:rPr>
+        <w:t>Lag</w:t>
       </w:r>
       <w:proofErr w:type="spellEnd"/>
       <w:r>
-        <w:t xml:space="preserve"> o </w:t>
+        <w:rPr>
+          <w:lang w:val="pt-BR"/>
+        </w:rPr>
+        <w:t xml:space="preserve"> 20), estritamente superior ao limite de 0,05, falhando em rejeitar a hipótese nula de independência de erros e indicando que os resíduos formam, estatisticamente, um ruído branco válido. </w:t>
+      </w:r>
+      <w:r>
+        <w:rPr>
+          <w:lang w:val="pt-BR"/>
+        </w:rPr>
+        <w:t xml:space="preserve">Isso significa que o modelo conseguiu capturar a maior parte da estrutura temporal linear presente na série, restando nos resíduos apenas variações aleatórias ou fatores externos não modelados. Como a ACF dos resíduos não apresentou autocorrelações relevantes e o teste de </w:t>
       </w:r>
       <w:proofErr w:type="spellStart"/>
       <w:r>
-        <w:t>modelo</w:t>
+        <w:rPr>
+          <w:lang w:val="pt-BR"/>
+        </w:rPr>
+        <w:t>Ljung</w:t>
       </w:r>
       <w:proofErr w:type="spellEnd"/>
       <w:r>
-        <w:t xml:space="preserve"> </w:t>
-      </w:r>
-      <w:proofErr w:type="spellStart"/>
-      <w:r>
-        <w:t>conseguiu</w:t>
-      </w:r>
-      <w:proofErr w:type="spellEnd"/>
-      <w:r>
-        <w:t xml:space="preserve"> </w:t>
-      </w:r>
-      <w:proofErr w:type="spellStart"/>
-      <w:r>
-        <w:t>capturar</w:t>
-      </w:r>
-      <w:proofErr w:type="spellEnd"/>
-      <w:r>
-        <w:t xml:space="preserve"> a </w:t>
-      </w:r>
-      <w:proofErr w:type="spellStart"/>
-      <w:r>
-        <w:t>maior</w:t>
-      </w:r>
-      <w:proofErr w:type="spellEnd"/>
-      <w:r>
-        <w:t xml:space="preserve"> </w:t>
-      </w:r>
-      <w:proofErr w:type="spellStart"/>
-      <w:r>
-        <w:t>parte</w:t>
-      </w:r>
-      <w:proofErr w:type="spellEnd"/>
-      <w:r>
-        <w:t xml:space="preserve"> da </w:t>
-      </w:r>
-      <w:proofErr w:type="spellStart"/>
-      <w:r>
-        <w:t>estrutura</w:t>
-      </w:r>
-      <w:proofErr w:type="spellEnd"/>
-      <w:r>
-        <w:t xml:space="preserve"> temporal linear </w:t>
-      </w:r>
-      <w:proofErr w:type="spellStart"/>
-      <w:r>
-        <w:t>presente</w:t>
-      </w:r>
-      <w:proofErr w:type="spellEnd"/>
-      <w:r>
-        <w:t xml:space="preserve"> </w:t>
-      </w:r>
-      <w:proofErr w:type="spellStart"/>
-      <w:r>
-        <w:t>na</w:t>
-      </w:r>
-      <w:proofErr w:type="spellEnd"/>
-      <w:r>
-        <w:t xml:space="preserve"> </w:t>
-      </w:r>
-      <w:proofErr w:type="spellStart"/>
-      <w:r>
-        <w:t>série</w:t>
-      </w:r>
-      <w:proofErr w:type="spellEnd"/>
-      <w:r>
-        <w:t xml:space="preserve">, </w:t>
-      </w:r>
-      <w:proofErr w:type="spellStart"/>
-      <w:r>
-        <w:t>restando</w:t>
-      </w:r>
-      <w:proofErr w:type="spellEnd"/>
-      <w:r>
-        <w:t xml:space="preserve"> </w:t>
-      </w:r>
-      <w:proofErr w:type="spellStart"/>
-      <w:r>
-        <w:t>nos</w:t>
-      </w:r>
-      <w:proofErr w:type="spellEnd"/>
-      <w:r>
-        <w:t xml:space="preserve"> </w:t>
-      </w:r>
-      <w:proofErr w:type="spellStart"/>
-      <w:r>
-        <w:t>resíduos</w:t>
-      </w:r>
-      <w:proofErr w:type="spellEnd"/>
-      <w:r>
-        <w:t xml:space="preserve"> </w:t>
-      </w:r>
-      <w:proofErr w:type="spellStart"/>
-      <w:r>
-        <w:t>apenas</w:t>
-      </w:r>
-      <w:proofErr w:type="spellEnd"/>
-      <w:r>
-        <w:t xml:space="preserve"> </w:t>
-      </w:r>
-      <w:proofErr w:type="spellStart"/>
-      <w:r>
-        <w:t>variações</w:t>
-      </w:r>
-      <w:proofErr w:type="spellEnd"/>
-      <w:r>
-        <w:t xml:space="preserve"> </w:t>
-      </w:r>
-      <w:proofErr w:type="spellStart"/>
-      <w:r>
-        <w:t>aleatórias</w:t>
-      </w:r>
-      <w:proofErr w:type="spellEnd"/>
-      <w:r>
-        <w:t xml:space="preserve"> </w:t>
-      </w:r>
-      <w:proofErr w:type="spellStart"/>
-      <w:r>
-        <w:t>ou</w:t>
-      </w:r>
-      <w:proofErr w:type="spellEnd"/>
-      <w:r>
-        <w:t xml:space="preserve"> </w:t>
-      </w:r>
-      <w:proofErr w:type="spellStart"/>
-      <w:r>
-        <w:t>fatores</w:t>
-      </w:r>
-      <w:proofErr w:type="spellEnd"/>
-      <w:r>
-        <w:t xml:space="preserve"> </w:t>
-      </w:r>
-      <w:proofErr w:type="spellStart"/>
-      <w:r>
-        <w:t>externos</w:t>
-      </w:r>
-      <w:proofErr w:type="spellEnd"/>
-      <w:r>
-        <w:t xml:space="preserve"> </w:t>
-      </w:r>
-      <w:proofErr w:type="spellStart"/>
-      <w:r>
-        <w:t>não</w:t>
-      </w:r>
-      <w:proofErr w:type="spellEnd"/>
-      <w:r>
-        <w:t xml:space="preserve"> </w:t>
-      </w:r>
-      <w:proofErr w:type="spellStart"/>
-      <w:r>
-        <w:t>modelados</w:t>
-      </w:r>
-      <w:proofErr w:type="spellEnd"/>
-      <w:r>
-        <w:t xml:space="preserve">. Como a ACF dos </w:t>
-      </w:r>
-      <w:proofErr w:type="spellStart"/>
-      <w:r>
-        <w:t>resíduos</w:t>
-      </w:r>
-      <w:proofErr w:type="spellEnd"/>
-      <w:r>
-        <w:t xml:space="preserve"> </w:t>
-      </w:r>
-      <w:proofErr w:type="spellStart"/>
-      <w:r>
-        <w:t>não</w:t>
-      </w:r>
-      <w:proofErr w:type="spellEnd"/>
-      <w:r>
-        <w:t xml:space="preserve"> </w:t>
-      </w:r>
-      <w:proofErr w:type="spellStart"/>
-      <w:r>
-        <w:t>apresentou</w:t>
-      </w:r>
-      <w:proofErr w:type="spellEnd"/>
-      <w:r>
-        <w:t xml:space="preserve"> </w:t>
-      </w:r>
-      <w:proofErr w:type="spellStart"/>
-      <w:r>
-        <w:t>autocorrelações</w:t>
-      </w:r>
-      <w:proofErr w:type="spellEnd"/>
-      <w:r>
-        <w:t xml:space="preserve"> </w:t>
-      </w:r>
-      <w:proofErr w:type="spellStart"/>
-      <w:r>
-        <w:t>relevantes</w:t>
-      </w:r>
-      <w:proofErr w:type="spellEnd"/>
-      <w:r>
-        <w:t xml:space="preserve"> e o teste de Ljung-Box </w:t>
-      </w:r>
-      <w:proofErr w:type="spellStart"/>
-      <w:r>
-        <w:t>não</w:t>
-      </w:r>
-      <w:proofErr w:type="spellEnd"/>
-      <w:r>
-        <w:t xml:space="preserve"> </w:t>
-      </w:r>
-      <w:proofErr w:type="spellStart"/>
-      <w:r>
-        <w:t>indicou</w:t>
-      </w:r>
-      <w:proofErr w:type="spellEnd"/>
-      <w:r>
-        <w:t xml:space="preserve"> </w:t>
-      </w:r>
-      <w:proofErr w:type="spellStart"/>
-      <w:r>
-        <w:t>dependência</w:t>
-      </w:r>
-      <w:proofErr w:type="spellEnd"/>
-      <w:r>
-        <w:t xml:space="preserve"> serial </w:t>
-      </w:r>
-      <w:proofErr w:type="spellStart"/>
-      <w:r>
-        <w:t>significativa</w:t>
-      </w:r>
-      <w:proofErr w:type="spellEnd"/>
-      <w:r>
-        <w:t xml:space="preserve">, </w:t>
-      </w:r>
-      <w:proofErr w:type="spellStart"/>
-      <w:r>
-        <w:t>não</w:t>
-      </w:r>
-      <w:proofErr w:type="spellEnd"/>
-      <w:r>
-        <w:t xml:space="preserve"> </w:t>
-      </w:r>
-      <w:proofErr w:type="spellStart"/>
-      <w:r>
-        <w:t>há</w:t>
-      </w:r>
-      <w:proofErr w:type="spellEnd"/>
-      <w:r>
-        <w:t xml:space="preserve"> </w:t>
-      </w:r>
-      <w:proofErr w:type="spellStart"/>
-      <w:r>
-        <w:t>evidências</w:t>
-      </w:r>
-      <w:proofErr w:type="spellEnd"/>
-      <w:r>
-        <w:t xml:space="preserve"> fortes de </w:t>
-      </w:r>
-      <w:proofErr w:type="spellStart"/>
-      <w:r>
-        <w:t>que</w:t>
-      </w:r>
-      <w:proofErr w:type="spellEnd"/>
-      <w:r>
-        <w:t xml:space="preserve"> o </w:t>
-      </w:r>
-      <w:proofErr w:type="spellStart"/>
-      <w:r>
-        <w:t>modelo</w:t>
-      </w:r>
-      <w:proofErr w:type="spellEnd"/>
-      <w:r>
-        <w:t xml:space="preserve"> </w:t>
-      </w:r>
-      <w:proofErr w:type="spellStart"/>
-      <w:r>
-        <w:t>tenha</w:t>
-      </w:r>
-      <w:proofErr w:type="spellEnd"/>
-      <w:r>
-        <w:t xml:space="preserve"> </w:t>
-      </w:r>
-      <w:proofErr w:type="spellStart"/>
-      <w:r>
-        <w:t>deixado</w:t>
-      </w:r>
-      <w:proofErr w:type="spellEnd"/>
-      <w:r>
-        <w:t xml:space="preserve"> </w:t>
-      </w:r>
-      <w:proofErr w:type="spellStart"/>
-      <w:r>
-        <w:t>padrões</w:t>
-      </w:r>
-      <w:proofErr w:type="spellEnd"/>
-      <w:r>
-        <w:t xml:space="preserve"> </w:t>
-      </w:r>
-      <w:proofErr w:type="spellStart"/>
-      <w:r>
-        <w:t>temporais</w:t>
-      </w:r>
-      <w:proofErr w:type="spellEnd"/>
-      <w:r>
-        <w:t xml:space="preserve"> </w:t>
-      </w:r>
-      <w:proofErr w:type="spellStart"/>
-      <w:r>
-        <w:t>importantes</w:t>
-      </w:r>
-      <w:proofErr w:type="spellEnd"/>
-      <w:r>
-        <w:t xml:space="preserve"> </w:t>
-      </w:r>
-      <w:proofErr w:type="spellStart"/>
-      <w:r>
-        <w:t>sem</w:t>
-      </w:r>
-      <w:proofErr w:type="spellEnd"/>
-      <w:r>
-        <w:t xml:space="preserve"> </w:t>
-      </w:r>
-      <w:proofErr w:type="spellStart"/>
-      <w:r>
-        <w:t>capturar</w:t>
-      </w:r>
-      <w:proofErr w:type="spellEnd"/>
-      <w:r>
-        <w:t>.</w:t>
+        <w:rPr>
+          <w:lang w:val="pt-BR"/>
+        </w:rPr>
+        <w:t>-Box não indicou dependência serial significativa, não há evidências fortes de que o modelo tenha deixado padrões temporais importantes sem capturar.</w:t>
       </w:r>
     </w:p>
     <w:p>
@@ -4992,31 +2833,10 @@
         </w:rPr>
       </w:pPr>
       <w:r>
-        <w:t xml:space="preserve">Sob a </w:t>
-      </w:r>
-      <w:proofErr w:type="spellStart"/>
-      <w:r>
-        <w:t>ótica</w:t>
-      </w:r>
-      <w:proofErr w:type="spellEnd"/>
-      <w:r>
-        <w:t xml:space="preserve"> pura dos dados, esse resultado revela que </w:t>
-      </w:r>
-      <w:proofErr w:type="gramStart"/>
-      <w:r>
-        <w:t>a</w:t>
-      </w:r>
-      <w:proofErr w:type="gramEnd"/>
-      <w:r>
-        <w:t xml:space="preserve"> estrutura do SARIMA obteve excelência matemática, capturando virtualmente toda </w:t>
-      </w:r>
-      <w:proofErr w:type="gramStart"/>
-      <w:r>
-        <w:t>a</w:t>
-      </w:r>
-      <w:proofErr w:type="gramEnd"/>
-      <w:r>
-        <w:t xml:space="preserve"> informação temporal linear endógena disponível.</w:t>
+        <w:rPr>
+          <w:lang w:val="pt-BR"/>
+        </w:rPr>
+        <w:t>Sob a ótica pura dos dados, esse resultado revela que a estrutura do SARIMA obteve excelência matemática, capturando virtualmente toda a informação temporal linear endógena disponível.</w:t>
       </w:r>
     </w:p>
     <w:p>
@@ -5054,7 +2874,7 @@
           <w:lang w:val="pt-BR"/>
         </w:rPr>
       </w:pPr>
-      <w:bookmarkStart w:id="10" w:name="_Toc230464598"/>
+      <w:bookmarkStart w:id="10" w:name="_Toc230468960"/>
       <w:r>
         <w:rPr>
           <w:rFonts w:ascii="Arial" w:hAnsi="Arial"/>
@@ -5079,287 +2899,38 @@
         <w:t xml:space="preserve">A modelagem preditiva avançada aplicada ao fluxo diário de tráfego na rodovia interestadual I-94 permitiu traçar diagnósticos e decisões cruciais para a concessionária rodoviária e para o planejamento de trânsito regional. </w:t>
       </w:r>
       <w:r>
-        <w:t xml:space="preserve">O </w:t>
+        <w:rPr>
+          <w:lang w:val="pt-BR"/>
+        </w:rPr>
+        <w:t xml:space="preserve">O modelo SARIMA com Rolling Forecast demonstrou o melhor desempenho geral entre as abordagens avaliadas, apresentando o menor MAE no conjunto de teste. Entretanto, é importante destacar que o SARIMA em sua versão estática não superou todos os modelos simples, ficando atrás do </w:t>
       </w:r>
       <w:proofErr w:type="spellStart"/>
       <w:r>
-        <w:t>modelo</w:t>
+        <w:rPr>
+          <w:lang w:val="pt-BR"/>
+        </w:rPr>
+        <w:t>Seasonal</w:t>
       </w:r>
       <w:proofErr w:type="spellEnd"/>
       <w:r>
-        <w:t xml:space="preserve"> SARIMA com Rolling Forecast </w:t>
+        <w:rPr>
+          <w:lang w:val="pt-BR"/>
+        </w:rPr>
+        <w:t xml:space="preserve"> </w:t>
       </w:r>
       <w:proofErr w:type="spellStart"/>
       <w:r>
-        <w:t>demonstrou</w:t>
+        <w:rPr>
+          <w:lang w:val="pt-BR"/>
+        </w:rPr>
+        <w:t>Naive</w:t>
       </w:r>
       <w:proofErr w:type="spellEnd"/>
       <w:r>
-        <w:t xml:space="preserve"> o </w:t>
-      </w:r>
-      <w:proofErr w:type="spellStart"/>
-      <w:r>
-        <w:t>melhor</w:t>
-      </w:r>
-      <w:proofErr w:type="spellEnd"/>
-      <w:r>
-        <w:t xml:space="preserve"> </w:t>
-      </w:r>
-      <w:proofErr w:type="spellStart"/>
-      <w:r>
-        <w:t>desempenho</w:t>
-      </w:r>
-      <w:proofErr w:type="spellEnd"/>
-      <w:r>
-        <w:t xml:space="preserve"> </w:t>
-      </w:r>
-      <w:proofErr w:type="spellStart"/>
-      <w:r>
-        <w:t>geral</w:t>
-      </w:r>
-      <w:proofErr w:type="spellEnd"/>
-      <w:r>
-        <w:t xml:space="preserve"> entre as </w:t>
-      </w:r>
-      <w:proofErr w:type="spellStart"/>
-      <w:r>
-        <w:t>abordagens</w:t>
-      </w:r>
-      <w:proofErr w:type="spellEnd"/>
-      <w:r>
-        <w:t xml:space="preserve"> </w:t>
-      </w:r>
-      <w:proofErr w:type="spellStart"/>
-      <w:r>
-        <w:t>avaliadas</w:t>
-      </w:r>
-      <w:proofErr w:type="spellEnd"/>
-      <w:r>
-        <w:t xml:space="preserve">, </w:t>
-      </w:r>
-      <w:proofErr w:type="spellStart"/>
-      <w:r>
-        <w:t>apresentando</w:t>
-      </w:r>
-      <w:proofErr w:type="spellEnd"/>
-      <w:r>
-        <w:t xml:space="preserve"> o </w:t>
-      </w:r>
-      <w:proofErr w:type="spellStart"/>
-      <w:r>
-        <w:t>menor</w:t>
-      </w:r>
-      <w:proofErr w:type="spellEnd"/>
-      <w:r>
-        <w:t xml:space="preserve"> MAE no conjunto de teste. </w:t>
-      </w:r>
-      <w:proofErr w:type="spellStart"/>
-      <w:r>
-        <w:t>Entretanto</w:t>
-      </w:r>
-      <w:proofErr w:type="spellEnd"/>
-      <w:r>
-        <w:t xml:space="preserve">, é </w:t>
-      </w:r>
-      <w:proofErr w:type="spellStart"/>
-      <w:r>
-        <w:t>importante</w:t>
-      </w:r>
-      <w:proofErr w:type="spellEnd"/>
-      <w:r>
-        <w:t xml:space="preserve"> </w:t>
-      </w:r>
-      <w:proofErr w:type="spellStart"/>
-      <w:r>
-        <w:t>destacar</w:t>
-      </w:r>
-      <w:proofErr w:type="spellEnd"/>
-      <w:r>
-        <w:t xml:space="preserve"> </w:t>
-      </w:r>
-      <w:proofErr w:type="spellStart"/>
-      <w:r>
-        <w:t>que</w:t>
-      </w:r>
-      <w:proofErr w:type="spellEnd"/>
-      <w:r>
-        <w:t xml:space="preserve"> </w:t>
-      </w:r>
-      <w:proofErr w:type="spellStart"/>
-      <w:r>
-        <w:t>o</w:t>
-      </w:r>
-      <w:proofErr w:type="spellEnd"/>
-      <w:r>
-        <w:t xml:space="preserve"> SARIMA </w:t>
-      </w:r>
-      <w:proofErr w:type="spellStart"/>
-      <w:r>
-        <w:t>em</w:t>
-      </w:r>
-      <w:proofErr w:type="spellEnd"/>
-      <w:r>
-        <w:t xml:space="preserve"> </w:t>
-      </w:r>
-      <w:proofErr w:type="spellStart"/>
-      <w:r>
-        <w:t>sua</w:t>
-      </w:r>
-      <w:proofErr w:type="spellEnd"/>
-      <w:r>
-        <w:t xml:space="preserve"> </w:t>
-      </w:r>
-      <w:proofErr w:type="spellStart"/>
-      <w:r>
-        <w:t>versão</w:t>
-      </w:r>
-      <w:proofErr w:type="spellEnd"/>
-      <w:r>
-        <w:t xml:space="preserve"> </w:t>
-      </w:r>
-      <w:proofErr w:type="spellStart"/>
-      <w:r>
-        <w:t>estática</w:t>
-      </w:r>
-      <w:proofErr w:type="spellEnd"/>
-      <w:r>
-        <w:t xml:space="preserve"> </w:t>
-      </w:r>
-      <w:proofErr w:type="spellStart"/>
-      <w:r>
-        <w:t>não</w:t>
-      </w:r>
-      <w:proofErr w:type="spellEnd"/>
-      <w:r>
-        <w:t xml:space="preserve"> </w:t>
-      </w:r>
-      <w:proofErr w:type="spellStart"/>
-      <w:r>
-        <w:t>superou</w:t>
-      </w:r>
-      <w:proofErr w:type="spellEnd"/>
-      <w:r>
-        <w:t xml:space="preserve"> </w:t>
-      </w:r>
-      <w:proofErr w:type="spellStart"/>
-      <w:r>
-        <w:t>todos</w:t>
-      </w:r>
-      <w:proofErr w:type="spellEnd"/>
-      <w:r>
-        <w:t xml:space="preserve"> </w:t>
-      </w:r>
-      <w:proofErr w:type="spellStart"/>
-      <w:r>
-        <w:t>os</w:t>
-      </w:r>
-      <w:proofErr w:type="spellEnd"/>
-      <w:r>
-        <w:t xml:space="preserve"> </w:t>
-      </w:r>
-      <w:proofErr w:type="spellStart"/>
-      <w:r>
-        <w:t>modelos</w:t>
-      </w:r>
-      <w:proofErr w:type="spellEnd"/>
-      <w:r>
-        <w:t xml:space="preserve"> simples, </w:t>
-      </w:r>
-      <w:proofErr w:type="spellStart"/>
-      <w:r>
-        <w:t>ficando</w:t>
-      </w:r>
-      <w:proofErr w:type="spellEnd"/>
-      <w:r>
-        <w:t xml:space="preserve"> atrás do Seasonal Naive. Dessa forma, a </w:t>
-      </w:r>
-      <w:proofErr w:type="spellStart"/>
-      <w:r>
-        <w:t>superioridade</w:t>
-      </w:r>
-      <w:proofErr w:type="spellEnd"/>
-      <w:r>
-        <w:t xml:space="preserve"> do SARIMA se </w:t>
-      </w:r>
-      <w:proofErr w:type="spellStart"/>
-      <w:r>
-        <w:t>confirmou</w:t>
-      </w:r>
-      <w:proofErr w:type="spellEnd"/>
-      <w:r>
-        <w:t xml:space="preserve"> </w:t>
-      </w:r>
-      <w:proofErr w:type="spellStart"/>
-      <w:r>
-        <w:t>principalmente</w:t>
-      </w:r>
-      <w:proofErr w:type="spellEnd"/>
-      <w:r>
-        <w:t xml:space="preserve"> </w:t>
-      </w:r>
-      <w:proofErr w:type="spellStart"/>
-      <w:r>
-        <w:t>quando</w:t>
-      </w:r>
-      <w:proofErr w:type="spellEnd"/>
-      <w:r>
-        <w:t xml:space="preserve"> </w:t>
-      </w:r>
-      <w:proofErr w:type="spellStart"/>
-      <w:r>
-        <w:t>aplicado</w:t>
-      </w:r>
-      <w:proofErr w:type="spellEnd"/>
-      <w:r>
-        <w:t xml:space="preserve"> </w:t>
-      </w:r>
-      <w:proofErr w:type="spellStart"/>
-      <w:r>
-        <w:t>em</w:t>
-      </w:r>
-      <w:proofErr w:type="spellEnd"/>
-      <w:r>
-        <w:t xml:space="preserve"> </w:t>
-      </w:r>
-      <w:proofErr w:type="spellStart"/>
-      <w:r>
-        <w:t>uma</w:t>
-      </w:r>
-      <w:proofErr w:type="spellEnd"/>
-      <w:r>
-        <w:t xml:space="preserve"> </w:t>
-      </w:r>
-      <w:proofErr w:type="spellStart"/>
-      <w:r>
-        <w:t>estratégia</w:t>
-      </w:r>
-      <w:proofErr w:type="spellEnd"/>
-      <w:r>
-        <w:t xml:space="preserve"> </w:t>
-      </w:r>
-      <w:proofErr w:type="spellStart"/>
-      <w:r>
-        <w:t>dinâmica</w:t>
-      </w:r>
-      <w:proofErr w:type="spellEnd"/>
-      <w:r>
-        <w:t xml:space="preserve"> de </w:t>
-      </w:r>
-      <w:proofErr w:type="spellStart"/>
-      <w:r>
-        <w:t>atualização</w:t>
-      </w:r>
-      <w:proofErr w:type="spellEnd"/>
-      <w:r>
-        <w:t xml:space="preserve"> </w:t>
-      </w:r>
-      <w:proofErr w:type="spellStart"/>
-      <w:r>
-        <w:t>contínua</w:t>
-      </w:r>
-      <w:proofErr w:type="spellEnd"/>
-      <w:r>
-        <w:t>.</w:t>
+        <w:rPr>
+          <w:lang w:val="pt-BR"/>
+        </w:rPr>
+        <w:t>. Dessa forma, a superioridade do SARIMA se confirmou principalmente quando aplicado em uma estratégia dinâmica de atualização contínua.</w:t>
       </w:r>
     </w:p>
     <w:p>
@@ -5469,415 +3040,24 @@
         </w:rPr>
       </w:pPr>
       <w:r>
-        <w:t xml:space="preserve">Como </w:t>
+        <w:rPr>
+          <w:lang w:val="pt-BR"/>
+        </w:rPr>
+        <w:t xml:space="preserve">Como limitação, o estudo utilizou uma abordagem </w:t>
       </w:r>
       <w:proofErr w:type="spellStart"/>
       <w:r>
-        <w:t>limitação</w:t>
+        <w:rPr>
+          <w:lang w:val="pt-BR"/>
+        </w:rPr>
+        <w:t>univariada</w:t>
       </w:r>
       <w:proofErr w:type="spellEnd"/>
       <w:r>
-        <w:t xml:space="preserve">, o </w:t>
-      </w:r>
-      <w:proofErr w:type="spellStart"/>
-      <w:r>
-        <w:t>estudo</w:t>
-      </w:r>
-      <w:proofErr w:type="spellEnd"/>
-      <w:r>
-        <w:t xml:space="preserve"> </w:t>
-      </w:r>
-      <w:proofErr w:type="spellStart"/>
-      <w:r>
-        <w:t>utilizou</w:t>
-      </w:r>
-      <w:proofErr w:type="spellEnd"/>
-      <w:r>
-        <w:t xml:space="preserve"> </w:t>
-      </w:r>
-      <w:proofErr w:type="spellStart"/>
-      <w:r>
-        <w:t>uma</w:t>
-      </w:r>
-      <w:proofErr w:type="spellEnd"/>
-      <w:r>
-        <w:t xml:space="preserve"> </w:t>
-      </w:r>
-      <w:proofErr w:type="spellStart"/>
-      <w:r>
-        <w:t>abordagem</w:t>
-      </w:r>
-      <w:proofErr w:type="spellEnd"/>
-      <w:r>
-        <w:t xml:space="preserve"> </w:t>
-      </w:r>
-      <w:proofErr w:type="spellStart"/>
-      <w:r>
-        <w:t>univariada</w:t>
-      </w:r>
-      <w:proofErr w:type="spellEnd"/>
-      <w:r>
-        <w:t xml:space="preserve">, </w:t>
-      </w:r>
-      <w:proofErr w:type="spellStart"/>
-      <w:r>
-        <w:t>baseada</w:t>
-      </w:r>
-      <w:proofErr w:type="spellEnd"/>
-      <w:r>
-        <w:t xml:space="preserve"> </w:t>
-      </w:r>
-      <w:proofErr w:type="spellStart"/>
-      <w:r>
-        <w:t>apenas</w:t>
-      </w:r>
-      <w:proofErr w:type="spellEnd"/>
-      <w:r>
-        <w:t xml:space="preserve"> no histórico do </w:t>
-      </w:r>
-      <w:proofErr w:type="spellStart"/>
-      <w:r>
-        <w:t>próprio</w:t>
-      </w:r>
-      <w:proofErr w:type="spellEnd"/>
-      <w:r>
-        <w:t xml:space="preserve"> </w:t>
-      </w:r>
-      <w:proofErr w:type="spellStart"/>
-      <w:r>
-        <w:t>tráfego</w:t>
-      </w:r>
-      <w:proofErr w:type="spellEnd"/>
-      <w:r>
-        <w:t xml:space="preserve">. </w:t>
-      </w:r>
-      <w:proofErr w:type="spellStart"/>
-      <w:r>
-        <w:t>Embora</w:t>
-      </w:r>
-      <w:proofErr w:type="spellEnd"/>
-      <w:r>
-        <w:t xml:space="preserve"> </w:t>
-      </w:r>
-      <w:proofErr w:type="spellStart"/>
-      <w:r>
-        <w:t>isso</w:t>
-      </w:r>
-      <w:proofErr w:type="spellEnd"/>
-      <w:r>
-        <w:t xml:space="preserve"> </w:t>
-      </w:r>
-      <w:proofErr w:type="spellStart"/>
-      <w:r>
-        <w:t>tenha</w:t>
-      </w:r>
-      <w:proofErr w:type="spellEnd"/>
-      <w:r>
-        <w:t xml:space="preserve"> </w:t>
-      </w:r>
-      <w:proofErr w:type="spellStart"/>
-      <w:r>
-        <w:t>permitido</w:t>
-      </w:r>
-      <w:proofErr w:type="spellEnd"/>
-      <w:r>
-        <w:t xml:space="preserve"> </w:t>
-      </w:r>
-      <w:proofErr w:type="spellStart"/>
-      <w:r>
-        <w:t>capturar</w:t>
-      </w:r>
-      <w:proofErr w:type="spellEnd"/>
-      <w:r>
-        <w:t xml:space="preserve"> </w:t>
-      </w:r>
-      <w:proofErr w:type="spellStart"/>
-      <w:r>
-        <w:t>padrões</w:t>
-      </w:r>
-      <w:proofErr w:type="spellEnd"/>
-      <w:r>
-        <w:t xml:space="preserve"> </w:t>
-      </w:r>
-      <w:proofErr w:type="spellStart"/>
-      <w:r>
-        <w:t>temporais</w:t>
-      </w:r>
-      <w:proofErr w:type="spellEnd"/>
-      <w:r>
-        <w:t xml:space="preserve"> </w:t>
-      </w:r>
-      <w:proofErr w:type="spellStart"/>
-      <w:r>
-        <w:t>relevantes</w:t>
-      </w:r>
-      <w:proofErr w:type="spellEnd"/>
-      <w:r>
-        <w:t xml:space="preserve">, </w:t>
-      </w:r>
-      <w:proofErr w:type="spellStart"/>
-      <w:r>
-        <w:t>fatores</w:t>
-      </w:r>
-      <w:proofErr w:type="spellEnd"/>
-      <w:r>
-        <w:t xml:space="preserve"> </w:t>
-      </w:r>
-      <w:proofErr w:type="spellStart"/>
-      <w:r>
-        <w:t>externos</w:t>
-      </w:r>
-      <w:proofErr w:type="spellEnd"/>
-      <w:r>
-        <w:t xml:space="preserve"> </w:t>
-      </w:r>
-      <w:proofErr w:type="spellStart"/>
-      <w:r>
-        <w:t>como</w:t>
-      </w:r>
-      <w:proofErr w:type="spellEnd"/>
-      <w:r>
-        <w:t xml:space="preserve"> </w:t>
-      </w:r>
-      <w:proofErr w:type="spellStart"/>
-      <w:r>
-        <w:t>acidentes</w:t>
-      </w:r>
-      <w:proofErr w:type="spellEnd"/>
-      <w:r>
-        <w:t xml:space="preserve">, </w:t>
-      </w:r>
-      <w:proofErr w:type="spellStart"/>
-      <w:r>
-        <w:t>interdições</w:t>
-      </w:r>
-      <w:proofErr w:type="spellEnd"/>
-      <w:r>
-        <w:t xml:space="preserve">, </w:t>
-      </w:r>
-      <w:proofErr w:type="spellStart"/>
-      <w:r>
-        <w:t>feriados</w:t>
-      </w:r>
-      <w:proofErr w:type="spellEnd"/>
-      <w:r>
-        <w:t xml:space="preserve">, </w:t>
-      </w:r>
-      <w:proofErr w:type="spellStart"/>
-      <w:r>
-        <w:t>eventos</w:t>
-      </w:r>
-      <w:proofErr w:type="spellEnd"/>
-      <w:r>
-        <w:t xml:space="preserve"> </w:t>
-      </w:r>
-      <w:proofErr w:type="spellStart"/>
-      <w:r>
-        <w:t>climáticos</w:t>
-      </w:r>
-      <w:proofErr w:type="spellEnd"/>
-      <w:r>
-        <w:t xml:space="preserve"> </w:t>
-      </w:r>
-      <w:proofErr w:type="spellStart"/>
-      <w:r>
-        <w:t>severos</w:t>
-      </w:r>
-      <w:proofErr w:type="spellEnd"/>
-      <w:r>
-        <w:t xml:space="preserve"> e </w:t>
-      </w:r>
-      <w:proofErr w:type="spellStart"/>
-      <w:r>
-        <w:t>mudanças</w:t>
-      </w:r>
-      <w:proofErr w:type="spellEnd"/>
-      <w:r>
-        <w:t xml:space="preserve"> </w:t>
-      </w:r>
-      <w:proofErr w:type="spellStart"/>
-      <w:r>
-        <w:t>operacionais</w:t>
-      </w:r>
-      <w:proofErr w:type="spellEnd"/>
-      <w:r>
-        <w:t xml:space="preserve"> da </w:t>
-      </w:r>
-      <w:proofErr w:type="spellStart"/>
-      <w:r>
-        <w:t>rodovia</w:t>
-      </w:r>
-      <w:proofErr w:type="spellEnd"/>
-      <w:r>
-        <w:t xml:space="preserve"> </w:t>
-      </w:r>
-      <w:proofErr w:type="spellStart"/>
-      <w:r>
-        <w:t>não</w:t>
-      </w:r>
-      <w:proofErr w:type="spellEnd"/>
-      <w:r>
-        <w:t xml:space="preserve"> </w:t>
-      </w:r>
-      <w:proofErr w:type="spellStart"/>
-      <w:r>
-        <w:t>foram</w:t>
-      </w:r>
-      <w:proofErr w:type="spellEnd"/>
-      <w:r>
-        <w:t xml:space="preserve"> </w:t>
-      </w:r>
-      <w:proofErr w:type="spellStart"/>
-      <w:r>
-        <w:t>incorporados</w:t>
-      </w:r>
-      <w:proofErr w:type="spellEnd"/>
-      <w:r>
-        <w:t xml:space="preserve"> </w:t>
-      </w:r>
-      <w:proofErr w:type="spellStart"/>
-      <w:r>
-        <w:t>diretamente</w:t>
-      </w:r>
-      <w:proofErr w:type="spellEnd"/>
-      <w:r>
-        <w:t xml:space="preserve"> </w:t>
-      </w:r>
-      <w:proofErr w:type="spellStart"/>
-      <w:r>
-        <w:t>ao</w:t>
-      </w:r>
-      <w:proofErr w:type="spellEnd"/>
-      <w:r>
-        <w:t xml:space="preserve"> </w:t>
-      </w:r>
-      <w:proofErr w:type="spellStart"/>
-      <w:r>
-        <w:t>modelo</w:t>
-      </w:r>
-      <w:proofErr w:type="spellEnd"/>
-      <w:r>
-        <w:t xml:space="preserve">. Para </w:t>
-      </w:r>
-      <w:proofErr w:type="spellStart"/>
-      <w:r>
-        <w:t>trabalhos</w:t>
-      </w:r>
-      <w:proofErr w:type="spellEnd"/>
-      <w:r>
-        <w:t xml:space="preserve"> </w:t>
-      </w:r>
-      <w:proofErr w:type="spellStart"/>
-      <w:r>
-        <w:t>futuros</w:t>
-      </w:r>
-      <w:proofErr w:type="spellEnd"/>
-      <w:r>
-        <w:t xml:space="preserve">, </w:t>
-      </w:r>
-      <w:proofErr w:type="spellStart"/>
-      <w:r>
-        <w:t>recomenda</w:t>
-      </w:r>
-      <w:proofErr w:type="spellEnd"/>
-      <w:r>
-        <w:t xml:space="preserve">-se </w:t>
-      </w:r>
-      <w:proofErr w:type="spellStart"/>
-      <w:r>
-        <w:t>testar</w:t>
-      </w:r>
-      <w:proofErr w:type="spellEnd"/>
-      <w:r>
-        <w:t xml:space="preserve"> </w:t>
-      </w:r>
-      <w:proofErr w:type="spellStart"/>
-      <w:r>
-        <w:t>modelos</w:t>
-      </w:r>
-      <w:proofErr w:type="spellEnd"/>
-      <w:r>
-        <w:t xml:space="preserve"> com </w:t>
-      </w:r>
-      <w:proofErr w:type="spellStart"/>
-      <w:r>
-        <w:t>variáveis</w:t>
-      </w:r>
-      <w:proofErr w:type="spellEnd"/>
-      <w:r>
-        <w:t xml:space="preserve"> </w:t>
-      </w:r>
-      <w:proofErr w:type="spellStart"/>
-      <w:r>
-        <w:t>exógenas</w:t>
-      </w:r>
-      <w:proofErr w:type="spellEnd"/>
-      <w:r>
-        <w:t xml:space="preserve">, </w:t>
-      </w:r>
-      <w:proofErr w:type="spellStart"/>
-      <w:r>
-        <w:t>como</w:t>
-      </w:r>
-      <w:proofErr w:type="spellEnd"/>
-      <w:r>
-        <w:t xml:space="preserve"> o SARIMAX, </w:t>
-      </w:r>
-      <w:proofErr w:type="spellStart"/>
-      <w:r>
-        <w:t>incluindo</w:t>
-      </w:r>
-      <w:proofErr w:type="spellEnd"/>
-      <w:r>
-        <w:t xml:space="preserve"> </w:t>
-      </w:r>
-      <w:proofErr w:type="spellStart"/>
-      <w:r>
-        <w:t>informações</w:t>
-      </w:r>
-      <w:proofErr w:type="spellEnd"/>
-      <w:r>
-        <w:t xml:space="preserve"> de </w:t>
-      </w:r>
-      <w:proofErr w:type="spellStart"/>
-      <w:r>
-        <w:t>clima</w:t>
-      </w:r>
-      <w:proofErr w:type="spellEnd"/>
-      <w:r>
-        <w:t xml:space="preserve">, </w:t>
-      </w:r>
-      <w:proofErr w:type="spellStart"/>
-      <w:r>
-        <w:t>calendário</w:t>
-      </w:r>
-      <w:proofErr w:type="spellEnd"/>
-      <w:r>
-        <w:t xml:space="preserve">, </w:t>
-      </w:r>
-      <w:proofErr w:type="spellStart"/>
-      <w:r>
-        <w:t>feriados</w:t>
-      </w:r>
-      <w:proofErr w:type="spellEnd"/>
-      <w:r>
-        <w:t xml:space="preserve"> e </w:t>
-      </w:r>
-      <w:proofErr w:type="spellStart"/>
-      <w:r>
-        <w:t>eventos</w:t>
-      </w:r>
-      <w:proofErr w:type="spellEnd"/>
-      <w:r>
-        <w:t xml:space="preserve"> </w:t>
-      </w:r>
-      <w:proofErr w:type="spellStart"/>
-      <w:r>
-        <w:t>especiais</w:t>
-      </w:r>
-      <w:proofErr w:type="spellEnd"/>
-      <w:r>
-        <w:t>.</w:t>
+        <w:rPr>
+          <w:lang w:val="pt-BR"/>
+        </w:rPr>
+        <w:t>, baseada apenas no histórico do próprio tráfego. Embora isso tenha permitido capturar padrões temporais relevantes, fatores externos como acidentes, interdições, feriados, eventos climáticos severos e mudanças operacionais da rodovia não foram incorporados diretamente ao modelo. Para trabalhos futuros, recomenda-se testar modelos com variáveis exógenas, como o SARIMAX, incluindo informações de clima, calendário, feriados e eventos especiais.</w:t>
       </w:r>
     </w:p>
     <w:sectPr>
@@ -6789,6 +3969,7 @@
   <w:style w:type="character" w:default="1" w:styleId="Fontepargpadro">
     <w:name w:val="Default Paragraph Font"/>
     <w:uiPriority w:val="1"/>
+    <w:semiHidden/>
     <w:unhideWhenUsed/>
   </w:style>
   <w:style w:type="table" w:default="1" w:styleId="Tabelanormal">

</xml_diff>